<commit_message>
Fix Certifications rank reference; complete List of Figures index
- Z-test discussion cited Certifications as "ranked fifth by
  importance" against the old ranking; corrected to eleventh to match
  the retrained model's actual Table 5.7 order.
- Added the Figure 5.11a/5.11b rows (local web view screenshots) to
  the front-matter List of Figures, which were missing after their
  insertion into Section 5.9.

Co-Authored-By: Claude Sonnet 5 <noreply@anthropic.com>
</commit_message>
<xml_diff>
--- a/my_ml_project/book/Report-02-UPDATED.docx
+++ b/my_ml_project/book/Report-02-UPDATED.docx
@@ -70,6 +70,12 @@
           <w:szCs w:val="24"/>
         </w:rPr>
         <w:t xml:space="preserve">Md. Mahabub Alam </w:t>
+      </w:r>
+      <w:r>
+        <w:rPr>
+          <w:sz w:val="24"/>
+          <w:szCs w:val="24"/>
+        </w:rPr>
         <w:br/>
         <w:t>ID: WUB 03/23/64/3835</w:t>
       </w:r>
@@ -89,6 +95,12 @@
           <w:szCs w:val="24"/>
         </w:rPr>
         <w:t xml:space="preserve">Md. Al-Amin Miah </w:t>
+      </w:r>
+      <w:r>
+        <w:rPr>
+          <w:sz w:val="24"/>
+          <w:szCs w:val="24"/>
+        </w:rPr>
         <w:br/>
         <w:t xml:space="preserve"> ID: WUB 03/23/64/3829</w:t>
       </w:r>
@@ -108,6 +120,12 @@
           <w:szCs w:val="24"/>
         </w:rPr>
         <w:t xml:space="preserve">Subir Sarker Saurav </w:t>
+      </w:r>
+      <w:r>
+        <w:rPr>
+          <w:sz w:val="24"/>
+          <w:szCs w:val="24"/>
+        </w:rPr>
         <w:br/>
         <w:t xml:space="preserve"> ID: WUB 03/23/64/3840</w:t>
       </w:r>
@@ -157,7 +175,7 @@
           <w:sz w:val="24"/>
           <w:szCs w:val="24"/>
         </w:rPr>
-        <w:t xml:space="preserve">Kazi Hassan Robin</w:t>
+        <w:t>Kazi Hassan Robin</w:t>
       </w:r>
     </w:p>
     <w:p>
@@ -283,7 +301,7 @@
           <w:sz w:val="24"/>
           <w:szCs w:val="24"/>
         </w:rPr>
-        <w:t xml:space="preserve">July , 2026</w:t>
+        <w:t>July , 2026</w:t>
       </w:r>
     </w:p>
     <w:p>
@@ -379,6 +397,12 @@
           <w:szCs w:val="24"/>
         </w:rPr>
         <w:t>Letter of Transmittal</w:t>
+      </w:r>
+      <w:r>
+        <w:rPr>
+          <w:sz w:val="24"/>
+          <w:szCs w:val="24"/>
+        </w:rPr>
         <w:tab/>
         <w:t>ii</w:t>
       </w:r>
@@ -400,6 +424,12 @@
           <w:szCs w:val="24"/>
         </w:rPr>
         <w:t>Declaration</w:t>
+      </w:r>
+      <w:r>
+        <w:rPr>
+          <w:sz w:val="24"/>
+          <w:szCs w:val="24"/>
+        </w:rPr>
         <w:tab/>
         <w:t>iii</w:t>
       </w:r>
@@ -421,6 +451,12 @@
           <w:szCs w:val="24"/>
         </w:rPr>
         <w:t>Certificate</w:t>
+      </w:r>
+      <w:r>
+        <w:rPr>
+          <w:sz w:val="24"/>
+          <w:szCs w:val="24"/>
+        </w:rPr>
         <w:tab/>
         <w:t>iv</w:t>
       </w:r>
@@ -442,6 +478,12 @@
           <w:szCs w:val="24"/>
         </w:rPr>
         <w:t>Acknowledgement</w:t>
+      </w:r>
+      <w:r>
+        <w:rPr>
+          <w:sz w:val="24"/>
+          <w:szCs w:val="24"/>
+        </w:rPr>
         <w:tab/>
         <w:t>v</w:t>
       </w:r>
@@ -463,6 +505,12 @@
           <w:szCs w:val="24"/>
         </w:rPr>
         <w:t>Abstract</w:t>
+      </w:r>
+      <w:r>
+        <w:rPr>
+          <w:sz w:val="24"/>
+          <w:szCs w:val="24"/>
+        </w:rPr>
         <w:tab/>
         <w:t>vi</w:t>
       </w:r>
@@ -484,6 +532,12 @@
           <w:szCs w:val="24"/>
         </w:rPr>
         <w:t>Table of Contents</w:t>
+      </w:r>
+      <w:r>
+        <w:rPr>
+          <w:sz w:val="24"/>
+          <w:szCs w:val="24"/>
+        </w:rPr>
         <w:tab/>
         <w:t>vii</w:t>
       </w:r>
@@ -505,6 +559,12 @@
           <w:szCs w:val="24"/>
         </w:rPr>
         <w:t>List of Tables</w:t>
+      </w:r>
+      <w:r>
+        <w:rPr>
+          <w:sz w:val="24"/>
+          <w:szCs w:val="24"/>
+        </w:rPr>
         <w:tab/>
         <w:t>ix</w:t>
       </w:r>
@@ -526,6 +586,12 @@
           <w:szCs w:val="24"/>
         </w:rPr>
         <w:t>List of Figures</w:t>
+      </w:r>
+      <w:r>
+        <w:rPr>
+          <w:sz w:val="24"/>
+          <w:szCs w:val="24"/>
+        </w:rPr>
         <w:tab/>
         <w:t>xi</w:t>
       </w:r>
@@ -547,6 +613,12 @@
           <w:szCs w:val="24"/>
         </w:rPr>
         <w:t>Abbreviations</w:t>
+      </w:r>
+      <w:r>
+        <w:rPr>
+          <w:sz w:val="24"/>
+          <w:szCs w:val="24"/>
+        </w:rPr>
         <w:tab/>
         <w:t>xiii</w:t>
       </w:r>
@@ -578,6 +650,14 @@
           <w:szCs w:val="24"/>
         </w:rPr>
         <w:t>Chapter 1: Introduction</w:t>
+      </w:r>
+      <w:r>
+        <w:rPr>
+          <w:b/>
+          <w:bCs/>
+          <w:sz w:val="24"/>
+          <w:szCs w:val="24"/>
+        </w:rPr>
         <w:tab/>
         <w:t>1</w:t>
       </w:r>
@@ -596,6 +676,12 @@
           <w:szCs w:val="24"/>
         </w:rPr>
         <w:t>1.1 Background of the Study</w:t>
+      </w:r>
+      <w:r>
+        <w:rPr>
+          <w:sz w:val="24"/>
+          <w:szCs w:val="24"/>
+        </w:rPr>
         <w:tab/>
         <w:t>1</w:t>
       </w:r>
@@ -614,6 +700,12 @@
           <w:szCs w:val="24"/>
         </w:rPr>
         <w:t>1.2 Statement of the Problem</w:t>
+      </w:r>
+      <w:r>
+        <w:rPr>
+          <w:sz w:val="24"/>
+          <w:szCs w:val="24"/>
+        </w:rPr>
         <w:tab/>
         <w:t>3</w:t>
       </w:r>
@@ -632,6 +724,12 @@
           <w:szCs w:val="24"/>
         </w:rPr>
         <w:t>1.3 Research Questions</w:t>
+      </w:r>
+      <w:r>
+        <w:rPr>
+          <w:sz w:val="24"/>
+          <w:szCs w:val="24"/>
+        </w:rPr>
         <w:tab/>
         <w:t>5</w:t>
       </w:r>
@@ -650,6 +748,12 @@
           <w:szCs w:val="24"/>
         </w:rPr>
         <w:t>1.4 Research Objectives</w:t>
+      </w:r>
+      <w:r>
+        <w:rPr>
+          <w:sz w:val="24"/>
+          <w:szCs w:val="24"/>
+        </w:rPr>
         <w:tab/>
         <w:t>6</w:t>
       </w:r>
@@ -668,6 +772,12 @@
           <w:szCs w:val="24"/>
         </w:rPr>
         <w:t>1.5 Justification and Significance of the Study</w:t>
+      </w:r>
+      <w:r>
+        <w:rPr>
+          <w:sz w:val="24"/>
+          <w:szCs w:val="24"/>
+        </w:rPr>
         <w:tab/>
         <w:t>6</w:t>
       </w:r>
@@ -686,6 +796,12 @@
           <w:szCs w:val="24"/>
         </w:rPr>
         <w:t>1.6 Scope of the Study</w:t>
+      </w:r>
+      <w:r>
+        <w:rPr>
+          <w:sz w:val="24"/>
+          <w:szCs w:val="24"/>
+        </w:rPr>
         <w:tab/>
         <w:t>8</w:t>
       </w:r>
@@ -705,6 +821,14 @@
           <w:szCs w:val="24"/>
         </w:rPr>
         <w:t>Chapter 2: Literature Review</w:t>
+      </w:r>
+      <w:r>
+        <w:rPr>
+          <w:b/>
+          <w:bCs/>
+          <w:sz w:val="24"/>
+          <w:szCs w:val="24"/>
+        </w:rPr>
         <w:tab/>
         <w:t>11</w:t>
       </w:r>
@@ -723,6 +847,12 @@
           <w:szCs w:val="24"/>
         </w:rPr>
         <w:t>2.1 Introduction</w:t>
+      </w:r>
+      <w:r>
+        <w:rPr>
+          <w:sz w:val="24"/>
+          <w:szCs w:val="24"/>
+        </w:rPr>
         <w:tab/>
         <w:t>11</w:t>
       </w:r>
@@ -741,6 +871,12 @@
           <w:szCs w:val="24"/>
         </w:rPr>
         <w:t>2.2 Review Methodology</w:t>
+      </w:r>
+      <w:r>
+        <w:rPr>
+          <w:sz w:val="24"/>
+          <w:szCs w:val="24"/>
+        </w:rPr>
         <w:tab/>
         <w:t>12</w:t>
       </w:r>
@@ -759,6 +895,12 @@
           <w:szCs w:val="24"/>
         </w:rPr>
         <w:t>2.3 Conceptual Foundations of Graduate Employability</w:t>
+      </w:r>
+      <w:r>
+        <w:rPr>
+          <w:sz w:val="24"/>
+          <w:szCs w:val="24"/>
+        </w:rPr>
         <w:tab/>
         <w:t>12</w:t>
       </w:r>
@@ -777,6 +919,12 @@
           <w:szCs w:val="24"/>
         </w:rPr>
         <w:t>2.3.1 Definitional and Theoretical Development</w:t>
+      </w:r>
+      <w:r>
+        <w:rPr>
+          <w:sz w:val="24"/>
+          <w:szCs w:val="24"/>
+        </w:rPr>
         <w:tab/>
         <w:t>12</w:t>
       </w:r>
@@ -795,6 +943,12 @@
           <w:szCs w:val="24"/>
         </w:rPr>
         <w:t>2.3.2 Critical Appraisal of the Conceptual Literature</w:t>
+      </w:r>
+      <w:r>
+        <w:rPr>
+          <w:sz w:val="24"/>
+          <w:szCs w:val="24"/>
+        </w:rPr>
         <w:tab/>
         <w:t>13</w:t>
       </w:r>
@@ -813,6 +967,12 @@
           <w:szCs w:val="24"/>
         </w:rPr>
         <w:t>2.4 The Bangladeshi Context</w:t>
+      </w:r>
+      <w:r>
+        <w:rPr>
+          <w:sz w:val="24"/>
+          <w:szCs w:val="24"/>
+        </w:rPr>
         <w:tab/>
         <w:t>13</w:t>
       </w:r>
@@ -831,6 +991,12 @@
           <w:szCs w:val="24"/>
         </w:rPr>
         <w:t>2.5 Machine Learning Approaches to Employability Prediction</w:t>
+      </w:r>
+      <w:r>
+        <w:rPr>
+          <w:sz w:val="24"/>
+          <w:szCs w:val="24"/>
+        </w:rPr>
         <w:tab/>
         <w:t>15</w:t>
       </w:r>
@@ -849,6 +1015,12 @@
           <w:szCs w:val="24"/>
         </w:rPr>
         <w:t>2.5.1 Single-Classifier Studies</w:t>
+      </w:r>
+      <w:r>
+        <w:rPr>
+          <w:sz w:val="24"/>
+          <w:szCs w:val="24"/>
+        </w:rPr>
         <w:tab/>
         <w:t>15</w:t>
       </w:r>
@@ -867,6 +1039,12 @@
           <w:szCs w:val="24"/>
         </w:rPr>
         <w:t>2.5.2 Ensemble and Boosting Approaches</w:t>
+      </w:r>
+      <w:r>
+        <w:rPr>
+          <w:sz w:val="24"/>
+          <w:szCs w:val="24"/>
+        </w:rPr>
         <w:tab/>
         <w:t>16</w:t>
       </w:r>
@@ -885,6 +1063,12 @@
           <w:szCs w:val="24"/>
         </w:rPr>
         <w:t>2.6 Comparative and Critical Analysis of Reviewed Studies</w:t>
+      </w:r>
+      <w:r>
+        <w:rPr>
+          <w:sz w:val="24"/>
+          <w:szCs w:val="24"/>
+        </w:rPr>
         <w:tab/>
         <w:t>16</w:t>
       </w:r>
@@ -903,6 +1087,12 @@
           <w:szCs w:val="24"/>
         </w:rPr>
         <w:t>2.7 Research Gaps and Novelty of the Present Study</w:t>
+      </w:r>
+      <w:r>
+        <w:rPr>
+          <w:sz w:val="24"/>
+          <w:szCs w:val="24"/>
+        </w:rPr>
         <w:tab/>
         <w:t>20</w:t>
       </w:r>
@@ -921,6 +1111,12 @@
           <w:szCs w:val="24"/>
         </w:rPr>
         <w:t>2.8 Conceptual Framework</w:t>
+      </w:r>
+      <w:r>
+        <w:rPr>
+          <w:sz w:val="24"/>
+          <w:szCs w:val="24"/>
+        </w:rPr>
         <w:tab/>
         <w:t>22</w:t>
       </w:r>
@@ -940,6 +1136,14 @@
           <w:szCs w:val="24"/>
         </w:rPr>
         <w:t>Chapter 3: Methodology</w:t>
+      </w:r>
+      <w:r>
+        <w:rPr>
+          <w:b/>
+          <w:bCs/>
+          <w:sz w:val="24"/>
+          <w:szCs w:val="24"/>
+        </w:rPr>
         <w:tab/>
         <w:t>23</w:t>
       </w:r>
@@ -958,6 +1162,12 @@
           <w:szCs w:val="24"/>
         </w:rPr>
         <w:t>3.1 Methodology</w:t>
+      </w:r>
+      <w:r>
+        <w:rPr>
+          <w:sz w:val="24"/>
+          <w:szCs w:val="24"/>
+        </w:rPr>
         <w:tab/>
         <w:t>23</w:t>
       </w:r>
@@ -976,6 +1186,12 @@
           <w:szCs w:val="24"/>
         </w:rPr>
         <w:t>3.2 Justification of Methodology</w:t>
+      </w:r>
+      <w:r>
+        <w:rPr>
+          <w:sz w:val="24"/>
+          <w:szCs w:val="24"/>
+        </w:rPr>
         <w:tab/>
         <w:t>23</w:t>
       </w:r>
@@ -994,6 +1210,12 @@
           <w:szCs w:val="24"/>
         </w:rPr>
         <w:t>3.3 Description of Methodology</w:t>
+      </w:r>
+      <w:r>
+        <w:rPr>
+          <w:sz w:val="24"/>
+          <w:szCs w:val="24"/>
+        </w:rPr>
         <w:tab/>
         <w:t>26</w:t>
       </w:r>
@@ -1013,6 +1235,14 @@
           <w:szCs w:val="24"/>
         </w:rPr>
         <w:t>Chapter 4: Research Design</w:t>
+      </w:r>
+      <w:r>
+        <w:rPr>
+          <w:b/>
+          <w:bCs/>
+          <w:sz w:val="24"/>
+          <w:szCs w:val="24"/>
+        </w:rPr>
         <w:tab/>
         <w:t>28</w:t>
       </w:r>
@@ -1032,6 +1262,12 @@
         </w:rPr>
         <w:lastRenderedPageBreak/>
         <w:t>4.1 Overview of the Research Design</w:t>
+      </w:r>
+      <w:r>
+        <w:rPr>
+          <w:sz w:val="24"/>
+          <w:szCs w:val="24"/>
+        </w:rPr>
         <w:tab/>
         <w:t>28</w:t>
       </w:r>
@@ -1050,6 +1286,12 @@
           <w:szCs w:val="24"/>
         </w:rPr>
         <w:t>4.2 Machine Learning Model Workflow</w:t>
+      </w:r>
+      <w:r>
+        <w:rPr>
+          <w:sz w:val="24"/>
+          <w:szCs w:val="24"/>
+        </w:rPr>
         <w:tab/>
         <w:t>29</w:t>
       </w:r>
@@ -1068,6 +1310,12 @@
           <w:szCs w:val="24"/>
         </w:rPr>
         <w:t>4.3 Requirement Analysis for the Prediction System</w:t>
+      </w:r>
+      <w:r>
+        <w:rPr>
+          <w:sz w:val="24"/>
+          <w:szCs w:val="24"/>
+        </w:rPr>
         <w:tab/>
         <w:t>31</w:t>
       </w:r>
@@ -1086,6 +1334,12 @@
           <w:szCs w:val="24"/>
         </w:rPr>
         <w:t>4.3.1 Requirement Gathering Techniques</w:t>
+      </w:r>
+      <w:r>
+        <w:rPr>
+          <w:sz w:val="24"/>
+          <w:szCs w:val="24"/>
+        </w:rPr>
         <w:tab/>
         <w:t>31</w:t>
       </w:r>
@@ -1104,6 +1358,12 @@
           <w:szCs w:val="24"/>
         </w:rPr>
         <w:t>4.3.2 Functional and Non-Functional Requirements</w:t>
+      </w:r>
+      <w:r>
+        <w:rPr>
+          <w:sz w:val="24"/>
+          <w:szCs w:val="24"/>
+        </w:rPr>
         <w:tab/>
         <w:t>31</w:t>
       </w:r>
@@ -1122,6 +1382,12 @@
           <w:szCs w:val="24"/>
         </w:rPr>
         <w:t>4.4 Data Flow Design</w:t>
+      </w:r>
+      <w:r>
+        <w:rPr>
+          <w:sz w:val="24"/>
+          <w:szCs w:val="24"/>
+        </w:rPr>
         <w:tab/>
         <w:t>32</w:t>
       </w:r>
@@ -1140,6 +1406,12 @@
           <w:szCs w:val="24"/>
         </w:rPr>
         <w:t>4.5 System Interaction Design: Use Cases</w:t>
+      </w:r>
+      <w:r>
+        <w:rPr>
+          <w:sz w:val="24"/>
+          <w:szCs w:val="24"/>
+        </w:rPr>
         <w:tab/>
         <w:t>34</w:t>
       </w:r>
@@ -1159,6 +1431,14 @@
           <w:szCs w:val="24"/>
         </w:rPr>
         <w:t>Chapter 5: Results and Discussion</w:t>
+      </w:r>
+      <w:r>
+        <w:rPr>
+          <w:b/>
+          <w:bCs/>
+          <w:sz w:val="24"/>
+          <w:szCs w:val="24"/>
+        </w:rPr>
         <w:tab/>
         <w:t>36</w:t>
       </w:r>
@@ -1177,6 +1457,12 @@
           <w:szCs w:val="24"/>
         </w:rPr>
         <w:t>5.1 Dataset Description and Characteristics</w:t>
+      </w:r>
+      <w:r>
+        <w:rPr>
+          <w:sz w:val="24"/>
+          <w:szCs w:val="24"/>
+        </w:rPr>
         <w:tab/>
         <w:t>36</w:t>
       </w:r>
@@ -1195,6 +1481,12 @@
           <w:szCs w:val="24"/>
         </w:rPr>
         <w:t>5.2 Dataset Analysis: Features, Data Types and Roles</w:t>
+      </w:r>
+      <w:r>
+        <w:rPr>
+          <w:sz w:val="24"/>
+          <w:szCs w:val="24"/>
+        </w:rPr>
         <w:tab/>
         <w:t>38</w:t>
       </w:r>
@@ -1213,6 +1505,12 @@
           <w:szCs w:val="24"/>
         </w:rPr>
         <w:t>5.3 Data Preprocessing and Preparation Results</w:t>
+      </w:r>
+      <w:r>
+        <w:rPr>
+          <w:sz w:val="24"/>
+          <w:szCs w:val="24"/>
+        </w:rPr>
         <w:tab/>
         <w:t>41</w:t>
       </w:r>
@@ -1231,6 +1529,12 @@
           <w:szCs w:val="24"/>
         </w:rPr>
         <w:t>5.4 Class Distribution and Dataset Balance</w:t>
+      </w:r>
+      <w:r>
+        <w:rPr>
+          <w:sz w:val="24"/>
+          <w:szCs w:val="24"/>
+        </w:rPr>
         <w:tab/>
         <w:t>42</w:t>
       </w:r>
@@ -1249,6 +1553,12 @@
           <w:szCs w:val="24"/>
         </w:rPr>
         <w:t>5.5 Training and Testing Strategy: The 80:20 Split</w:t>
+      </w:r>
+      <w:r>
+        <w:rPr>
+          <w:sz w:val="24"/>
+          <w:szCs w:val="24"/>
+        </w:rPr>
         <w:tab/>
         <w:t>44</w:t>
       </w:r>
@@ -1267,6 +1577,12 @@
           <w:szCs w:val="24"/>
         </w:rPr>
         <w:t>5.6 Machine Learning Model Workflow and Implementation</w:t>
+      </w:r>
+      <w:r>
+        <w:rPr>
+          <w:sz w:val="24"/>
+          <w:szCs w:val="24"/>
+        </w:rPr>
         <w:tab/>
         <w:t>45</w:t>
       </w:r>
@@ -1285,6 +1601,12 @@
           <w:szCs w:val="24"/>
         </w:rPr>
         <w:t>5.7 Model Performance and Evaluation</w:t>
+      </w:r>
+      <w:r>
+        <w:rPr>
+          <w:sz w:val="24"/>
+          <w:szCs w:val="24"/>
+        </w:rPr>
         <w:tab/>
         <w:t>47</w:t>
       </w:r>
@@ -1302,7 +1624,13 @@
           <w:sz w:val="24"/>
           <w:szCs w:val="24"/>
         </w:rPr>
-        <w:t xml:space="preserve">5.8 Justification of XGBoost and Comparison with Alternative Algorithms</w:t>
+        <w:t>5.8 Justification of XGBoost and Comparison with Alternative Algorithms</w:t>
+      </w:r>
+      <w:r>
+        <w:rPr>
+          <w:sz w:val="24"/>
+          <w:szCs w:val="24"/>
+        </w:rPr>
         <w:tab/>
         <w:t>51</w:t>
       </w:r>
@@ -1321,6 +1649,12 @@
           <w:szCs w:val="24"/>
         </w:rPr>
         <w:t>5.9 System Implementation and Output: Prediction via API</w:t>
+      </w:r>
+      <w:r>
+        <w:rPr>
+          <w:sz w:val="24"/>
+          <w:szCs w:val="24"/>
+        </w:rPr>
         <w:tab/>
         <w:t>54</w:t>
       </w:r>
@@ -1339,6 +1673,12 @@
           <w:szCs w:val="24"/>
         </w:rPr>
         <w:t>5.10 Model Interpretation: Feature Importance and Feature Priority</w:t>
+      </w:r>
+      <w:r>
+        <w:rPr>
+          <w:sz w:val="24"/>
+          <w:szCs w:val="24"/>
+        </w:rPr>
         <w:tab/>
         <w:t>55</w:t>
       </w:r>
@@ -1357,6 +1697,12 @@
           <w:szCs w:val="24"/>
         </w:rPr>
         <w:t>5.11 Statistical Significance Testing: Z-Test and T-Test</w:t>
+      </w:r>
+      <w:r>
+        <w:rPr>
+          <w:sz w:val="24"/>
+          <w:szCs w:val="24"/>
+        </w:rPr>
         <w:tab/>
         <w:t>58</w:t>
       </w:r>
@@ -1375,6 +1721,12 @@
           <w:szCs w:val="24"/>
         </w:rPr>
         <w:t>5.12 Discussion of Findings in Relation to the Literature</w:t>
+      </w:r>
+      <w:r>
+        <w:rPr>
+          <w:sz w:val="24"/>
+          <w:szCs w:val="24"/>
+        </w:rPr>
         <w:tab/>
         <w:t>62</w:t>
       </w:r>
@@ -1393,6 +1745,12 @@
           <w:szCs w:val="24"/>
         </w:rPr>
         <w:t>5.13 Fulfilment of Research Objectives and Research Questions</w:t>
+      </w:r>
+      <w:r>
+        <w:rPr>
+          <w:sz w:val="24"/>
+          <w:szCs w:val="24"/>
+        </w:rPr>
         <w:tab/>
         <w:t>64</w:t>
       </w:r>
@@ -1411,6 +1769,12 @@
           <w:szCs w:val="24"/>
         </w:rPr>
         <w:t>5.14 Limitations Identified from the Results</w:t>
+      </w:r>
+      <w:r>
+        <w:rPr>
+          <w:sz w:val="24"/>
+          <w:szCs w:val="24"/>
+        </w:rPr>
         <w:tab/>
         <w:t>65</w:t>
       </w:r>
@@ -1429,6 +1793,12 @@
           <w:szCs w:val="24"/>
         </w:rPr>
         <w:t>5.15 Validation Summary</w:t>
+      </w:r>
+      <w:r>
+        <w:rPr>
+          <w:sz w:val="24"/>
+          <w:szCs w:val="24"/>
+        </w:rPr>
         <w:tab/>
         <w:t>66</w:t>
       </w:r>
@@ -1448,6 +1818,14 @@
           <w:szCs w:val="24"/>
         </w:rPr>
         <w:t>Chapter 6: Conclusions</w:t>
+      </w:r>
+      <w:r>
+        <w:rPr>
+          <w:b/>
+          <w:bCs/>
+          <w:sz w:val="24"/>
+          <w:szCs w:val="24"/>
+        </w:rPr>
         <w:tab/>
         <w:t>68</w:t>
       </w:r>
@@ -1466,6 +1844,12 @@
           <w:szCs w:val="24"/>
         </w:rPr>
         <w:t>6.1 Conclusions</w:t>
+      </w:r>
+      <w:r>
+        <w:rPr>
+          <w:sz w:val="24"/>
+          <w:szCs w:val="24"/>
+        </w:rPr>
         <w:tab/>
         <w:t>68</w:t>
       </w:r>
@@ -1484,6 +1868,12 @@
           <w:szCs w:val="24"/>
         </w:rPr>
         <w:t>6.2 Limitations and Recommendations</w:t>
+      </w:r>
+      <w:r>
+        <w:rPr>
+          <w:sz w:val="24"/>
+          <w:szCs w:val="24"/>
+        </w:rPr>
         <w:tab/>
         <w:t>69</w:t>
       </w:r>
@@ -1502,6 +1892,12 @@
           <w:szCs w:val="24"/>
         </w:rPr>
         <w:t>6.3 Future Works</w:t>
+      </w:r>
+      <w:r>
+        <w:rPr>
+          <w:sz w:val="24"/>
+          <w:szCs w:val="24"/>
+        </w:rPr>
         <w:tab/>
         <w:t>70</w:t>
       </w:r>
@@ -1521,6 +1917,14 @@
           <w:szCs w:val="24"/>
         </w:rPr>
         <w:t>References</w:t>
+      </w:r>
+      <w:r>
+        <w:rPr>
+          <w:b/>
+          <w:bCs/>
+          <w:sz w:val="24"/>
+          <w:szCs w:val="24"/>
+        </w:rPr>
         <w:tab/>
         <w:t>75</w:t>
       </w:r>
@@ -1540,6 +1944,14 @@
           <w:szCs w:val="24"/>
         </w:rPr>
         <w:t>Appendix</w:t>
+      </w:r>
+      <w:r>
+        <w:rPr>
+          <w:b/>
+          <w:bCs/>
+          <w:sz w:val="24"/>
+          <w:szCs w:val="24"/>
+        </w:rPr>
         <w:tab/>
         <w:t>78</w:t>
       </w:r>
@@ -1558,6 +1970,12 @@
           <w:szCs w:val="24"/>
         </w:rPr>
         <w:t>Appendix A: Operational Definitions of Key Terms</w:t>
+      </w:r>
+      <w:r>
+        <w:rPr>
+          <w:sz w:val="24"/>
+          <w:szCs w:val="24"/>
+        </w:rPr>
         <w:tab/>
         <w:t>78</w:t>
       </w:r>
@@ -2750,7 +3168,7 @@
                 <w:sz w:val="24"/>
                 <w:szCs w:val="24"/>
               </w:rPr>
-              <w:t xml:space="preserve">Distribution of the target variable Placement_Status</w:t>
+              <w:t>Distribution of the target variable Placement_Status</w:t>
             </w:r>
           </w:p>
         </w:tc>
@@ -2962,7 +3380,7 @@
                 <w:sz w:val="24"/>
                 <w:szCs w:val="24"/>
               </w:rPr>
-              <w:t xml:space="preserve">Classification performance of the XGBoost + SMOTE pipeline on the held-out test set (decision threshold = 0.35)</w:t>
+              <w:t>Classification performance of the XGBoost + SMOTE pipeline on the held-out test set (decision threshold = 0.35)</w:t>
             </w:r>
           </w:p>
         </w:tc>
@@ -4420,7 +4838,7 @@
                 <w:sz w:val="24"/>
                 <w:szCs w:val="24"/>
               </w:rPr>
-              <w:t xml:space="preserve">Loaded dataset, columns Age through Leadership_Experience</w:t>
+              <w:t>Loaded dataset, columns Age through Leadership_Experience</w:t>
             </w:r>
           </w:p>
         </w:tc>
@@ -4526,7 +4944,7 @@
                 <w:sz w:val="24"/>
                 <w:szCs w:val="24"/>
               </w:rPr>
-              <w:t xml:space="preserve">Loaded dataset, columns Academic_Performance through Interview_Score</w:t>
+              <w:t>Loaded dataset, columns Academic_Performance through Interview_Score</w:t>
             </w:r>
           </w:p>
         </w:tc>
@@ -5163,7 +5581,7 @@
                 <w:sz w:val="24"/>
                 <w:szCs w:val="24"/>
               </w:rPr>
-              <w:t xml:space="preserve">Confusion matrix for the XGBoost + SMOTE pipeline on the held-out test set</w:t>
+              <w:t>Confusion matrix for the XGBoost + SMOTE pipeline on the held-out test set</w:t>
             </w:r>
           </w:p>
         </w:tc>
@@ -5799,7 +6217,7 @@
                 <w:sz w:val="24"/>
                 <w:szCs w:val="24"/>
               </w:rPr>
-              <w:t xml:space="preserve">Native XGBoost feature importance across the 18 retained features (reproduced as source evidence)</w:t>
+              <w:t>Native XGBoost feature importance across the 18 retained features (reproduced as source evidence)</w:t>
             </w:r>
           </w:p>
         </w:tc>
@@ -6687,7 +7105,7 @@
                 <w:sz w:val="24"/>
                 <w:szCs w:val="24"/>
               </w:rPr>
-              <w:t xml:space="preserve">SHapley Additive exPlanations</w:t>
+              <w:t>SHapley Additive exPlanations</w:t>
             </w:r>
           </w:p>
         </w:tc>
@@ -6901,7 +7319,7 @@
           <w:sz w:val="24"/>
           <w:szCs w:val="24"/>
         </w:rPr>
-        <w:t xml:space="preserve">Over the past two decades, graduate employability has evolved from a peripheral concern of career services into one of the principal indicators by which higher education institutions are evaluated. Employability is defined as the set of achievements — skills, understandings and personal attributes — that make individuals more likely to gain employment and to be successful in their chosen occupations (Yorke, 2006). Two features of this definition are consequential for the present study. First, employability is a propensity rather than an outcome: it describes the likelihood of obtaining suitable work, not the fact of being employed. Second, it is inherently multidimensional, encompassing disciplinary knowledge, transferable skills and personal attributes simultaneously. Subsequent theoretical work has extended this position, reconceptualising employability as the accumulation and mobilisation of several forms of graduate capital — human, social, cultural, identity and psychological (Tomlinson, 2017). Graduate employment outcomes are further understood to be jointly determined by human capital, social capital, individual behaviours, individual attributes and perceived employability, all situated within labour market conditions that lie outside the graduate’s control (Clarke, 2018). Taken together, these frameworks establish that employability is multidimensional and contextually contingent, and therefore that any attempt to model it empirically must incorporate heterogeneous predictors rather than academic attainment alone.</w:t>
+        <w:t>Over the past two decades, graduate employability has evolved from a peripheral concern of career services into one of the principal indicators by which higher education institutions are evaluated. Employability is defined as the set of achievements — skills, understandings and personal attributes — that make individuals more likely to gain employment and to be successful in their chosen occupations (Yorke, 2006). Two features of this definition are consequential for the present study. First, employability is a propensity rather than an outcome: it describes the likelihood of obtaining suitable work, not the fact of being employed. Second, it is inherently multidimensional, encompassing disciplinary knowledge, transferable skills and personal attributes simultaneously. Subsequent theoretical work has extended this position, reconceptualising employability as the accumulation and mobilisation of several forms of graduate capital — human, social, cultural, identity and psychological (Tomlinson, 2017). Graduate employment outcomes are further understood to be jointly determined by human capital, social capital, individual behaviours, individual attributes and perceived employability, all situated within labour market conditions that lie outside the graduate’s control (Clarke, 2018). Taken together, these frameworks establish that employability is multidimensional and contextually contingent, and therefore that any attempt to model it empirically must incorporate heterogeneous predictors rather than academic attainment alone.</w:t>
       </w:r>
     </w:p>
     <w:p>
@@ -6914,7 +7332,7 @@
           <w:sz w:val="24"/>
           <w:szCs w:val="24"/>
         </w:rPr>
-        <w:t xml:space="preserve">Nowhere is this argument more consequential than in computing disciplines. The technical knowledge base of software engineering is subject to unusually rapid obsolescence: programming ecosystems, cloud platforms, machine learning frameworks and security practices are revised on cycles far shorter than the four-year duration of an undergraduate degree (Clarke, 2018). Employers in the software and information technology sector therefore recruit less on the basis of credentials than on demonstrated capability. Employers ranked soft skills, problem-solving ability and prior work experience above academic reputation when evaluating undergraduate candidates (Finch et al., 2013), and work-integrated learning has been shown to produce measurable gains in the specific skill outcomes employers value (Jackson, 2013). The implication is that two graduates with identical cumulative grade point averages (CGPA) may face materially different employment prospects depending on their internship history, project portfolio, certification profile and communication ability.</w:t>
+        <w:t>Nowhere is this argument more consequential than in computing disciplines. The technical knowledge base of software engineering is subject to unusually rapid obsolescence: programming ecosystems, cloud platforms, machine learning frameworks and security practices are revised on cycles far shorter than the four-year duration of an undergraduate degree (Clarke, 2018). Employers in the software and information technology sector therefore recruit less on the basis of credentials than on demonstrated capability. Employers ranked soft skills, problem-solving ability and prior work experience above academic reputation when evaluating undergraduate candidates (Finch et al., 2013), and work-integrated learning has been shown to produce measurable gains in the specific skill outcomes employers value (Jackson, 2013). The implication is that two graduates with identical cumulative grade point averages (CGPA) may face materially different employment prospects depending on their internship history, project portfolio, certification profile and communication ability.</w:t>
       </w:r>
     </w:p>
     <w:p>
@@ -6928,7 +7346,7 @@
           <w:szCs w:val="24"/>
         </w:rPr>
         <w:lastRenderedPageBreak/>
-        <w:t xml:space="preserve">For fresh Computer Science and Engineering (CSE) graduates, the timing of this information is critical. Skills of the kind employers reward are accumulated over several semesters and cannot be acquired retrospectively at the point of job search. A student who learns in the final semester that industry exposure and portfolio evidence outweigh marginal improvements in CGPA has already forfeited the opportunity to act on that knowledge. Consequently, the practical value of employability research lies not in describing which graduates were employed after the fact, but in producing early, individualised and actionable signals that students can respond to while they still have time to intervene in their own preparation.</w:t>
+        <w:t>For fresh Computer Science and Engineering (CSE) graduates, the timing of this information is critical. Skills of the kind employers reward are accumulated over several semesters and cannot be acquired retrospectively at the point of job search. A student who learns in the final semester that industry exposure and portfolio evidence outweigh marginal improvements in CGPA has already forfeited the opportunity to act on that knowledge. Consequently, the practical value of employability research lies not in describing which graduates were employed after the fact, but in producing early, individualised and actionable signals that students can respond to while they still have time to intervene in their own preparation.</w:t>
       </w:r>
     </w:p>
     <w:p>
@@ -6941,7 +7359,7 @@
           <w:sz w:val="24"/>
           <w:szCs w:val="24"/>
         </w:rPr>
-        <w:t xml:space="preserve">The Bangladeshi labour market makes this problem acute. Approximately 2.62 million people were unemployed at the end of 2024, of whom roughly 885,000 held tertiary-level qualifications (BBS, 2025). Critically, the unemployment rate rises monotonically with education: it stands at 13.5 per cent among university graduates, compared with 7.13 per cent among those completing higher secondary education, 1.96 per cent among secondary school completers, and 1.25 per cent among individuals with no formal education (BBS, 2025). Roughly one in three unemployed graduates remained without work for up to two years after graduation, a duration long enough to produce documented scarring effects on lifetime earnings and career progression (BBS, 2025). Bangladesh, in other words, does not exhibit a general shortage of jobs so much as a structural mismatch between what its higher education system produces and what its labour market absorbs.</w:t>
+        <w:t>The Bangladeshi labour market makes this problem acute. Approximately 2.62 million people were unemployed at the end of 2024, of whom roughly 885,000 held tertiary-level qualifications (BBS, 2025). Critically, the unemployment rate rises monotonically with education: it stands at 13.5 per cent among university graduates, compared with 7.13 per cent among those completing higher secondary education, 1.96 per cent among secondary school completers, and 1.25 per cent among individuals with no formal education (BBS, 2025). Roughly one in three unemployed graduates remained without work for up to two years after graduation, a duration long enough to produce documented scarring effects on lifetime earnings and career progression (BBS, 2025). Bangladesh, in other words, does not exhibit a general shortage of jobs so much as a structural mismatch between what its higher education system produces and what its labour market absorbs.</w:t>
       </w:r>
     </w:p>
     <w:p>
@@ -6955,8 +7373,14 @@
           <w:szCs w:val="24"/>
         </w:rPr>
         <w:t xml:space="preserve">The Information and Communication Technology (ICT) sector illustrates both sides of this mismatch. Demand-side evidence is unambiguous: analysing six years of online job-portal postings from the Bangladeshi ICT industry identified persistently high demand for software developers, computer systems engineers and architects, web developers and project management specialists, together with a rapid post-pandemic shift in required skills away from traditional networking competencies towards JavaScript, API development, database technologies and user interface design (Jony et al., 2022). The same study reports that the employment rate of CSE and IT graduates exceeded the national average for university graduates, confirming that the discipline is comparatively advantaged. Yet advantage is not sufficiency. A survey of higher education students in Bangladesh found a significant gap between the skills that private universities deliver and those that industry requires, with quality of education mediating the relationship between institutional provision and students’ employability skills (Hasan et al., 2024). The number of institutions offering CSE programmes has expanded substantially over the last decade, but curricular revision cycles have not kept </w:t>
+      </w:r>
+      <w:r>
+        <w:rPr>
+          <w:sz w:val="24"/>
+          <w:szCs w:val="24"/>
+        </w:rPr>
         <w:lastRenderedPageBreak/>
-        <w:t xml:space="preserve">pace with the rate at which the demanded skill set is changing (Jony et al., 2022). The result is a discipline in which employer demand is strong, graduate supply is abundant, and a substantial fraction of that supply is nonetheless unabsorbed.</w:t>
+        <w:t>pace with the rate at which the demanded skill set is changing (Jony et al., 2022). The result is a discipline in which employer demand is strong, graduate supply is abundant, and a substantial fraction of that supply is nonetheless unabsorbed.</w:t>
       </w:r>
     </w:p>
     <w:p>
@@ -6969,7 +7393,7 @@
           <w:sz w:val="24"/>
           <w:szCs w:val="24"/>
         </w:rPr>
-        <w:t xml:space="preserve">Historically, this gap has been investigated through descriptive instruments: employer perception surveys, graduate tracer studies and correlational analyses. Such studies establish which factors are associated with employment in aggregate, but they neither produce individual-level predictions nor quantify the relative contribution of each factor when all are considered jointly. Machine learning offers a methodologically distinct alternative. By learning non-linear, interaction-rich mappings from multidimensional graduate profiles to employment outcomes, supervised classification models can generate individual-level employability estimates and, through feature-importance analysis, rank the determinants that drive those estimates (Baffa et al., 2023; Haque et al., 2024; Mezhoudi et al., 2023). A considerable body of such work now exists for Nigeria, the Philippines, Malaysia, Egypt, Vietnam and India. Very little of it addresses Bangladesh, and none of it addresses the specific population of fresh CSE graduates entering the Bangladeshi ICT labour market with a feature set that spans technical skills, soft skills, academic performance and practical experience simultaneously.</w:t>
+        <w:t>Historically, this gap has been investigated through descriptive instruments: employer perception surveys, graduate tracer studies and correlational analyses. Such studies establish which factors are associated with employment in aggregate, but they neither produce individual-level predictions nor quantify the relative contribution of each factor when all are considered jointly. Machine learning offers a methodologically distinct alternative. By learning non-linear, interaction-rich mappings from multidimensional graduate profiles to employment outcomes, supervised classification models can generate individual-level employability estimates and, through feature-importance analysis, rank the determinants that drive those estimates (Baffa et al., 2023; Haque et al., 2024; Mezhoudi et al., 2023). A considerable body of such work now exists for Nigeria, the Philippines, Malaysia, Egypt, Vietnam and India. Very little of it addresses Bangladesh, and none of it addresses the specific population of fresh CSE graduates entering the Bangladeshi ICT labour market with a feature set that spans technical skills, soft skills, academic performance and practical experience simultaneously.</w:t>
       </w:r>
     </w:p>
     <w:p>
@@ -7012,7 +7436,7 @@
           <w:sz w:val="24"/>
           <w:szCs w:val="24"/>
         </w:rPr>
-        <w:t xml:space="preserve">Bangladesh presents an apparent paradox. Its ICT sector reports sustained and growing demand for software developers and allied technical roles (Jony et al., 2022), while its tertiary-educated population simultaneously records the highest unemployment rate of any educational stratum in the country, at 13.5 per cent (BBS, 2025). Both conditions cannot be explained by aggregate labour demand alone; the binding constraint is the alignment between individual graduate profiles and employer requirements.</w:t>
+        <w:t>Bangladesh presents an apparent paradox. Its ICT sector reports sustained and growing demand for software developers and allied technical roles (Jony et al., 2022), while its tertiary-educated population simultaneously records the highest unemployment rate of any educational stratum in the country, at 13.5 per cent (BBS, 2025). Both conditions cannot be explained by aggregate labour demand alone; the binding constraint is the alignment between individual graduate profiles and employer requirements.</w:t>
       </w:r>
     </w:p>
     <w:p>
@@ -7039,6 +7463,12 @@
           <w:szCs w:val="24"/>
         </w:rPr>
         <w:t xml:space="preserve">First, the evidence available to Bangladeshi CSE students is diagnostic rather than predictive, and arrives too late to be acted upon. National statistics are reported at aggregate level and are not disaggregated by discipline, so no reliable estimate of CSE-specific graduate employability </w:t>
+      </w:r>
+      <w:r>
+        <w:rPr>
+          <w:sz w:val="24"/>
+          <w:szCs w:val="24"/>
+        </w:rPr>
         <w:lastRenderedPageBreak/>
         <w:t>exists. Graduate tracer studies report outcomes retrospectively, typically one to two years after graduation, at which point the affected cohort can no longer alter its preparation. Existing Bangladeshi employability research is predominantly perception-based and correlational, establishing that a skills gap exists without quantifying which specific competencies, held by which specific student, most strongly change that student’s probability of employment (Hasan et al., 2024).</w:t>
       </w:r>
@@ -7053,7 +7483,7 @@
           <w:sz w:val="24"/>
           <w:szCs w:val="24"/>
         </w:rPr>
-        <w:t xml:space="preserve">Second, the international machine learning literature on employability prediction is not transferable to the Bangladeshi CSE context without substantial adaptation. Models have been developed on Nigerian, Filipino, Malaysian, Egyptian and Vietnamese cohorts (Baffa et al., 2023; Casuat &amp; Festijo, 2019; ElSharkawy et al., 2022; Haque et al., 2024; Othman et al., 2018; Vo et al., 2023), and datasets, feature sets, algorithms and evaluation protocols vary so widely across this literature that findings are not directly comparable, let alone directly portable (Mezhoudi et al., 2023). Labour market structure, hiring conventions, curricular design and the composition of the ICT sector differ materially between these contexts and Bangladesh. Within Bangladesh itself, the closest available work targets different dependent variables — career-type prediction (Biswas et al., 2021) and academic-performance prediction (Zulfiker et al., 2020) — and relies chiefly on academic and demographic attributes, omitting the technical-skill, portfolio, internship and certification variables that the employability literature identifies as decisive in computing disciplines.</w:t>
+        <w:t>Second, the international machine learning literature on employability prediction is not transferable to the Bangladeshi CSE context without substantial adaptation. Models have been developed on Nigerian, Filipino, Malaysian, Egyptian and Vietnamese cohorts (Baffa et al., 2023; Casuat &amp; Festijo, 2019; ElSharkawy et al., 2022; Haque et al., 2024; Othman et al., 2018; Vo et al., 2023), and datasets, feature sets, algorithms and evaluation protocols vary so widely across this literature that findings are not directly comparable, let alone directly portable (Mezhoudi et al., 2023). Labour market structure, hiring conventions, curricular design and the composition of the ICT sector differ materially between these contexts and Bangladesh. Within Bangladesh itself, the closest available work targets different dependent variables — career-type prediction (Biswas et al., 2021) and academic-performance prediction (Zulfiker et al., 2020) — and relies chiefly on academic and demographic attributes, omitting the technical-skill, portfolio, internship and certification variables that the employability literature identifies as decisive in computing disciplines.</w:t>
       </w:r>
     </w:p>
     <w:p>
@@ -7066,7 +7496,7 @@
           <w:sz w:val="24"/>
           <w:szCs w:val="24"/>
         </w:rPr>
-        <w:t xml:space="preserve">Third, prevailing modelling practice in this literature limits the practical usefulness of its outputs. Many studies optimise for overall classification accuracy on class-imbalanced data, a metric that systematically flatters models on the majority class while concealing poor recall on the minority — precisely the unemployed graduates whom an early-warning system exists to identify. Reported accuracies above 95 per cent on samples of a few hundred records raise unresolved questions of overfitting and validation rigour (Baffa et al., 2023). Furthermore, most published models function as black boxes: they classify without explaining, and a prediction that cannot be decomposed into its contributing factors cannot be translated into advice about what a student should do differently. Graduate employment prediction models can additionally encode and reproduce bias against protected groups, a risk that remains almost entirely unexamined in developing-country settings (Guo et al., 2020).</w:t>
+        <w:t>Third, prevailing modelling practice in this literature limits the practical usefulness of its outputs. Many studies optimise for overall classification accuracy on class-imbalanced data, a metric that systematically flatters models on the majority class while concealing poor recall on the minority — precisely the unemployed graduates whom an early-warning system exists to identify. Reported accuracies above 95 per cent on samples of a few hundred records raise unresolved questions of overfitting and validation rigour (Baffa et al., 2023). Furthermore, most published models function as black boxes: they classify without explaining, and a prediction that cannot be decomposed into its contributing factors cannot be translated into advice about what a student should do differently. Graduate employment prediction models can additionally encode and reproduce bias against protected groups, a risk that remains almost entirely unexamined in developing-country settings (Guo et al., 2020).</w:t>
       </w:r>
     </w:p>
     <w:p>
@@ -7080,6 +7510,12 @@
           <w:szCs w:val="24"/>
         </w:rPr>
         <w:t xml:space="preserve">The problem this thesis addresses is therefore the absence of a context-specific, empirically validated and interpretable predictive model of employability for fresh CSE graduates in </w:t>
+      </w:r>
+      <w:r>
+        <w:rPr>
+          <w:sz w:val="24"/>
+          <w:szCs w:val="24"/>
+        </w:rPr>
         <w:lastRenderedPageBreak/>
         <w:t>Bangladesh. In the absence of such a model, students allocate preparation effort on the basis of assumption rather than evidence; universities revise curricula without quantified knowledge of which interventions most improve employment outcomes; and employers and policymakers lack a defensible basis for targeting industry–academia initiatives. The consequence is a persistent and measurable loss of human capital in the very discipline the national digital economy depends upon.</w:t>
       </w:r>
@@ -7125,7 +7561,7 @@
           <w:sz w:val="24"/>
           <w:szCs w:val="24"/>
         </w:rPr>
-        <w:t xml:space="preserve">1. RQ1. Which technical, academic, experiential and behavioural factors are associated with the employment status of fresh CSE graduates in Bangladesh, and what is the relative importance of each factor?</w:t>
+        <w:t>1. RQ1. Which technical, academic, experiential and behavioural factors are associated with the employment status of fresh CSE graduates in Bangladesh, and what is the relative importance of each factor?</w:t>
       </w:r>
     </w:p>
     <w:p>
@@ -7823,7 +8259,7 @@
           <w:szCs w:val="24"/>
         </w:rPr>
         <w:lastRenderedPageBreak/>
-        <w:t xml:space="preserve">Empirically, the employability of Bangladeshi CSE graduates is under-researched relative to its economic importance. The international literature on machine learning-based employability prediction is concentrated in Nigeria, the Philippines, Malaysia, India, Egypt and Vietnam (Baffa et al., 2023; Casuat &amp; Festijo, 2019; ElSharkawy et al., 2022; Haque et al., 2024; Othman et al., 2018; Vo et al., 2023). Bangladeshi contributions to the adjacent educational data mining literature have addressed academic performance (Zulfiker et al., 2020) and broad career-type choice between government, private-sector and self-employment (Biswas et al., 2021), but not the employability of a discipline-specific graduate cohort. Since employability is theorised as context-dependent (Clarke, 2018; Tomlinson, 2017), a model trained on the labour market conditions, hiring conventions and curricular structures of another country cannot be assumed to generalise to Bangladesh. Generating national evidence is therefore not a replication exercise but a necessary condition for validity.</w:t>
+        <w:t>Empirically, the employability of Bangladeshi CSE graduates is under-researched relative to its economic importance. The international literature on machine learning-based employability prediction is concentrated in Nigeria, the Philippines, Malaysia, India, Egypt and Vietnam (Baffa et al., 2023; Casuat &amp; Festijo, 2019; ElSharkawy et al., 2022; Haque et al., 2024; Othman et al., 2018; Vo et al., 2023). Bangladeshi contributions to the adjacent educational data mining literature have addressed academic performance (Zulfiker et al., 2020) and broad career-type choice between government, private-sector and self-employment (Biswas et al., 2021), but not the employability of a discipline-specific graduate cohort. Since employability is theorised as context-dependent (Clarke, 2018; Tomlinson, 2017), a model trained on the labour market conditions, hiring conventions and curricular structures of another country cannot be assumed to generalise to Bangladesh. Generating national evidence is therefore not a replication exercise but a necessary condition for validity.</w:t>
       </w:r>
     </w:p>
     <w:p>
@@ -7836,7 +8272,7 @@
           <w:sz w:val="24"/>
           <w:szCs w:val="24"/>
         </w:rPr>
-        <w:t xml:space="preserve">Methodologically, this study responds directly to weaknesses that the reviewed literature itself identifies. The field suffers from inconsistent evaluation practice and requires context-specific models built on transparent protocols (Mezhoudi et al., 2023), and employability prediction models can encode bias with material consequences for the individuals classified (Guo et al., 2020). This study accordingly adopts imbalance-aware evaluation metrics and a documented, seeded and reproducible stratified hold-out protocol, together with a model-intrinsic explainability layer; per-prediction SHAP explanation is specified in the system design but is not implemented at this stage, as reported in Section 5.9. The combination of a Bangladesh-relevant CSE dataset, a multidimensional feature set spanning technical and non-technical attributes, and an explainability layer is, to the best of the researcher’s knowledge, not present in any existing study.</w:t>
+        <w:t>Methodologically, this study responds directly to weaknesses that the reviewed literature itself identifies. The field suffers from inconsistent evaluation practice and requires context-specific models built on transparent protocols (Mezhoudi et al., 2023), and employability prediction models can encode bias with material consequences for the individuals classified (Guo et al., 2020). This study accordingly adopts imbalance-aware evaluation metrics and a documented, seeded and reproducible stratified hold-out protocol, together with a model-intrinsic explainability layer; per-prediction SHAP explanation is specified in the system design but is not implemented at this stage, as reported in Section 5.9. The combination of a Bangladesh-relevant CSE dataset, a multidimensional feature set spanning technical and non-technical attributes, and an explainability layer is, to the best of the researcher’s knowledge, not present in any existing study.</w:t>
       </w:r>
     </w:p>
     <w:p>
@@ -7849,7 +8285,7 @@
           <w:sz w:val="24"/>
           <w:szCs w:val="24"/>
         </w:rPr>
-        <w:t xml:space="preserve">Practically, the outputs of this study serve four stakeholder groups. Students gain an evidence-based ranking of the competencies that most strongly influence employment outcomes, enabling deliberate allocation of effort across coursework, internships, portfolio projects and certifications during — rather than after — their degree. Universities gain quantified guidance on which curricular and co-curricular interventions carry the greatest expected return, supporting outcome-based curriculum revision and targeted career counselling. Employers gain a clearer characterisation of entry-level graduate readiness in the Bangladeshi market. Policymakers and sector bodies gain empirical grounding for national skills development and industry–academia collaboration programmes.</w:t>
+        <w:t>Practically, the outputs of this study serve four stakeholder groups. Students gain an evidence-based ranking of the competencies that most strongly influence employment outcomes, enabling deliberate allocation of effort across coursework, internships, portfolio projects and certifications during — rather than after — their degree. Universities gain quantified guidance on which curricular and co-curricular interventions carry the greatest expected return, supporting outcome-based curriculum revision and targeted career counselling. Employers gain a clearer characterisation of entry-level graduate readiness in the Bangladeshi market. Policymakers and sector bodies gain empirical grounding for national skills development and industry–academia collaboration programmes.</w:t>
       </w:r>
     </w:p>
     <w:p>
@@ -7863,7 +8299,7 @@
           <w:szCs w:val="24"/>
         </w:rPr>
         <w:lastRenderedPageBreak/>
-        <w:t xml:space="preserve">The specific contributions claimed by this thesis are: (1) a machine learning model of fresh CSE graduate employability in Bangladesh, trained on a discipline-relevant secondary dataset — the Kaggle Student Career Success Prediction Dataset (50,000 records) — whose feature set was selected because it aligns with established employability theory; (2) empirical quantification of the relative importance of technical skills, soft skills, academic performance and practical experience in determining employment outcomes for this population; (3) a comparatively evaluated and interpretable predictive model, assessed under imbalance-sensitive metrics, that constitutes the first such model reported for Bangladeshi CSE graduates; and (4) a set of evidence-based recommendations for curriculum design, student career preparation and industry–academia collaboration derived from the model rather than from perception data.</w:t>
+        <w:t>The specific contributions claimed by this thesis are: (1) a machine learning model of fresh CSE graduate employability in Bangladesh, trained on a discipline-relevant secondary dataset — the Kaggle Student Career Success Prediction Dataset (50,000 records) — whose feature set was selected because it aligns with established employability theory; (2) empirical quantification of the relative importance of technical skills, soft skills, academic performance and practical experience in determining employment outcomes for this population; (3) a comparatively evaluated and interpretable predictive model, assessed under imbalance-sensitive metrics, that constitutes the first such model reported for Bangladeshi CSE graduates; and (4) a set of evidence-based recommendations for curriculum design, student career preparation and industry–academia collaboration derived from the model rather than from perception data.</w:t>
       </w:r>
     </w:p>
     <w:p>
@@ -8623,7 +9059,7 @@
           <w:sz w:val="24"/>
           <w:szCs w:val="24"/>
         </w:rPr>
-        <w:t xml:space="preserve">The foundational literature on graduate employability establishes the conceptual basis for this study. Employability is defined as the combination of knowledge, technical competencies, professional attitudes, personal attributes, and transferable skills that enable graduates to obtain, maintain, and progress in employment (Yorke, 2006). Graduate employability is influenced by different forms of graduate capital, including human, social, cultural, and psychological capital (Tomlinson, 2017). Furthermore, employability is shaped by multiple interconnected dimensions, including human capital, social capital, individual behaviour, career identity, and labour market conditions (Clarke, 2018). Employers place strong emphasis on communication skills, teamwork, professionalism, leadership, and work experience during recruitment (Finch et al., 2013), and internship opportunities and work-integrated learning significantly improve graduates’ workplace readiness and employability (Jackson, 2013).</w:t>
+        <w:t>The foundational literature on graduate employability establishes the conceptual basis for this study. Employability is defined as the combination of knowledge, technical competencies, professional attitudes, personal attributes, and transferable skills that enable graduates to obtain, maintain, and progress in employment (Yorke, 2006). Graduate employability is influenced by different forms of graduate capital, including human, social, cultural, and psychological capital (Tomlinson, 2017). Furthermore, employability is shaped by multiple interconnected dimensions, including human capital, social capital, individual behaviour, career identity, and labour market conditions (Clarke, 2018). Employers place strong emphasis on communication skills, teamwork, professionalism, leadership, and work experience during recruitment (Finch et al., 2013), and internship opportunities and work-integrated learning significantly improve graduates’ workplace readiness and employability (Jackson, 2013).</w:t>
       </w:r>
     </w:p>
     <w:p>
@@ -8636,7 +9072,7 @@
           <w:sz w:val="24"/>
           <w:szCs w:val="24"/>
         </w:rPr>
-        <w:t xml:space="preserve">Beyond traditional survey-based approaches, a growing body of research has applied machine learning techniques to predict graduate employability more objectively. Random Forest and Decision Tree classifiers have been shown to predict students’ employability using academic and extracurricular attributes with high accuracy (Baffa et al., 2023). Decision Tree, Random Forest, and Support Vector Machine algorithms have been successfully used to model students’ employability outcomes based on training performance and grade point average (Casuat &amp; Festijo, 2019). Classification techniques applied to national graduate tracer datasets have identified academic performance and satisfaction-related factors as significant predictors of graduate employability (Othman et al., 2018).</w:t>
+        <w:t>Beyond traditional survey-based approaches, a growing body of research has applied machine learning techniques to predict graduate employability more objectively. Random Forest and Decision Tree classifiers have been shown to predict students’ employability using academic and extracurricular attributes with high accuracy (Baffa et al., 2023). Decision Tree, Random Forest, and Support Vector Machine algorithms have been successfully used to model students’ employability outcomes based on training performance and grade point average (Casuat &amp; Festijo, 2019). Classification techniques applied to national graduate tracer datasets have identified academic performance and satisfaction-related factors as significant predictors of graduate employability (Othman et al., 2018).</w:t>
       </w:r>
     </w:p>
     <w:p>
@@ -8649,7 +9085,7 @@
           <w:sz w:val="24"/>
           <w:szCs w:val="24"/>
         </w:rPr>
-        <w:t xml:space="preserve">Machine learning applications have also been extended to broader employability contexts. Machine learning models have been shown to be effective in predicting employability at the high school level (Dubey &amp; Mani, 2019), and machine learning approaches have been proposed to analyse the factors influencing employment outcomes across different educational contexts (García-Peñalvo et al., 2018). Fairness and bias should be carefully considered when developing graduate employment prediction models (Guo et al., 2020). Moreover, a comprehensive review of employability prediction studies revealed considerable variation in datasets, machine learning algorithms, feature selection methods, and evaluation techniques, emphasising the need for context-specific predictive models tailored to specific populations, such as fresh CSE graduates in Bangladesh (Mezhoudi et al., 2023).</w:t>
+        <w:t>Machine learning applications have also been extended to broader employability contexts. Machine learning models have been shown to be effective in predicting employability at the high school level (Dubey &amp; Mani, 2019), and machine learning approaches have been proposed to analyse the factors influencing employment outcomes across different educational contexts (García-Peñalvo et al., 2018). Fairness and bias should be carefully considered when developing graduate employment prediction models (Guo et al., 2020). Moreover, a comprehensive review of employability prediction studies revealed considerable variation in datasets, machine learning algorithms, feature selection methods, and evaluation techniques, emphasising the need for context-specific predictive models tailored to specific populations, such as fresh CSE graduates in Bangladesh (Mezhoudi et al., 2023).</w:t>
       </w:r>
     </w:p>
     <w:p>
@@ -8680,7 +9116,7 @@
           <w:sz w:val="24"/>
           <w:szCs w:val="24"/>
         </w:rPr>
-        <w:t xml:space="preserve">Literature was retrieved from IEEE Xplore, ScienceDirect, SpringerLink, MDPI, PLOS, Scopus-indexed journals and Google Scholar using combinations of the terms “graduate employability”, “employability prediction”, “machine learning”, “educational data mining”, “campus placement”, “skills gap”, “CSE graduates” and “Bangladesh”. Studies were included where they (i) reported empirical findings on graduate employability determinants, or (ii) applied machine learning or data mining techniques to predict employment or placement outcomes for tertiary students, or (iii) provided labour market or ICT sector evidence specific to Bangladesh. Preference was given to peer-reviewed journal articles and indexed conference proceedings published between 2018 and 2025, with earlier work retained where it is foundational to the theoretical framing. National statistical publications were consulted directly at source rather than through secondary reporting. Each retained study was appraised not only for its findings but for its dataset size, sampling frame, feature composition, validation protocol, evaluation metrics and treatment of class imbalance — the dimensions along which the comparative analysis in Section 2.6 is organised.</w:t>
+        <w:t>Literature was retrieved from IEEE Xplore, ScienceDirect, SpringerLink, MDPI, PLOS, Scopus-indexed journals and Google Scholar using combinations of the terms “graduate employability”, “employability prediction”, “machine learning”, “educational data mining”, “campus placement”, “skills gap”, “CSE graduates” and “Bangladesh”. Studies were included where they (i) reported empirical findings on graduate employability determinants, or (ii) applied machine learning or data mining techniques to predict employment or placement outcomes for tertiary students, or (iii) provided labour market or ICT sector evidence specific to Bangladesh. Preference was given to peer-reviewed journal articles and indexed conference proceedings published between 2018 and 2025, with earlier work retained where it is foundational to the theoretical framing. National statistical publications were consulted directly at source rather than through secondary reporting. Each retained study was appraised not only for its findings but for its dataset size, sampling frame, feature composition, validation protocol, evaluation metrics and treatment of class imbalance — the dimensions along which the comparative analysis in Section 2.6 is organised.</w:t>
       </w:r>
     </w:p>
     <w:p>
@@ -8725,7 +9161,7 @@
           <w:sz w:val="24"/>
           <w:szCs w:val="24"/>
         </w:rPr>
-        <w:t xml:space="preserve">The conceptual literature on employability has moved through three broadly identifiable stages. The first established employability as a property of the individual: a set of achievements, skills, understandings and personal attributes that raise the probability of gaining and succeeding in employment (Yorke, 2006). The central and still-underappreciated contribution of this stage is the analytical separation of employability from employment: employability is a propensity, whereas employment is an outcome contingent on labour market conditions, so that a graduate may be highly employable and nonetheless unemployed. This distinction has direct methodological consequences for the present study, because it implies that any model trained on observed employment outcomes is estimating employability only imperfectly, with labour-demand conditions entering as unobserved noise.</w:t>
+        <w:t>The conceptual literature on employability has moved through three broadly identifiable stages. The first established employability as a property of the individual: a set of achievements, skills, understandings and personal attributes that raise the probability of gaining and succeeding in employment (Yorke, 2006). The central and still-underappreciated contribution of this stage is the analytical separation of employability from employment: employability is a propensity, whereas employment is an outcome contingent on labour market conditions, so that a graduate may be highly employable and nonetheless unemployed. This distinction has direct methodological consequences for the present study, because it implies that any model trained on observed employment outcomes is estimating employability only imperfectly, with labour-demand conditions entering as unobserved noise.</w:t>
       </w:r>
     </w:p>
     <w:p>
@@ -8739,8 +9175,14 @@
           <w:szCs w:val="24"/>
         </w:rPr>
         <w:t xml:space="preserve">The second stage extended the construct beyond individual skills. Graduates enter the labour market carrying differentiated stocks of capital — human capital in the form of knowledge and skills, social capital in the form of networks and access, cultural capital in the form of dispositions congruent with employer expectations, identity capital in the form of a coherent career narrative, and psychological capital in the form of resilience and adaptability </w:t>
+      </w:r>
+      <w:r>
+        <w:rPr>
+          <w:sz w:val="24"/>
+          <w:szCs w:val="24"/>
+        </w:rPr>
         <w:lastRenderedPageBreak/>
-        <w:t xml:space="preserve">(Tomlinson, 2017). The framework’s strength lies in its explanatory power: it accounts for why graduates with equivalent academic records experience unequal outcomes. Its principal weakness is operational, because social, cultural and identity capital are theorised richly but measured inconsistently, with no validated instrument provided for their quantification, which limits the framework’s direct usability in predictive modelling.</w:t>
+        <w:t>(Tomlinson, 2017). The framework’s strength lies in its explanatory power: it accounts for why graduates with equivalent academic records experience unequal outcomes. Its principal weakness is operational, because social, cultural and identity capital are theorised richly but measured inconsistently, with no validated instrument provided for their quantification, which limits the framework’s direct usability in predictive modelling.</w:t>
       </w:r>
     </w:p>
     <w:p>
@@ -8753,7 +9195,7 @@
           <w:sz w:val="24"/>
           <w:szCs w:val="24"/>
         </w:rPr>
-        <w:t xml:space="preserve">The third stage relocates employability within the labour market itself. Employment outcomes are determined jointly by human capital, social capital, individual behaviours, individual attributes and perceived employability, all mediated by labour market conditions and employer recruitment practices (Clarke, 2018). This contribution is the explicit refusal of the individualisation of employability — the assumption that graduate unemployment is wholly attributable to graduate deficiency. This is a necessary corrective, but it also creates an unresolved tension for empirical work: if outcomes are substantially determined by structural conditions, then the ceiling on predictive accuracy achievable from graduate-level attributes alone is bounded, and models that report near-perfect accuracy from such attributes should be treated with suspicion rather than admiration. This observation informs the critical appraisal of reported model performance in Section 2.6.</w:t>
+        <w:t>The third stage relocates employability within the labour market itself. Employment outcomes are determined jointly by human capital, social capital, individual behaviours, individual attributes and perceived employability, all mediated by labour market conditions and employer recruitment practices (Clarke, 2018). This contribution is the explicit refusal of the individualisation of employability — the assumption that graduate unemployment is wholly attributable to graduate deficiency. This is a necessary corrective, but it also creates an unresolved tension for empirical work: if outcomes are substantially determined by structural conditions, then the ceiling on predictive accuracy achievable from graduate-level attributes alone is bounded, and models that report near-perfect accuracy from such attributes should be treated with suspicion rather than admiration. This observation informs the critical appraisal of reported model performance in Section 2.6.</w:t>
       </w:r>
     </w:p>
     <w:p>
@@ -8812,8 +9254,14 @@
           <w:szCs w:val="24"/>
         </w:rPr>
         <w:t xml:space="preserve">Bangladeshi graduate unemployment is both severe and structurally distinctive. Approximately 885,000 unemployed tertiary-educated individuals are recorded within a total unemployed population of 2.62 million, with an unemployment rate among graduates of 13.5 per cent — the highest of any educational stratum and more than ten times the 1.25 per cent rate observed among individuals with no formal education (BBS, 2025). The inversion of the usual education–employment gradient indicates that the constraint is not education per se but the alignment of educational output with labour demand. Roughly one in three unemployed </w:t>
+      </w:r>
+      <w:r>
+        <w:rPr>
+          <w:sz w:val="24"/>
+          <w:szCs w:val="24"/>
+        </w:rPr>
         <w:lastRenderedPageBreak/>
-        <w:t xml:space="preserve">graduates remained without work for up to two years, a duration associated in the labour economics literature with persistent scarring effects on earnings and career trajectory (BBS, 2025).</w:t>
+        <w:t>graduates remained without work for up to two years, a duration associated in the labour economics literature with persistent scarring effects on earnings and career trajectory (BBS, 2025).</w:t>
       </w:r>
     </w:p>
     <w:p>
@@ -8839,7 +9287,7 @@
           <w:sz w:val="24"/>
           <w:szCs w:val="24"/>
         </w:rPr>
-        <w:t xml:space="preserve">The discipline-specific Bangladeshi literature is correspondingly thin. A survey of higher education students at a private Bangladeshi university, using partial least squares structural equation modelling, found a significant gap between the skills delivered by private universities and those required by industry, with quality of education mediating the relationship between institutional provision and employability skills (Hasan et al., 2024). The study is methodologically sound within its paradigm and is among the few to model relationships rather than merely report frequencies; its limitations are that it relies on a single institution and a modest sample, that it measures perceived rather than realised employability, and that structural equation modelling estimates average path coefficients across a population rather than individual-level predictions.</w:t>
+        <w:t>The discipline-specific Bangladeshi literature is correspondingly thin. A survey of higher education students at a private Bangladeshi university, using partial least squares structural equation modelling, found a significant gap between the skills delivered by private universities and those required by industry, with quality of education mediating the relationship between institutional provision and employability skills (Hasan et al., 2024). The study is methodologically sound within its paradigm and is among the few to model relationships rather than merely report frequencies; its limitations are that it relies on a single institution and a modest sample, that it measures perceived rather than realised employability, and that structural equation modelling estimates average path coefficients across a population rather than individual-level predictions.</w:t>
       </w:r>
     </w:p>
     <w:p>
@@ -8852,7 +9300,7 @@
           <w:sz w:val="24"/>
           <w:szCs w:val="24"/>
         </w:rPr>
-        <w:t xml:space="preserve">Within Bangladeshi educational data mining, two studies are proximate but not equivalent to the present work. Several data mining classifiers have been applied to predict career type — government employment, private employment or business — among Bangladeshi graduates, with the PART classifier outperforming alternatives (Biswas et al., 2021); the study is valuable as an early demonstration of feasibility in the national context, but its dependent variable is career category rather than employability, its feature set is dominated by academic and personal attributes, and it evaluates on accuracy without imbalance-sensitive metrics or interpretability analysis. Academic performance among students at private universities in Bangladesh has also been predicted using machine learning classifiers (Zulfiker et al., 2020); the target variable there is academic rather than labour market outcome, so the study addresses a different construct entirely. Neither study incorporates technical skills, portfolio evidence, certifications or internship experience, and neither is specific to CSE graduates.</w:t>
+        <w:t>Within Bangladeshi educational data mining, two studies are proximate but not equivalent to the present work. Several data mining classifiers have been applied to predict career type — government employment, private employment or business — among Bangladeshi graduates, with the PART classifier outperforming alternatives (Biswas et al., 2021); the study is valuable as an early demonstration of feasibility in the national context, but its dependent variable is career category rather than employability, its feature set is dominated by academic and personal attributes, and it evaluates on accuracy without imbalance-sensitive metrics or interpretability analysis. Academic performance among students at private universities in Bangladesh has also been predicted using machine learning classifiers (Zulfiker et al., 2020); the target variable there is academic rather than labour market outcome, so the study addresses a different construct entirely. Neither study incorporates technical skills, portfolio evidence, certifications or internship experience, and neither is specific to CSE graduates.</w:t>
       </w:r>
     </w:p>
     <w:p>
@@ -8898,7 +9346,7 @@
           <w:sz w:val="24"/>
           <w:szCs w:val="24"/>
         </w:rPr>
-        <w:t xml:space="preserve">The earliest wave of employability prediction studies applied individual classifiers to modest institutional datasets. Decision Tree, Random Forest and Support Vector Machine classifiers were evaluated on Filipino student data comprising training performance and grade point average, establishing the basic viability of the approach (Casuat &amp; Festijo, 2019). The contribution is foundational rather than substantive: the feature set is narrow, confined to variables already held in institutional records, and the study neither examines feature importance nor reports imbalance-sensitive metrics. Classification techniques applied to a Malaysian national graduate tracer dataset identified academic performance and satisfaction-related variables as significant predictors (Othman et al., 2018); the scale of the tracer dataset is a genuine strength, conferring statistical power unavailable to institution-level studies, but the feature set is constrained by what the national instrument happened to collect and consequently omits technical and experiential attributes central to computing employability. Machine learning employability prediction has also been extended to secondary education, demonstrating that the approach generalises across educational levels while remaining, in a two-page conference format, largely a proof of concept (Dubey &amp; Mani, 2019).</w:t>
+        <w:t>The earliest wave of employability prediction studies applied individual classifiers to modest institutional datasets. Decision Tree, Random Forest and Support Vector Machine classifiers were evaluated on Filipino student data comprising training performance and grade point average, establishing the basic viability of the approach (Casuat &amp; Festijo, 2019). The contribution is foundational rather than substantive: the feature set is narrow, confined to variables already held in institutional records, and the study neither examines feature importance nor reports imbalance-sensitive metrics. Classification techniques applied to a Malaysian national graduate tracer dataset identified academic performance and satisfaction-related variables as significant predictors (Othman et al., 2018); the scale of the tracer dataset is a genuine strength, conferring statistical power unavailable to institution-level studies, but the feature set is constrained by what the national instrument happened to collect and consequently omits technical and experiential attributes central to computing employability. Machine learning employability prediction has also been extended to secondary education, demonstrating that the approach generalises across educational levels while remaining, in a two-page conference format, largely a proof of concept (Dubey &amp; Mani, 2019).</w:t>
       </w:r>
     </w:p>
     <w:p>
@@ -8911,7 +9359,7 @@
           <w:sz w:val="24"/>
           <w:szCs w:val="24"/>
         </w:rPr>
-        <w:t xml:space="preserve">The most widely cited recent single-classifier study reports Random Forest accuracy of approximately 98 per cent in predicting full-time employability of Nigerian graduates from CGPA, industrial work experience, co-curricular activity, gender and union membership across 218 records (Baffa et al., 2023). The study is notable for including experiential and co-curricular variables alongside academic ones, and for using clustering to show that industrial work experience scores discriminate more strongly than CGPA — a finding consistent with the work-integrated-learning literature (Jackson, 2013) and directly relevant to the hypotheses of the present study. However, the reported accuracy warrants scepticism: on 218 records with a plausibly imbalanced outcome distribution, accuracy near 98 per cent is more readily explained by majority-class dominance, information leakage or absent held-out validation than by genuine predictive skill, and the study reports neither the class distribution nor recall on the minority class. This is precisely the evaluation weakness that the present study is designed to avoid.</w:t>
+        <w:t>The most widely cited recent single-classifier study reports Random Forest accuracy of approximately 98 per cent in predicting full-time employability of Nigerian graduates from CGPA, industrial work experience, co-curricular activity, gender and union membership across 218 records (Baffa et al., 2023). The study is notable for including experiential and co-curricular variables alongside academic ones, and for using clustering to show that industrial work experience scores discriminate more strongly than CGPA — a finding consistent with the work-integrated-learning literature (Jackson, 2013) and directly relevant to the hypotheses of the present study. However, the reported accuracy warrants scepticism: on 218 records with a plausibly imbalanced outcome distribution, accuracy near 98 per cent is more readily explained by majority-class dominance, information leakage or absent held-out validation than by genuine predictive skill, and the study reports neither the class distribution nor recall on the minority class. This is precisely the evaluation weakness that the present study is designed to avoid.</w:t>
       </w:r>
     </w:p>
     <w:p>
@@ -8940,7 +9388,7 @@
           <w:sz w:val="24"/>
           <w:szCs w:val="24"/>
         </w:rPr>
-        <w:t xml:space="preserve">The more recent literature has converged on ensemble methods. An optimised bagging framework, OPT-BAG, was proposed for student employability prediction and demonstrated performance improvements over individual base learners through systematic hyperparameter optimisation (Vo et al., 2023). Feature selection has been combined with multiple classification techniques for graduate employability prediction, showing that predictive performance depends materially on which features are retained, not only on which algorithm is applied — a finding that elevates feature engineering from a preprocessing detail to a first-order design decision (Haque et al., 2024). Stacking ensembles have been evaluated for post-internship employability prediction with repeated k-fold cross-validation, reporting approximately 91 per cent accuracy and identifying internship duration as a leading predictor (Kahlik &amp; Al-Hababi, 2024); the use of repeated cross-validation rather than a single split yields a more defensible performance estimate, and the substantive confirmation that internship exposure is among the strongest predictors directly supports the inclusion of internship variables in the present feature set. Machine learning has also been applied specifically to information technology graduates in Egypt, making it one of the few discipline-specific studies in the literature and the closest international analogue to the present work, though its feature set remains oriented towards academic records rather than the technical-portfolio attributes that characterise contemporary software hiring (ElSharkawy et al., 2022).</w:t>
+        <w:t>The more recent literature has converged on ensemble methods. An optimised bagging framework, OPT-BAG, was proposed for student employability prediction and demonstrated performance improvements over individual base learners through systematic hyperparameter optimisation (Vo et al., 2023). Feature selection has been combined with multiple classification techniques for graduate employability prediction, showing that predictive performance depends materially on which features are retained, not only on which algorithm is applied — a finding that elevates feature engineering from a preprocessing detail to a first-order design decision (Haque et al., 2024). Stacking ensembles have been evaluated for post-internship employability prediction with repeated k-fold cross-validation, reporting approximately 91 per cent accuracy and identifying internship duration as a leading predictor (Kahlik &amp; Al-Hababi, 2024); the use of repeated cross-validation rather than a single split yields a more defensible performance estimate, and the substantive confirmation that internship exposure is among the strongest predictors directly supports the inclusion of internship variables in the present feature set. Machine learning has also been applied specifically to information technology graduates in Egypt, making it one of the few discipline-specific studies in the literature and the closest international analogue to the present work, though its feature set remains oriented towards academic records rather than the technical-portfolio attributes that characterise contemporary software hiring (ElSharkawy et al., 2022).</w:t>
       </w:r>
     </w:p>
     <w:p>
@@ -8953,7 +9401,7 @@
           <w:sz w:val="24"/>
           <w:szCs w:val="24"/>
         </w:rPr>
-        <w:t xml:space="preserve">The consistent superiority of ensembles across these studies has a principled explanation. Employability data is tabular, of modest volume, mixed in type, and characterised by interactions and non-linear thresholds — a graduate benefits disproportionately from the first internship rather than the third, and technical skill interacts with communication ability rather than adding to it independently. Tree-based ensembles such as Random Forest (Breiman, 2001) and gradient boosting (Chen &amp; Guestrin, 2016) model such structures natively without requiring the analyst to specify interaction terms in advance, which explains their empirical dominance in this domain.</w:t>
+        <w:t>The consistent superiority of ensembles across these studies has a principled explanation. Employability data is tabular, of modest volume, mixed in type, and characterised by interactions and non-linear thresholds — a graduate benefits disproportionately from the first internship rather than the third, and technical skill interacts with communication ability rather than adding to it independently. Tree-based ensembles such as Random Forest (Breiman, 2001) and gradient boosting (Chen &amp; Guestrin, 2016) model such structures natively without requiring the analyst to specify interaction terms in advance, which explains their empirical dominance in this domain.</w:t>
       </w:r>
     </w:p>
     <w:p>
@@ -8984,8 +9432,14 @@
           <w:szCs w:val="24"/>
         </w:rPr>
         <w:t xml:space="preserve">Table 2.1 presents a comparative appraisal of the reviewed machine learning studies that share sufficient methodological common ground to be compared as groups. To keep the comparison meaningful, only those thematic groups that contain more than one study are retained in the table, since a group of a single study offers no internal comparison; three such groups remain </w:t>
+      </w:r>
+      <w:r>
+        <w:rPr>
+          <w:sz w:val="24"/>
+          <w:szCs w:val="24"/>
+        </w:rPr>
         <w:lastRenderedPageBreak/>
-        <w:t xml:space="preserve">— single-classifier institutional-record studies, advanced ensemble and optimisation studies, and Bangladeshi educational data-mining studies. Studies that stand alone in their category — the conceptual framework proposal of García-Peñalvo et al. (2018), the high-accuracy but thinly-reported tree-ensemble study of Baffa et al. (2023), the fairness-focused analysis of Guo et al. (2020), and the systematic review of Mezhoudi et al. (2023) — are not given separate table rows but are integrated directly into the critical analysis that follows, so that their evidence still informs the synthesis without inflating the table with non-comparable single entries.</w:t>
+        <w:t>— single-classifier institutional-record studies, advanced ensemble and optimisation studies, and Bangladeshi educational data-mining studies. Studies that stand alone in their category — the conceptual framework proposal of García-Peñalvo et al. (2018), the high-accuracy but thinly-reported tree-ensemble study of Baffa et al. (2023), the fairness-focused analysis of Guo et al. (2020), and the systematic review of Mezhoudi et al. (2023) — are not given separate table rows but are integrated directly into the critical analysis that follows, so that their evidence still informs the synthesis without inflating the table with non-comparable single entries.</w:t>
       </w:r>
     </w:p>
     <w:p>
@@ -9214,7 +9668,7 @@
                 <w:sz w:val="22"/>
                 <w:szCs w:val="22"/>
               </w:rPr>
-              <w:t xml:space="preserve">Casuat &amp; Festijo (2019)</w:t>
+              <w:t>Casuat &amp; Festijo (2019)</w:t>
             </w:r>
           </w:p>
         </w:tc>
@@ -9533,7 +9987,7 @@
                 <w:sz w:val="22"/>
                 <w:szCs w:val="22"/>
               </w:rPr>
-              <w:t xml:space="preserve">Group B — Advanced Ensemble, Boosting and Optimisation Studies</w:t>
+              <w:t>Group B — Advanced Ensemble, Boosting and Optimisation Studies</w:t>
             </w:r>
           </w:p>
         </w:tc>
@@ -9598,7 +10052,7 @@
                 <w:sz w:val="22"/>
                 <w:szCs w:val="22"/>
               </w:rPr>
-              <w:t xml:space="preserve">OPT-BAG optimised bagging ensemble</w:t>
+              <w:t>OPT-BAG optimised bagging ensemble</w:t>
             </w:r>
           </w:p>
         </w:tc>
@@ -9618,7 +10072,7 @@
                 <w:sz w:val="22"/>
                 <w:szCs w:val="22"/>
               </w:rPr>
-              <w:t xml:space="preserve">Demonstrated gains from systematic optimisation of bagging ensembles</w:t>
+              <w:t>Demonstrated gains from systematic optimisation of bagging ensembles</w:t>
             </w:r>
           </w:p>
         </w:tc>
@@ -9638,7 +10092,7 @@
                 <w:sz w:val="22"/>
                 <w:szCs w:val="22"/>
               </w:rPr>
-              <w:t xml:space="preserve">Performance-focused; no explainability or fairness analysis</w:t>
+              <w:t>Performance-focused; no explainability or fairness analysis</w:t>
             </w:r>
           </w:p>
         </w:tc>
@@ -9664,7 +10118,7 @@
                 <w:szCs w:val="22"/>
               </w:rPr>
               <w:lastRenderedPageBreak/>
-              <w:t xml:space="preserve">Haque et al. (2024)</w:t>
+              <w:t>Haque et al. (2024)</w:t>
             </w:r>
           </w:p>
         </w:tc>
@@ -9769,7 +10223,7 @@
                 <w:sz w:val="22"/>
                 <w:szCs w:val="22"/>
               </w:rPr>
-              <w:t xml:space="preserve">Kahlik &amp; Al-Hababi (2024)</w:t>
+              <w:t>Kahlik &amp; Al-Hababi (2024)</w:t>
             </w:r>
           </w:p>
         </w:tc>
@@ -9874,7 +10328,7 @@
                 <w:sz w:val="22"/>
                 <w:szCs w:val="22"/>
               </w:rPr>
-              <w:t xml:space="preserve">ElSharkawy et al. (2022)</w:t>
+              <w:t>ElSharkawy et al. (2022)</w:t>
             </w:r>
           </w:p>
         </w:tc>
@@ -9954,7 +10408,7 @@
                 <w:sz w:val="22"/>
                 <w:szCs w:val="22"/>
               </w:rPr>
-              <w:t xml:space="preserve">Academic-record orientation; limited portfolio and soft-skill features; different labour market</w:t>
+              <w:t>Academic-record orientation; limited portfolio and soft-skill features; different labour market</w:t>
             </w:r>
           </w:p>
         </w:tc>
@@ -10008,7 +10462,7 @@
                 <w:sz w:val="22"/>
                 <w:szCs w:val="22"/>
               </w:rPr>
-              <w:t xml:space="preserve">Zulfiker et al. (2020)</w:t>
+              <w:t>Zulfiker et al. (2020)</w:t>
             </w:r>
           </w:p>
         </w:tc>
@@ -10088,7 +10542,7 @@
                 <w:sz w:val="22"/>
                 <w:szCs w:val="22"/>
               </w:rPr>
-              <w:t xml:space="preserve">Predicts academic performance, not employability; no labour market variables</w:t>
+              <w:t>Predicts academic performance, not employability; no labour market variables</w:t>
             </w:r>
           </w:p>
         </w:tc>
@@ -10215,6 +10669,12 @@
           <w:szCs w:val="24"/>
         </w:rPr>
         <w:t xml:space="preserve">The three retained groups, read together with the four stand-alone studies, describe a literature that has matured methodologically without a corresponding maturation in feature scope, interpretability or geographic coverage. The single-classifier institutional-record studies of Group A form a coherent early wave: each trains one or a small number of classifiers on institutional or national records using academic attributes only, and each reports accuracy as the sole evaluation criterion (Casuat &amp; Festijo, 2019; Othman et al., 2018; Dubey &amp; Mani, </w:t>
+      </w:r>
+      <w:r>
+        <w:rPr>
+          <w:sz w:val="24"/>
+          <w:szCs w:val="24"/>
+        </w:rPr>
         <w:lastRenderedPageBreak/>
         <w:t>2019). They differ mainly in scale — the national tracer dataset of Othman et al. (2018) confers statistical power that the institution-level studies cannot match — but they share the same structural limitation: none incorporates technical skills, project or internship experience, or certifications, and none is specific to computing graduates. This group therefore represents a methodological floor rather than a target to emulate, and the six-dimension feature set and multi-metric evaluation protocol adopted in the present study are defined partly in direct response to what this group omits.</w:t>
       </w:r>
@@ -10229,7 +10689,7 @@
           <w:sz w:val="24"/>
           <w:szCs w:val="24"/>
         </w:rPr>
-        <w:t xml:space="preserve">The advanced ensemble and optimisation studies of Group B represent the current methodological frontier and are the closest precedents to the present study’s own approach. All four move beyond single classifiers to systematic ensemble design, hyperparameter tuning, or feature selection (Vo et al., 2023; Haque et al., 2024; Kahlik &amp; Al-Hababi, 2024; ElSharkawy et al., 2022), and the repeated k-fold cross-validation of Kahlik and Al-Hababi (2024) is the most rigorous validation protocol in the reviewed set. The four differ in emphasis — the ensemble architecture itself (Vo et al., 2023), feature selection as a first-order decision (Haque et al., 2024), a post-internship cohort (Kahlik &amp; Al-Hababi, 2024), and disciplinary (IT) specificity (ElSharkawy et al., 2022) — but none provides an interpretability layer, and none targets the Bangladeshi or wider South Asian context. This combination of methodological strength and interpretability gap is the single most direct motivation for the present study’s design, which pairs comparative ensemble training with SHAP-based explanation.</w:t>
+        <w:t>The advanced ensemble and optimisation studies of Group B represent the current methodological frontier and are the closest precedents to the present study’s own approach. All four move beyond single classifiers to systematic ensemble design, hyperparameter tuning, or feature selection (Vo et al., 2023; Haque et al., 2024; Kahlik &amp; Al-Hababi, 2024; ElSharkawy et al., 2022), and the repeated k-fold cross-validation of Kahlik and Al-Hababi (2024) is the most rigorous validation protocol in the reviewed set. The four differ in emphasis — the ensemble architecture itself (Vo et al., 2023), feature selection as a first-order decision (Haque et al., 2024), a post-internship cohort (Kahlik &amp; Al-Hababi, 2024), and disciplinary (IT) specificity (ElSharkawy et al., 2022) — but none provides an interpretability layer, and none targets the Bangladeshi or wider South Asian context. This combination of methodological strength and interpretability gap is the single most direct motivation for the present study’s design, which pairs comparative ensemble training with SHAP-based explanation.</w:t>
       </w:r>
     </w:p>
     <w:p>
@@ -10243,8 +10703,14 @@
           <w:szCs w:val="24"/>
         </w:rPr>
         <w:t xml:space="preserve">The single-study contributions sharpen this picture rather than sitting apart from it. The conceptual framing of employment and its determinants as a machine learning problem is agenda-setting rather than empirical, establishing that the prediction framing is legitimate while offering no evidence on which classifiers, features or validation protocols actually work (García-Peñalvo et al., 2018) — an absence of empirical grounding that the remaining studies collectively address. The tree-ensemble and clustering study reporting accuracy near 98 per cent on 218 records without a stated class distribution or held-out protocol illustrates, alongside Group A, that both very simple and moderately sophisticated classifiers can produce misleadingly optimistic results when evaluation is accuracy-only and validation is unspecified (Baffa et al., 2023); this is exactly the weakness that the present study’s stratified hold-out protocol and multi-metric reporting (accuracy, per-class precision, recall, F1-score and confusion matrix) are designed to avoid. The fairness lens introduced by the demonstration that employment-prediction models can encode and amplify bias is orthogonal to predictive accuracy and is carried forward by none of the subsequent developing-country studies, </w:t>
+      </w:r>
+      <w:r>
+        <w:rPr>
+          <w:sz w:val="24"/>
+          <w:szCs w:val="24"/>
+        </w:rPr>
         <w:lastRenderedPageBreak/>
-        <w:t xml:space="preserve">including the present one; it is acknowledged here as a limitation and a direction for future research rather than a resolved concern (Guo et al., 2020). Finally, the systematic review documenting wide heterogeneity in data, methods and evaluation and calling explicitly for context-specific models functions as independent confirmation of the pattern visible across the retained groups, and its call is answered directly by the present study’s design (Mezhoudi et al., 2023).</w:t>
+        <w:t>including the present one; it is acknowledged here as a limitation and a direction for future research rather than a resolved concern (Guo et al., 2020). Finally, the systematic review documenting wide heterogeneity in data, methods and evaluation and calling explicitly for context-specific models functions as independent confirmation of the pattern visible across the retained groups, and its call is answered directly by the present study’s design (Mezhoudi et al., 2023).</w:t>
       </w:r>
     </w:p>
     <w:p>
@@ -10257,7 +10723,7 @@
           <w:sz w:val="24"/>
           <w:szCs w:val="24"/>
         </w:rPr>
-        <w:t xml:space="preserve">The Bangladeshi studies of Group C are the geographically closest precedents, but both predict a different construct: academic performance in one case (Zulfiker et al., 2020) and career category — government, private or business employment — in the other (Biswas et al., 2021), and neither incorporates technical skills, project experience or certifications. Because these are the only two Bangladeshi studies in the reviewed set and neither targets employability directly, the present study’s construction of the first predictive model for the employability of Bangladeshi CSE graduates specifically is not an incremental extension of this group but a response to its absence. Across every group, three deficiencies recur: feature sets rarely span the technical, experiential and behavioural attributes used here; no study pairs ensemble prediction with an interpretability layer; and only the two Bangladeshi studies address the national context at all, and neither on the employability construct itself. This pattern, rather than any single study, is what Section 2.7 formalises as the research gaps motivating the present study.</w:t>
+        <w:t>The Bangladeshi studies of Group C are the geographically closest precedents, but both predict a different construct: academic performance in one case (Zulfiker et al., 2020) and career category — government, private or business employment — in the other (Biswas et al., 2021), and neither incorporates technical skills, project experience or certifications. Because these are the only two Bangladeshi studies in the reviewed set and neither targets employability directly, the present study’s construction of the first predictive model for the employability of Bangladeshi CSE graduates specifically is not an incremental extension of this group but a response to its absence. Across every group, three deficiencies recur: feature sets rarely span the technical, experiential and behavioural attributes used here; no study pairs ensemble prediction with an interpretability layer; and only the two Bangladeshi studies address the national context at all, and neither on the employability construct itself. This pattern, rather than any single study, is what Section 2.7 formalises as the research gaps motivating the present study.</w:t>
       </w:r>
     </w:p>
     <w:p>
@@ -10454,7 +10920,7 @@
                 <w:sz w:val="22"/>
                 <w:szCs w:val="22"/>
               </w:rPr>
-              <w:t xml:space="preserve">ML employability models exist for Nigeria, the Philippines, Malaysia, Egypt and Vietnam (Baffa et al., 2023; Casuat &amp; Festijo, 2019; ElSharkawy et al., 2022; Haque et al., 2024; Othman et al., 2018; Vo et al., 2023) but not for Bangladesh; Bangladeshi work targets academic performance (Zulfiker et al., 2020) or career category (Biswas et al., 2021); national statistics are not disaggregated by discipline (BBS, 2025)</w:t>
+              <w:t>ML employability models exist for Nigeria, the Philippines, Malaysia, Egypt and Vietnam (Baffa et al., 2023; Casuat &amp; Festijo, 2019; ElSharkawy et al., 2022; Haque et al., 2024; Othman et al., 2018; Vo et al., 2023) but not for Bangladesh; Bangladeshi work targets academic performance (Zulfiker et al., 2020) or career category (Biswas et al., 2021); national statistics are not disaggregated by discipline (BBS, 2025)</w:t>
             </w:r>
           </w:p>
         </w:tc>
@@ -10519,7 +10985,7 @@
                 <w:sz w:val="22"/>
                 <w:szCs w:val="22"/>
               </w:rPr>
-              <w:t xml:space="preserve">Studies confined to institutional records report only academic predictors (Casuat &amp; Festijo, 2019; Othman et al., 2018); those including experiential variables find them dominant (Baffa et al., 2023; Kahlik &amp; Al-Hababi, 2024)</w:t>
+              <w:t>Studies confined to institutional records report only academic predictors (Casuat &amp; Festijo, 2019; Othman et al., 2018); those including experiential variables find them dominant (Baffa et al., 2023; Kahlik &amp; Al-Hababi, 2024)</w:t>
             </w:r>
           </w:p>
         </w:tc>
@@ -10539,7 +11005,7 @@
                 <w:sz w:val="22"/>
                 <w:szCs w:val="22"/>
               </w:rPr>
-              <w:t xml:space="preserve">Employs a theory-derived feature set spanning technical skills, soft skills, academic performance, internships, portfolio evidence, certifications and job-search behaviour simultaneously</w:t>
+              <w:t>Employs a theory-derived feature set spanning technical skills, soft skills, academic performance, internships, portfolio evidence, certifications and job-search behaviour simultaneously</w:t>
             </w:r>
           </w:p>
         </w:tc>
@@ -10584,7 +11050,7 @@
                 <w:sz w:val="22"/>
                 <w:szCs w:val="22"/>
               </w:rPr>
-              <w:t xml:space="preserve">Wide heterogeneity in evaluation protocols is documented (Mezhoudi et al., 2023); multiple studies report accuracy only, on small samples, without class distribution or minority-class recall</w:t>
+              <w:t>Wide heterogeneity in evaluation protocols is documented (Mezhoudi et al., 2023); multiple studies report accuracy only, on small samples, without class distribution or minority-class recall</w:t>
             </w:r>
           </w:p>
         </w:tc>
@@ -10714,7 +11180,7 @@
                 <w:sz w:val="22"/>
                 <w:szCs w:val="22"/>
               </w:rPr>
-              <w:t xml:space="preserve">Employment prediction models can encode bias (Guo et al., 2020), yet fairness analysis is effectively absent from South Asian employability prediction research</w:t>
+              <w:t>Employment prediction models can encode bias (Guo et al., 2020), yet fairness analysis is effectively absent from South Asian employability prediction research</w:t>
             </w:r>
           </w:p>
         </w:tc>
@@ -10756,6 +11222,12 @@
           <w:szCs w:val="24"/>
         </w:rPr>
         <w:t xml:space="preserve">The novelty of this thesis therefore lies not in the application of machine learning to employability, which is established practice, but in the conjunction of four elements not previously combined: a Bangladesh-specific fresh CSE graduate population; a theory-derived </w:t>
+      </w:r>
+      <w:r>
+        <w:rPr>
+          <w:sz w:val="24"/>
+          <w:szCs w:val="24"/>
+        </w:rPr>
         <w:lastRenderedPageBreak/>
         <w:t>multidimensional feature set that includes technical and portfolio attributes largely absent from prior work; an evaluation protocol designed for the class-imbalanced, small-sample conditions this domain actually presents; and an interpretability layer that converts prediction into actionable guidance.</w:t>
       </w:r>
@@ -10787,7 +11259,7 @@
           <w:sz w:val="24"/>
           <w:szCs w:val="24"/>
         </w:rPr>
-        <w:t xml:space="preserve">Synthesising the theoretical and empirical literature, this study adopts a conceptual framework in which the employment outcome of a fresh CSE graduate is modelled as a function of six input dimensions, each grounded in the reviewed literature. Academic performance, operationalised as CGPA, corresponds to the human capital component of the graduate-capital framework and is the most frequently modelled predictor in prior work (Casuat &amp; Festijo, 2019; Othman et al., 2018; Tomlinson, 2017). Technical and programming proficiency reflects the demand-side evidence on required ICT skills in Bangladesh (Jony et al., 2022). Professional certifications and self-directed learning capture the continuous skill renewal necessary in rapidly changing sectors (Clarke, 2018). Soft skills, including communication, teamwork and problem-solving, follow from the employer-preference evidence (Finch et al., 2013). Career preparation behaviour and industry exposure operationalise elements of the social and identity capital dimensions (Tomlinson, 2017), which are particularly salient in the Bangladeshi job-search context (BBS, 2025).</w:t>
+        <w:t>Synthesising the theoretical and empirical literature, this study adopts a conceptual framework in which the employment outcome of a fresh CSE graduate is modelled as a function of six input dimensions, each grounded in the reviewed literature. Academic performance, operationalised as CGPA, corresponds to the human capital component of the graduate-capital framework and is the most frequently modelled predictor in prior work (Casuat &amp; Festijo, 2019; Othman et al., 2018; Tomlinson, 2017). Technical and programming proficiency reflects the demand-side evidence on required ICT skills in Bangladesh (Jony et al., 2022). Professional certifications and self-directed learning capture the continuous skill renewal necessary in rapidly changing sectors (Clarke, 2018). Soft skills, including communication, teamwork and problem-solving, follow from the employer-preference evidence (Finch et al., 2013). Career preparation behaviour and industry exposure operationalise elements of the social and identity capital dimensions (Tomlinson, 2017), which are particularly salient in the Bangladeshi job-search context (BBS, 2025).</w:t>
       </w:r>
     </w:p>
     <w:p>
@@ -10800,7 +11272,7 @@
           <w:sz w:val="24"/>
           <w:szCs w:val="24"/>
         </w:rPr>
-        <w:t xml:space="preserve">These six dimensions constitute the independent variables; the binary employment outcome constitutes the dependent variable; and the machine learning model constitutes the mapping between them, with feature-importance and SHAP analysis providing the mechanism by which the relative weight of each dimension is recovered. Labour market conditions are acknowledged as an exogenous influence that is not directly observed in this cross-sectional design and that therefore bounds the achievable predictive performance (Clarke, 2018) — a consideration that informs the interpretation of results in Chapter 5.</w:t>
+        <w:t>These six dimensions constitute the independent variables; the binary employment outcome constitutes the dependent variable; and the machine learning model constitutes the mapping between them, with feature-importance and SHAP analysis providing the mechanism by which the relative weight of each dimension is recovered. Labour market conditions are acknowledged as an exogenous influence that is not directly observed in this cross-sectional design and that therefore bounds the achievable predictive performance (Clarke, 2018) — a consideration that informs the interpretation of results in Chapter 5.</w:t>
       </w:r>
     </w:p>
     <w:p>
@@ -10903,6 +11375,12 @@
           <w:szCs w:val="24"/>
         </w:rPr>
         <w:t xml:space="preserve"> The Incremental Model is a software development life cycle approach in which the complete system is not built and delivered in a single pass, but is instead partitioned into a series of smaller, self-contained builds called increments. Each increment passes through the core development activities — specification, development and validation — and delivers a working, independently testable version of part of the system. The first increment usually implements the most essential functionality, and each subsequent increment adds further capability to the versions already produced, until the final increment yields the complete system. Figure 3.1 illustrates this structure: an outline description of what is required feeds a set of concurrent specification, development and validation activities that </w:t>
+      </w:r>
+      <w:r>
+        <w:rPr>
+          <w:sz w:val="24"/>
+          <w:szCs w:val="24"/>
+        </w:rPr>
         <w:lastRenderedPageBreak/>
         <w:t>interleave rather than run strictly in sequence, and these activities produce an initial version, a series of intermediate versions and, ultimately, a final version of the system.</w:t>
       </w:r>
@@ -10983,7 +11461,7 @@
           <w:sz w:val="24"/>
           <w:szCs w:val="24"/>
         </w:rPr>
-        <w:t xml:space="preserve">How the Incremental Model works :</w:t>
+        <w:t>How the Incremental Model works :</w:t>
       </w:r>
       <w:r>
         <w:rPr>
@@ -11013,8 +11491,14 @@
           <w:szCs w:val="24"/>
         </w:rPr>
         <w:t xml:space="preserve"> A machine learning project of this kind is intrinsically exploratory. At the start of the work it was not possible to fix, in advance, which features would prove most informative, which classification algorithm would perform best, what level of predictive performance was achievable on the available data, or </w:t>
+      </w:r>
+      <w:r>
+        <w:rPr>
+          <w:sz w:val="24"/>
+          <w:szCs w:val="24"/>
+        </w:rPr>
         <w:lastRenderedPageBreak/>
-        <w:t xml:space="preserve">how the model’s outputs should best be exposed to a user. These decisions could only be made responsibly after real data had been collected, cleaned and analysed. The Incremental Model accommodates precisely this situation: the natural structure of a machine learning pipeline — data collection, preprocessing, baseline modelling, comparative model tuning, interpretation and interface delivery — already corresponds to a sequence of increments, each producing a working and independently verifiable artefact such as a cleaned dataset, a trained baseline model, a tuned final model, and an interpretable prediction service. Selecting the Incremental Model therefore allowed each stage to be evaluated on its own merits before the next was undertaken, and allowed the requirements of later increments — for example, which features to expose in the SHAP explanation — to be refined using evidence gathered in earlier increments.</w:t>
+        <w:t>how the model’s outputs should best be exposed to a user. These decisions could only be made responsibly after real data had been collected, cleaned and analysed. The Incremental Model accommodates precisely this situation: the natural structure of a machine learning pipeline — data collection, preprocessing, baseline modelling, comparative model tuning, interpretation and interface delivery — already corresponds to a sequence of increments, each producing a working and independently verifiable artefact such as a cleaned dataset, a trained baseline model, a tuned final model, and an interpretable prediction service. Selecting the Incremental Model therefore allowed each stage to be evaluated on its own merits before the next was undertaken, and allowed the requirements of later increments — for example, which features to expose in the SHAP explanation — to be refined using evidence gathered in earlier increments.</w:t>
       </w:r>
     </w:p>
     <w:p>
@@ -11082,7 +11566,7 @@
         </w:rPr>
         <w:drawing>
           <wp:inline distT="0" distB="0" distL="0" distR="0">
-            <wp:extent cx="4867275" cy="1008170"/>
+            <wp:extent cx="4865223" cy="1085850"/>
             <wp:effectExtent l="0" t="0" r="0" b="0"/>
             <wp:docPr id="1" name="image13.png"/>
             <wp:cNvGraphicFramePr/>
@@ -11103,7 +11587,7 @@
                   <pic:spPr>
                     <a:xfrm>
                       <a:off x="0" y="0"/>
-                      <a:ext cx="4867275" cy="1008170"/>
+                      <a:ext cx="4881453" cy="1089472"/>
                     </a:xfrm>
                     <a:prstGeom prst="rect">
                       <a:avLst/>
@@ -11220,8 +11704,14 @@
           <w:szCs w:val="24"/>
         </w:rPr>
         <w:t xml:space="preserve"> Decision Tree, Random Forest, Support Vector Machine and XGBoost classifiers were planned for training under a common protocol, with model selection based on F1-score and minority-class recall rather than accuracy alone. Of these, only XGBoost was trained and evaluated within the project timeframe, using a single stratified 80:20 hold-out partition with fixed hyperparameters rather than a tuned k-fold protocol. The comparative element of this increment is therefore incomplete; Section 5.8 </w:t>
+      </w:r>
+      <w:r>
+        <w:rPr>
+          <w:sz w:val="24"/>
+          <w:szCs w:val="24"/>
+        </w:rPr>
         <w:lastRenderedPageBreak/>
-        <w:t xml:space="preserve">sets out the reasoned basis for the XGBoost selection and Section 6.3 specifies the comparison required to complete it.</w:t>
+        <w:t>sets out the reasoned basis for the XGBoost selection and Section 6.3 specifies the comparison required to complete it.</w:t>
       </w:r>
     </w:p>
     <w:p>
@@ -11256,7 +11746,7 @@
           <w:sz w:val="24"/>
           <w:szCs w:val="24"/>
         </w:rPr>
-        <w:t xml:space="preserve">At the close of each increment, the resulting artefact was reviewed against the requirements established in Chapter 1 before development proceeded to the next increment, consistent with the evaluate-and-refine loop shown in Figure 3.2. This incremental structure allowed key methodological decisions — most importantly, the choice of final classification algorithm and the treatment of class imbalance — to be made on the basis of evidence gathered during earlier increments, rather than fixed at the outset of the project. The detailed machine learning pipeline through which raw graduate data is transformed into an employability prediction, which operationalises Increments 1 to 5 above, is presented as part of the research design in Chapter 4.</w:t>
+        <w:t>At the close of each increment, the resulting artefact was reviewed against the requirements established in Chapter 1 before development proceeded to the next increment, consistent with the evaluate-and-refine loop shown in Figure 3.2. This incremental structure allowed key methodological decisions — most importantly, the choice of final classification algorithm and the treatment of class imbalance — to be made on the basis of evidence gathered during earlier increments, rather than fixed at the outset of the project. The detailed machine learning pipeline through which raw graduate data is transformed into an employability prediction, which operationalises Increments 1 to 5 above, is presented as part of the research design in Chapter 4.</w:t>
       </w:r>
     </w:p>
     <w:p>
@@ -11350,7 +11840,7 @@
           <w:sz w:val="24"/>
           <w:szCs w:val="24"/>
         </w:rPr>
-        <w:t xml:space="preserve">This chapter sets out the research design of the project: how the study was organised, how the data and processes flowed through the system, how the machine learning model was developed and evaluated, and how the resulting predictions and explanations were made available to end users. Whereas Chapter 3 justified and described the incremental development methodology at a process level, this chapter describes the concrete design that the methodology produced — the machine learning pipeline at the centre of the research, the requirements that the surrounding system was built to satisfy, and the data-flow and interaction designs that connect the two. Although the core contribution of the project is a machine learning model rather than a conventional transactional system, the model is intended to be delivered behind a usable prediction interface so that its outputs can be consumed directly by students, administrators and reviewers; at the current stage this interface is realised as a documented HTTP API, demonstrated in Chapter 5, with a browser-based dashboard remaining future work (Section 6.3).</w:t>
+        <w:t>This chapter sets out the research design of the project: how the study was organised, how the data and processes flowed through the system, how the machine learning model was developed and evaluated, and how the resulting predictions and explanations were made available to end users. Whereas Chapter 3 justified and described the incremental development methodology at a process level, this chapter describes the concrete design that the methodology produced — the machine learning pipeline at the centre of the research, the requirements that the surrounding system was built to satisfy, and the data-flow and interaction designs that connect the two. Although the core contribution of the project is a machine learning model rather than a conventional transactional system, the model is intended to be delivered behind a usable prediction interface so that its outputs can be consumed directly by students, administrators and reviewers; at the current stage this interface is realised as a documented HTTP API, demonstrated in Chapter 5, with a browser-based dashboard remaining future work (Section 6.3).</w:t>
       </w:r>
     </w:p>
     <w:p>
@@ -11380,7 +11870,7 @@
           <w:sz w:val="24"/>
           <w:szCs w:val="24"/>
         </w:rPr>
-        <w:t xml:space="preserve">The research design translates the incremental methodology of Chapter 3 into a concrete arrangement of data, processing stages and system components. At the highest level the design comprises three connected parts. The first is the machine learning pipeline (Section 4.2), which specifies the technical sequence through which raw graduate data is transformed into an employability prediction and its explanation; this pipeline is the analytical core of the research and operationalises the five development increments of Section 3.3. The second is the requirement model (Section 4.3), which defines what the prediction system must do and the quality attributes it must satisfy, derived from the research objectives, the reviewed literature and supervisory feedback. The third is the structural design of the surrounding system (Sections 4.4 and 4.5), expressed as data-flow and use-case models that show how data moves between processes and stores and how each type of user interacts with the system. Together these parts define how the research was designed, how the data and processes were organised, and how the proposed system components were developed and evaluated against the research objectives.</w:t>
+        <w:t>The research design translates the incremental methodology of Chapter 3 into a concrete arrangement of data, processing stages and system components. At the highest level the design comprises three connected parts. The first is the machine learning pipeline (Section 4.2), which specifies the technical sequence through which raw graduate data is transformed into an employability prediction and its explanation; this pipeline is the analytical core of the research and operationalises the five development increments of Section 3.3. The second is the requirement model (Section 4.3), which defines what the prediction system must do and the quality attributes it must satisfy, derived from the research objectives, the reviewed literature and supervisory feedback. The third is the structural design of the surrounding system (Sections 4.4 and 4.5), expressed as data-flow and use-case models that show how data moves between processes and stores and how each type of user interacts with the system. Together these parts define how the research was designed, how the data and processes were organised, and how the proposed system components were developed and evaluated against the research objectives.</w:t>
       </w:r>
     </w:p>
     <w:p>
@@ -11435,7 +11925,7 @@
           <w:sz w:val="24"/>
           <w:szCs w:val="24"/>
         </w:rPr>
-        <w:t xml:space="preserve">At the centre of the research design is the machine learning pipeline itself — the sequence of technical stages through which raw graduate data is turned into an employability prediction. The pipeline comprises nine stages: data collection, data preprocessing, feature engineering, exploratory data analysis, splitting the dataset into training and testing partitions, model training, model evaluation, model selection, and, finally, prediction. Figure 4.1 illustrates this workflow.</w:t>
+        <w:t>At the centre of the research design is the machine learning pipeline itself — the sequence of technical stages through which raw graduate data is turned into an employability prediction. The pipeline comprises nine stages: data collection, data preprocessing, feature engineering, exploratory data analysis, splitting the dataset into training and testing partitions, model training, model evaluation, model selection, and, finally, prediction. Figure 4.1 illustrates this workflow.</w:t>
       </w:r>
     </w:p>
     <w:p>
@@ -11461,7 +11951,7 @@
           <w:sz w:val="24"/>
           <w:szCs w:val="24"/>
         </w:rPr>
-        <w:t xml:space="preserve">Multiple candidate classification algorithms (Section 3.3, Increments 3–4) are then trained on the training partition and evaluated on the held-out testing partition using accuracy, precision, recall, F1-score and the confusion matrix, so that the trade-off between correctly identifying employable and non-employable graduates is made explicit rather than collapsed into a single figure. The candidate with the strongest overall evidence across these metrics — not accuracy alone — is selected as the final model. Once selected, the model is used to generate a prediction for a new graduate: the graduate’s submitted information is validated, passed through the same preprocessing and feature-transformation steps applied to the training data, and then scored by the trained model to produce the final employability prediction, as summarised by the right-hand path in Figure 4.1.</w:t>
+        <w:t>Multiple candidate classification algorithms (Section 3.3, Increments 3–4) are then trained on the training partition and evaluated on the held-out testing partition using accuracy, precision, recall, F1-score and the confusion matrix, so that the trade-off between correctly identifying employable and non-employable graduates is made explicit rather than collapsed into a single figure. The candidate with the strongest overall evidence across these metrics — not accuracy alone — is selected as the final model. Once selected, the model is used to generate a prediction for a new graduate: the graduate’s submitted information is validated, passed through the same preprocessing and feature-transformation steps applied to the training data, and then scored by the trained model to produce the final employability prediction, as summarised by the right-hand path in Figure 4.1.</w:t>
       </w:r>
     </w:p>
     <w:p>
@@ -12396,7 +12886,7 @@
                 <w:sz w:val="22"/>
                 <w:szCs w:val="22"/>
               </w:rPr>
-              <w:t xml:space="preserve">Portability — at the current stage the system shall be accessible through a documented HTTP API (demonstrated in Section 5.7 using Postman); a browser-based dashboard requiring no specialised client software is planned as a future extension (Section 6.3).</w:t>
+              <w:t>Portability — at the current stage the system shall be accessible through a documented HTTP API (demonstrated in Section 5.7 using Postman); a browser-based dashboard requiring no specialised client software is planned as a future extension (Section 6.3).</w:t>
             </w:r>
           </w:p>
         </w:tc>
@@ -13426,7 +13916,7 @@
           <w:sz w:val="24"/>
           <w:szCs w:val="24"/>
         </w:rPr>
-        <w:t xml:space="preserve">This chapter presents and critically discusses the results obtained from the employability prediction system developed in this thesis. It follows the research design set out in Chapter 4, moving from the dataset and its characteristics, through preprocessing, class-balance analysis, the training and testing strategy, model training and evaluation, to the interpretation of the selected model and the current system output. Rather than presenting results in isolation, each result is analysed and interpreted: what it shows, why it arises, how it relates to the reviewed literature, and how it contributes to answering the research questions stated in Section 1.3. Every numerical value reported in this chapter is traceable to the executed pipeline and its console output, which are reproduced as figures where they constitute primary evidence. The chapter closes with an explicit assessment of the extent to which each research objective and research question has been fulfilled, the limitations that the results themselves reveal, and a validation summary recording the verification status of each reported element.</w:t>
+        <w:t>This chapter presents and critically discusses the results obtained from the employability prediction system developed in this thesis. It follows the research design set out in Chapter 4, moving from the dataset and its characteristics, through preprocessing, class-balance analysis, the training and testing strategy, model training and evaluation, to the interpretation of the selected model and the current system output. Rather than presenting results in isolation, each result is analysed and interpreted: what it shows, why it arises, how it relates to the reviewed literature, and how it contributes to answering the research questions stated in Section 1.3. Every numerical value reported in this chapter is traceable to the executed pipeline and its console output, which are reproduced as figures where they constitute primary evidence. The chapter closes with an explicit assessment of the extent to which each research objective and research question has been fulfilled, the limitations that the results themselves reveal, and a validation summary recording the verification status of each reported element.</w:t>
       </w:r>
     </w:p>
     <w:p>
@@ -13456,7 +13946,7 @@
           <w:sz w:val="24"/>
           <w:szCs w:val="24"/>
         </w:rPr>
-        <w:t xml:space="preserve">The model was developed on the Student Career Success Prediction Dataset obtained from Kaggle (Fatimah, 2026), used in this study in the cleaned form student_career_success_dataset_cleaned.csv. As set out in Section 1.6, this secondary dataset was selected because its variables align closely with the six employability dimensions derived from the reviewed literature — academic performance, technical and programming proficiency, practical experience, professional certifications and self-directed learning, soft skills, and career preparation behaviour. On loading, the pipeline reported 50,000 instances and 23 columns, comprising 22 candidate predictor attributes and one target attribute, Placement_Status. Table 5.1 summarises the principal characteristics of the dataset as used in this study.</w:t>
+        <w:t>The model was developed on the Student Career Success Prediction Dataset obtained from Kaggle (Fatimah, 2026), used in this study in the cleaned form student_career_success_dataset_cleaned.csv. As set out in Section 1.6, this secondary dataset was selected because its variables align closely with the six employability dimensions derived from the reviewed literature — academic performance, technical and programming proficiency, practical experience, professional certifications and self-directed learning, soft skills, and career preparation behaviour. On loading, the pipeline reported 50,000 instances and 23 columns, comprising 22 candidate predictor attributes and one target attribute, Placement_Status. Table 5.1 summarises the principal characteristics of the dataset as used in this study.</w:t>
       </w:r>
     </w:p>
     <w:p>
@@ -14342,7 +14832,7 @@
           <w:sz w:val="24"/>
           <w:szCs w:val="24"/>
         </w:rPr>
-        <w:t xml:space="preserve">Two characteristics in Table 5.1 warrant immediate comment because they shape every result that follows. First, the dataset is an order of magnitude larger than the single-institution samples typical of the studies reviewed in Chapter 2, most of which operated on a few hundred to a few thousand records. A sample of 50,000 substantially reduces sampling variance in the estimated performance metrics and makes the held-out test partition of 10,000 records large enough that reported metrics are stable to within a fraction of a percentage point. Second, the target is materially imbalanced at approximately 78:22, which is analysed in Section 5.4 and which directly motivates the rebalancing and threshold decisions documented in Sections 5.6 and 5.7.</w:t>
+        <w:t>Two characteristics in Table 5.1 warrant immediate comment because they shape every result that follows. First, the dataset is an order of magnitude larger than the single-institution samples typical of the studies reviewed in Chapter 2, most of which operated on a few hundred to a few thousand records. A sample of 50,000 substantially reduces sampling variance in the estimated performance metrics and makes the held-out test partition of 10,000 records large enough that reported metrics are stable to within a fraction of a percentage point. Second, the target is materially imbalanced at approximately 78:22, which is analysed in Section 5.4 and which directly motivates the rebalancing and threshold decisions documented in Sections 5.6 and 5.7.</w:t>
       </w:r>
     </w:p>
     <w:p>
@@ -14355,7 +14845,7 @@
           <w:sz w:val="24"/>
           <w:szCs w:val="24"/>
         </w:rPr>
-        <w:t xml:space="preserve">The class counts reported in Table 5.1 for the full dataset are derived from the per-class support printed by the classification report for the held-out test partition (7,808 Employable and 2,192 Not Employable out of 10,000). Because the partition was produced by a stratified split at exactly test_size = 0.2, the class proportions in the test partition reproduce those of the full dataset, so the full-dataset counts follow as 7,808 × 5 = 39,040 and 2,192 × 5 = 10,960. This derivation is stated explicitly so that the figure is auditable rather than asserted.</w:t>
+        <w:t>The class counts reported in Table 5.1 for the full dataset are derived from the per-class support printed by the classification report for the held-out test partition (7,808 Employable and 2,192 Not Employable out of 10,000). Because the partition was produced by a stratified split at exactly test_size = 0.2, the class proportions in the test partition reproduce those of the full dataset, so the full-dataset counts follow as 7,808 × 5 = 39,040 and 2,192 × 5 = 10,960. This derivation is stated explicitly so that the figure is auditable rather than asserted.</w:t>
       </w:r>
     </w:p>
     <w:p>
@@ -14369,6 +14859,12 @@
           <w:szCs w:val="24"/>
         </w:rPr>
         <w:t xml:space="preserve">Figures 5.1 and 5.2 reproduce the loaded dataset as it appears in the spreadsheet view, confirming the attribute names, the column ordering and the form of the recorded values. These figures are retained in their original colour because they are primary evidence of the data </w:t>
+      </w:r>
+      <w:r>
+        <w:rPr>
+          <w:sz w:val="24"/>
+          <w:szCs w:val="24"/>
+        </w:rPr>
         <w:lastRenderedPageBreak/>
         <w:t>actually used; reproducing them in monochrome would amount to reconstructing rather than evidencing the source.</w:t>
       </w:r>
@@ -14439,7 +14935,7 @@
           <w:sz w:val="24"/>
           <w:szCs w:val="24"/>
         </w:rPr>
-        <w:t xml:space="preserve">Figure 5.1: Loaded dataset, columns Age through Leadership_Experience</w:t>
+        <w:t>Figure 5.1: Loaded dataset, columns Age through Leadership_Experience</w:t>
       </w:r>
     </w:p>
     <w:p>
@@ -14508,7 +15004,7 @@
           <w:sz w:val="24"/>
           <w:szCs w:val="24"/>
         </w:rPr>
-        <w:t xml:space="preserve">Figure 5.2: Loaded dataset, columns Academic_Performance through Interview_Score</w:t>
+        <w:t>Figure 5.2: Loaded dataset, columns Academic_Performance through Interview_Score</w:t>
       </w:r>
     </w:p>
     <w:p>
@@ -14959,7 +15455,7 @@
           </w:tcPr>
           <w:p>
             <w:r>
-              <w:t xml:space="preserve">Degree programme (e.g. Computer Science, Software Engineering, Data Science, Cybersecurity, Artificial Intelligence, Information Technology, Business Analytics).</w:t>
+              <w:t>Degree programme (e.g. Computer Science, Software Engineering, Data Science, Cybersecurity, Artificial Intelligence, Information Technology, Business Analytics).</w:t>
             </w:r>
           </w:p>
         </w:tc>
@@ -15803,7 +16299,7 @@
           </w:tcPr>
           <w:p>
             <w:r>
-              <w:t xml:space="preserve">Retained — behavioural attribute; rank 18 of 18</w:t>
+              <w:t>Retained — behavioural attribute; rank 18 of 18</w:t>
             </w:r>
           </w:p>
         </w:tc>
@@ -16271,7 +16767,7 @@
           </w:tcPr>
           <w:p>
             <w:r>
-              <w:t xml:space="preserve">Composite index computed as (Interview_Score × 0.7) + (Internships × 0.3).</w:t>
+              <w:t>Composite index computed as (Interview_Score × 0.7) + (Internships × 0.3).</w:t>
             </w:r>
           </w:p>
         </w:tc>
@@ -16340,7 +16836,7 @@
           </w:tcPr>
           <w:p>
             <w:r>
-              <w:t xml:space="preserve">Productivity ratio computed as Programming_Skill ÷ (Projects_Completed + 1).</w:t>
+              <w:t>Productivity ratio computed as Programming_Skill ÷ (Projects_Completed + 1).</w:t>
             </w:r>
           </w:p>
         </w:tc>
@@ -16451,7 +16947,7 @@
           <w:sz w:val="24"/>
           <w:szCs w:val="24"/>
         </w:rPr>
-        <w:t xml:space="preserve">The six excluded attributes were removed before training as a deliberate design decision rather than as a consequence of data quality. Age, Gender, University_Year and Major are demographic or contextual descriptors over which a student has no control at the point of intervention; retaining them would allow the model to encode group membership rather than modifiable preparation behaviour, and would risk exactly the subgroup bias identified as research gap G5 in Section 2.7. Attendance_Percentage and LinkedIn_Profile were excluded as optional attributes not consistently interpretable across institutions. This exclusion is consistent with the stated purpose of the system: to produce actionable guidance about what a student can change, not a demographic profile of who is likely to be hired.</w:t>
+        <w:t>The six excluded attributes were removed before training as a deliberate design decision rather than as a consequence of data quality. Age, Gender, University_Year and Major are demographic or contextual descriptors over which a student has no control at the point of intervention; retaining them would allow the model to encode group membership rather than modifiable preparation behaviour, and would risk exactly the subgroup bias identified as research gap G5 in Section 2.7. Attendance_Percentage and LinkedIn_Profile were excluded as optional attributes not consistently interpretable across institutions. This exclusion is consistent with the stated purpose of the system: to produce actionable guidance about what a student can change, not a demographic profile of who is likely to be hired.</w:t>
       </w:r>
     </w:p>
     <w:p>
@@ -16464,7 +16960,7 @@
           <w:sz w:val="24"/>
           <w:szCs w:val="24"/>
         </w:rPr>
-        <w:t xml:space="preserve">Two composite features were then constructed. Overall_Preparedness_Index combines interview performance and industry exposure into a single weighted readiness measure, with the larger weight placed on interview performance. Skills_per_Project expresses programming proficiency relative to project volume, distinguishing a student whose skill is concentrated in a few substantial projects from one whose project count is high relative to demonstrated skill; the denominator is incremented by one to avoid division by zero for students with no completed projects. Both features are derived entirely from attributes already present in the dataset and therefore introduce no external information. After exclusion and engineering, 18 features were retained — 14 numeric and 4 categorical — as confirmed by the console output reproduced in Figure 5.7.</w:t>
+        <w:t>Two composite features were then constructed. Overall_Preparedness_Index combines interview performance and industry exposure into a single weighted readiness measure, with the larger weight placed on interview performance. Skills_per_Project expresses programming proficiency relative to project volume, distinguishing a student whose skill is concentrated in a few substantial projects from one whose project count is high relative to demonstrated skill; the denominator is incremented by one to avoid division by zero for students with no completed projects. Both features are derived entirely from attributes already present in the dataset and therefore introduce no external information. After exclusion and engineering, 18 features were retained — 14 numeric and 4 categorical — as confirmed by the console output reproduced in Figure 5.7.</w:t>
       </w:r>
     </w:p>
     <w:p>
@@ -16487,7 +16983,7 @@
           <w:sz w:val="24"/>
           <w:szCs w:val="24"/>
         </w:rPr>
-        <w:t xml:space="preserve">The pipeline applies drop_duplicates() and median/modal imputation, so both duplicate removal and missing-value treatment are implemented. However, the executed notebook does not print the number of duplicate rows removed or the count of missing values per attribute, and the record count of 50,000 reported in Figure 5.7 is the count after deduplication. The exact duplicate and missing-value counts are therefore not recoverable from the available output and are listed as outstanding in the validation summary of Section 5.15.</w:t>
+        <w:t>The pipeline applies drop_duplicates() and median/modal imputation, so both duplicate removal and missing-value treatment are implemented. However, the executed notebook does not print the number of duplicate rows removed or the count of missing values per attribute, and the record count of 50,000 reported in Figure 5.7 is the count after deduplication. The exact duplicate and missing-value counts are therefore not recoverable from the available output and are listed as outstanding in the validation summary of Section 5.15.</w:t>
       </w:r>
     </w:p>
     <w:p>
@@ -16517,7 +17013,7 @@
           <w:sz w:val="24"/>
           <w:szCs w:val="24"/>
         </w:rPr>
-        <w:t xml:space="preserve">Preprocessing was carried out as specified in Increment 2 (Section 3.3) and the data-preprocessing stage of the pipeline (Section 4.2), and was implemented as a scikit-learn ColumnTransformer embedded inside the modelling pipeline rather than as a set of standalone transformations applied to the full dataset. This is an important methodological point: because the transformer is fitted inside the pipeline, all imputation and scaling parameters are learned from the training partition alone and then applied unchanged to the test partition. No information from the held-out test set influences the fitted preprocessing, so the reported test performance is free of the data-leakage problem that a naive whole-dataset scaling would introduce.</w:t>
+        <w:t>Preprocessing was carried out as specified in Increment 2 (Section 3.3) and the data-preprocessing stage of the pipeline (Section 4.2), and was implemented as a scikit-learn ColumnTransformer embedded inside the modelling pipeline rather than as a set of standalone transformations applied to the full dataset. This is an important methodological point: because the transformer is fitted inside the pipeline, all imputation and scaling parameters are learned from the training partition alone and then applied unchanged to the test partition. No information from the held-out test set influences the fitted preprocessing, so the reported test performance is free of the data-leakage problem that a naive whole-dataset scaling would introduce.</w:t>
       </w:r>
     </w:p>
     <w:p>
@@ -16530,7 +17026,7 @@
           <w:sz w:val="24"/>
           <w:szCs w:val="24"/>
         </w:rPr>
-        <w:t xml:space="preserve">Duplicate records were removed and whitespace was stripped from all string-valued columns to eliminate spurious category variants arising from inconsistent data entry. The 14 numeric features were then imputed with the training-set median and standardised with StandardScaler to zero mean and unit variance, so that attributes measured on different scales — CGPA on a four-point scale, Resume_Score on a hundred-point scale, Internships as a small count — contribute on a common footing. The 4 categorical features were imputed with the training-set mode and encoded with OneHotEncoder configured with handle_unknown = ‘ignore’, so that a category unseen during training is encoded as all-zeros at prediction time rather than raising an error. The target variable was converted to integers with LabelEncoder, which assigns labels in alphabetical order and therefore maps Employable to 0 and Not Employable to 1. This encoding matters for the interpretation of the decision threshold discussed in Section 5.6: the predicted probability the model thresholds is the probability of the Not Employable class.</w:t>
+        <w:t>Duplicate records were removed and whitespace was stripped from all string-valued columns to eliminate spurious category variants arising from inconsistent data entry. The 14 numeric features were then imputed with the training-set median and standardised with StandardScaler to zero mean and unit variance, so that attributes measured on different scales — CGPA on a four-point scale, Resume_Score on a hundred-point scale, Internships as a small count — contribute on a common footing. The 4 categorical features were imputed with the training-set mode and encoded with OneHotEncoder configured with handle_unknown = ‘ignore’, so that a category unseen during training is encoded as all-zeros at prediction time rather than raising an error. The target variable was converted to integers with LabelEncoder, which assigns labels in alphabetical order and therefore maps Employable to 0 and Not Employable to 1. This encoding matters for the interpretation of the decision threshold discussed in Section 5.6: the predicted probability the model thresholds is the probability of the Not Employable class.</w:t>
       </w:r>
     </w:p>
     <w:p>
@@ -16544,8 +17040,14 @@
           <w:szCs w:val="24"/>
         </w:rPr>
         <w:t xml:space="preserve">The median was chosen over the mean for numeric imputation because it is robust to the skew and outliers characteristic of count attributes such as Certifications and Hackathons, where a small number of unusually high values would pull a mean-based imputation upward and systematically overstate the preparation of students whose data is incomplete. Standardisation, </w:t>
+      </w:r>
+      <w:r>
+        <w:rPr>
+          <w:sz w:val="24"/>
+          <w:szCs w:val="24"/>
+        </w:rPr>
         <w:lastRenderedPageBreak/>
-        <w:t xml:space="preserve">although not required by tree-based learners such as XGBoost, was retained so that the same fitted preprocessing pipeline can be reused without modification if scale-sensitive algorithms are added in the comparative extension identified in Section 5.8.</w:t>
+        <w:t>although not required by tree-based learners such as XGBoost, was retained so that the same fitted preprocessing pipeline can be reused without modification if scale-sensitive algorithms are added in the comparative extension identified in Section 5.8.</w:t>
       </w:r>
     </w:p>
     <w:p>
@@ -16593,7 +17095,7 @@
           <w:sz w:val="24"/>
           <w:szCs w:val="24"/>
         </w:rPr>
-        <w:t xml:space="preserve">Table 5.3: Distribution of the target variable Placement_Status</w:t>
+        <w:t>Table 5.3: Distribution of the target variable Placement_Status</w:t>
       </w:r>
     </w:p>
     <w:tbl>
@@ -17278,7 +17780,13 @@
           <w:sz w:val="24"/>
           <w:szCs w:val="24"/>
         </w:rPr>
-        <w:t xml:space="preserve">The consequences for machine learning are twofold. First, imbalance establishes a deceptively high accuracy baseline: a degenerate classifier that predicts Employable for every student, learning nothing whatever, would score 78.08 per cent accuracy on this dataset. Any reported accuracy must therefore be judged against that 78.08 per cent floor rather than against 50 per cent, and accuracy alone cannot be treated as evidence that a model has learned anything useful. Second, and more consequentially for this study, the standard cross-entropy objective weights every training instance equally, so a model trained without intervention minimises its loss most efficiently by fitting the majority class well and tolerating errors on the minority. The minority class here is precisely the population the system exists to identify: graduates at risk of non-</w:t>
+        <w:t>The consequences for machine learning are twofold. First, imbalance establishes a deceptively high accuracy baseline: a degenerate classifier that predicts Employable for every student, learning nothing whatever, would score 78.08 per cent accuracy on this dataset. Any reported accuracy must therefore be judged against that 78.08 per cent floor rather than against 50 per cent, and accuracy alone cannot be treated as evidence that a model has learned anything useful. Second, and more consequentially for this study, the standard cross-entropy objective weights every training instance equally, so a model trained without intervention minimises its loss most efficiently by fitting the majority class well and tolerating errors on the minority. The minority class here is precisely the population the system exists to identify: graduates at risk of non-</w:t>
+      </w:r>
+      <w:r>
+        <w:rPr>
+          <w:sz w:val="24"/>
+          <w:szCs w:val="24"/>
+        </w:rPr>
         <w:lastRenderedPageBreak/>
         <w:t>employment, who are the intended recipients of early support. A model that systematically overlooks them would be accurate and useless.</w:t>
       </w:r>
@@ -17293,7 +17801,7 @@
           <w:sz w:val="24"/>
           <w:szCs w:val="24"/>
         </w:rPr>
-        <w:t xml:space="preserve">Two complementary corrections were therefore applied, both documented in Section 5.6. SMOTE (Chawla et al., 2002) was inserted into the pipeline to synthesise additional minority-class instances within the training folds only, and the XGBoost objective was additionally weighted through the scale_pos_weight parameter, computed from the training partition as the ratio of majority to minority instances, approximately 3.56. The decision threshold was then lowered from the default 0.50 to 0.35. Section 5.7 shows that these three interventions, applied together, succeed emphatically in their stated aim of recovering minority-class cases, and Section 5.8 examines the cost at which that success is obtained.</w:t>
+        <w:t>Two complementary corrections were therefore applied, both documented in Section 5.6. SMOTE (Chawla et al., 2002) was inserted into the pipeline to synthesise additional minority-class instances within the training folds only, and the XGBoost objective was additionally weighted through the scale_pos_weight parameter, computed from the training partition as the ratio of majority to minority instances, approximately 3.56. The decision threshold was then lowered from the default 0.50 to 0.35. Section 5.7 shows that these three interventions, applied together, succeed emphatically in their stated aim of recovering minority-class cases, and Section 5.8 examines the cost at which that success is obtained.</w:t>
       </w:r>
     </w:p>
     <w:p>
@@ -17323,7 +17831,7 @@
           <w:sz w:val="24"/>
           <w:szCs w:val="24"/>
         </w:rPr>
-        <w:t xml:space="preserve">The dataset was partitioned into training and testing subsets using the standard 80:20 ratio, implemented with train_test_split configured with test_size = 0.2, random_state = 42 and stratify set to the target vector. Applied to 50,000 records this yields exactly 40,000 training records and 10,000 testing records; Table 5.4 reports the resulting partition together with its class composition, and Figure 5.5 presents it graphically.</w:t>
+        <w:t>The dataset was partitioned into training and testing subsets using the standard 80:20 ratio, implemented with train_test_split configured with test_size = 0.2, random_state = 42 and stratify set to the target vector. Applied to 50,000 records this yields exactly 40,000 training records and 10,000 testing records; Table 5.4 reports the resulting partition together with its class composition, and Figure 5.5 presents it graphically.</w:t>
       </w:r>
     </w:p>
     <w:p>
@@ -17959,7 +18467,7 @@
           <w:szCs w:val="24"/>
         </w:rPr>
         <w:lastRenderedPageBreak/>
-        <w:t xml:space="preserve">The 80:20 ratio is appropriate for this project for three specific reasons. First, at this sample size the split resolves the usual tension between training volume and evaluation reliability without compromise: 40,000 training records are ample for a gradient-boosted ensemble of 200 trees over 18 features, while 10,000 held-out records give an evaluation sample large enough that the estimated accuracy carries a 95 per cent confidence interval of roughly ±0.9 percentage points. A more conservative 70:30 split would buy negligible additional evaluation precision at the cost of 5,000 training records, and a 90:10 split would halve the minority-class test sample without materially improving what the model can learn. Second, and decisively for an imbalanced target, the 20 per cent partition retains 2,192 minority-class instances — a large enough subsample that minority-class recall and precision are estimated stably rather than swinging on a handful of cases, which is the failure mode of the small-sample studies criticised in Section 2.6. Third, the ratio is the convention across the employability prediction literature reviewed in Chapter 2, so results reported here remain directly comparable with that body of work.</w:t>
+        <w:t>The 80:20 ratio is appropriate for this project for three specific reasons. First, at this sample size the split resolves the usual tension between training volume and evaluation reliability without compromise: 40,000 training records are ample for a gradient-boosted ensemble of 200 trees over 18 features, while 10,000 held-out records give an evaluation sample large enough that the estimated accuracy carries a 95 per cent confidence interval of roughly ±0.9 percentage points. A more conservative 70:30 split would buy negligible additional evaluation precision at the cost of 5,000 training records, and a 90:10 split would halve the minority-class test sample without materially improving what the model can learn. Second, and decisively for an imbalanced target, the 20 per cent partition retains 2,192 minority-class instances — a large enough subsample that minority-class recall and precision are estimated stably rather than swinging on a handful of cases, which is the failure mode of the small-sample studies criticised in Section 2.6. Third, the ratio is the convention across the employability prediction literature reviewed in Chapter 2, so results reported here remain directly comparable with that body of work.</w:t>
       </w:r>
     </w:p>
     <w:p>
@@ -17972,7 +18480,7 @@
           <w:sz w:val="24"/>
           <w:szCs w:val="24"/>
         </w:rPr>
-        <w:t xml:space="preserve">Two properties of the split deserve emphasis. It is stratified, so the 78.08:21.92 class ratio is preserved exactly in both partitions, as Table 5.3 confirms; without stratification, random variation in the allocation of minority cases would confound any comparison of minority-class performance. It is also seeded: random_state = 42 was set both for the split and for SMOTE and the XGBoost classifier, so the entire experiment is exactly reproducible, and the reported figures can be regenerated by re-executing the notebook. The value 42 is the actual seed used in the implementation and is reported here rather than assumed.</w:t>
+        <w:t>Two properties of the split deserve emphasis. It is stratified, so the 78.08:21.92 class ratio is preserved exactly in both partitions, as Table 5.3 confirms; without stratification, random variation in the allocation of minority cases would confound any comparison of minority-class performance. It is also seeded: random_state = 42 was set both for the split and for SMOTE and the XGBoost classifier, so the entire experiment is exactly reproducible, and the reported figures can be regenerated by re-executing the notebook. The value 42 is the actual seed used in the implementation and is reported here rather than assumed.</w:t>
       </w:r>
     </w:p>
     <w:p>
@@ -18103,8 +18611,14 @@
           <w:szCs w:val="24"/>
         </w:rPr>
         <w:t xml:space="preserve">The pipeline proceeds as follows. The cleaned CSV is loaded and deduplicated, and whitespace is stripped from string columns. The two composite features described in Section 5.2 are constructed. The target and the six optional attributes are then dropped, leaving the 18-feature predictor matrix, and the target is label-encoded. The stratified 80:20 split of Section 5.5 is applied at this point — before any transformation is fitted — which is what guarantees the absence of leakage. The remaining stages are assembled into a single scikit-learn pipeline </w:t>
+      </w:r>
+      <w:r>
+        <w:rPr>
+          <w:sz w:val="24"/>
+          <w:szCs w:val="24"/>
+        </w:rPr>
         <w:lastRenderedPageBreak/>
-        <w:t xml:space="preserve">object comprising two steps executed in order: the ColumnTransformer preprocessing of Section 5.3 and the XGBoost classifier. An earlier configuration inserted a SMOTE oversampling step and an XGBoost scale_pos_weight term between these two stages; Section 5.7 reports why that configuration was replaced, and the pipeline evaluated in this chapter contains no synthetic-sampling step.</w:t>
+        <w:t>object comprising two steps executed in order: the ColumnTransformer preprocessing of Section 5.3 and the XGBoost classifier. An earlier configuration inserted a SMOTE oversampling step and an XGBoost scale_pos_weight term between these two stages; Section 5.7 reports why that configuration was replaced, and the pipeline evaluated in this chapter contains no synthetic-sampling step.</w:t>
       </w:r>
     </w:p>
     <w:p>
@@ -18160,9 +18674,15 @@
           <w:sz w:val="24"/>
           <w:szCs w:val="24"/>
         </w:rPr>
-        <w:t xml:space="preserve">The trained pipeline was evaluated on the 10,000 held-out records using accuracy, per-class precision, recall and F1-score, and the confusion matrix. These metrics were chosen in preference to accuracy alone because, as Section 5.4 established, accuracy on an imbalanced target is uninformative below the 78.08 per cent majority-class floor: precision and recall expose the trade-off between false positives and false negatives, and the F1-score summarises that trade-off in a single balanced figure. Reporting all of them per class, together with the </w:t>
+        <w:t xml:space="preserve">The trained pipeline was evaluated on the 10,000 held-out records using accuracy, per-class precision, recall and F1-score, and the confusion matrix. These metrics were chosen in preference to accuracy alone because, as Section 5.4 established, accuracy on an imbalanced target is uninformative below the 78.08 per cent majority-class floor: precision and recall </w:t>
+      </w:r>
+      <w:r>
+        <w:rPr>
+          <w:sz w:val="24"/>
+          <w:szCs w:val="24"/>
+        </w:rPr>
         <w:lastRenderedPageBreak/>
-        <w:t xml:space="preserve">confusion matrix, directly addresses the evaluation weakness identified across the reviewed literature, in which studies reported headline accuracy without minority-class recall (Baffa et al., 2023; Mezhoudi et al., 2023). Figure 5.7 reproduces the console output as primary evidence, and Table 5.5 sets out the same figures in the document’s reporting format.</w:t>
+        <w:t>expose the trade-off between false positives and false negatives, and the F1-score summarises that trade-off in a single balanced figure. Reporting all of them per class, together with the confusion matrix, directly addresses the evaluation weakness identified across the reviewed literature, in which studies reported headline accuracy without minority-class recall (Baffa et al., 2023; Mezhoudi et al., 2023). Figure 5.7 reproduces the console output as primary evidence, and Table 5.5 sets out the same figures in the document’s reporting format.</w:t>
       </w:r>
     </w:p>
     <w:p>
@@ -18244,7 +18764,7 @@
           <w:sz w:val="24"/>
           <w:szCs w:val="24"/>
         </w:rPr>
-        <w:t xml:space="preserve">Table 5.5: Classification performance of the tuned XGBoost pipeline on the held-out test set (decision threshold = 0.50, no SMOTE)</w:t>
+        <w:t>Table 5.5: Classification performance of the tuned XGBoost pipeline on the held-out test set (decision threshold = 0.50, no SMOTE)</w:t>
       </w:r>
     </w:p>
     <w:tbl>
@@ -19092,7 +19612,7 @@
           <w:sz w:val="24"/>
           <w:szCs w:val="24"/>
         </w:rPr>
-        <w:t xml:space="preserve">Figure 5.8: Confusion matrix for the tuned XGBoost pipeline on the held-out test set (threshold = 0.50, no SMOTE)</w:t>
+        <w:t>Figure 5.8: Confusion matrix for the tuned XGBoost pipeline on the held-out test set (threshold = 0.50, no SMOTE)</w:t>
       </w:r>
     </w:p>
     <w:p>
@@ -19169,7 +19689,15 @@
           <w:sz w:val="24"/>
           <w:szCs w:val="24"/>
         </w:rPr>
-        <w:t>The confusion matrix reconciles exactly with Table 5.5 and is the most informative single result in this chapter. Of the 7,808 genuinely employable graduates, 7,391 were correctly identified and 417 were incorrectly flagged as at risk. Of the 2,192 graduates who were genuinely not employable, 779 were correctly identified and 1,413 were missed. Overall accuracy follows as (7,391 + 779) / 10,000 = 0.8170, reproducing the reported figure precisely; minority-class recall is 779 / 2,192 = 0.3554 and minority-class precision is 779 / 1,196 = 0.6513, both matching the classification report to two decimal places. Figure 5.10 presents the per-class metrics side by side.</w:t>
+        <w:t xml:space="preserve">The confusion matrix reconciles exactly with Table 5.5 and is the most informative single result in this chapter. Of the 7,808 genuinely employable graduates, 7,391 were correctly identified </w:t>
+      </w:r>
+      <w:r>
+        <w:rPr>
+          <w:sz w:val="24"/>
+          <w:szCs w:val="24"/>
+        </w:rPr>
+        <w:lastRenderedPageBreak/>
+        <w:t>and 417 were incorrectly flagged as at risk. Of the 2,192 graduates who were genuinely not employable, 779 were correctly identified and 1,413 were missed. Overall accuracy follows as (7,391 + 779) / 10,000 = 0.8170, reproducing the reported figure precisely; minority-class recall is 779 / 2,192 = 0.3554 and minority-class precision is 779 / 1,196 = 0.6513, both matching the classification report to two decimal places. Figure 5.10 presents the per-class metrics side by side.</w:t>
       </w:r>
     </w:p>
     <w:p>
@@ -19248,13 +19776,15 @@
           <w:sz w:val="24"/>
           <w:szCs w:val="24"/>
         </w:rPr>
-        <w:t>Interpretation. These results must be read against the configuration change documented in Section 5.6. An earlier configuration applied three imbalance corrections in combination — SMOTE oversampling, scale_pos_weight and a lowered 0.35 threshold — specifically to maximise the recovery of at-risk graduates; that configuration reached 85.3 per cent minority-class recall but pushed overall accuracy to 63.84 per cent, below the 78.08 per cent majority-class baseline of Section 5.4, for a minority-class precision of only 0.36. The tuned configuration reported here removes all three interventions and instead selects hyperparameters by cross-validated search: accuracy rises to 81.70 per cent, comfortably above the majority-class baseline, and minority-class precision nearly doubles to 0.6513, but minority-class recall falls to 0.3554 — the model now misses 1,413 of the 2,192 graduates who are genuinely not employable. Neither configuration dominates the other; they occupy different points on the same precision–recall trade-off, and the choice between them is a decision about the relative cost of a missed at-risk graduate versus a false alarm, not a question that accuracy alone can settle. Section 5.14 returns to this trade-off when discussing which configuration is appropriate for deployment.</w:t>
-      </w:r>
-      <w:r>
-        <w:rPr>
-          <w:sz w:val="24"/>
-          <w:szCs w:val="24"/>
-        </w:rPr>
+        <w:t xml:space="preserve">Interpretation. </w:t>
+      </w:r>
+      <w:r>
+        <w:rPr>
+          <w:bCs/>
+          <w:sz w:val="24"/>
+          <w:szCs w:val="24"/>
+        </w:rPr>
+        <w:t>These results must be read against the configuration change documented in Section 5.6. An earlier configuration applied three imbalance corrections in combination — SMOTE oversampling, scale_pos_weight and a lowered 0.35 threshold — specifically to maximise the recovery of at-risk graduates; that configuration reached 85.3 per cent minority-class recall but pushed overall accuracy to 63.84 per cent, below the 78.08 per cent majority-class baseline of Section 5.4, for a minority-class precision of only 0.36. The tuned configuration reported here removes all three interventions and instead selects hyperparameters by cross-validated search: accuracy rises to 81.70 per cent, comfortably above the majority-class baseline, and minority-class precision nearly doubles to 0.6513, but minority-class recall falls to 0.3554 — the model now misses 1,413 of the 2,192 graduates who are genuinely not employable. Neither configuration dominates the other; they occupy different points on the same precision–recall trade-off, and the choice between them is a decision about the relative cost of a missed at-risk graduate versus a false alarm, not a question that accuracy alone can settle. Section 5.14 returns to this trade-off when discussing which configuration is appropriate for deployment.</w:t>
       </w:r>
     </w:p>
     <w:p>
@@ -19267,6 +19797,7 @@
           <w:sz w:val="24"/>
           <w:szCs w:val="24"/>
         </w:rPr>
+        <w:lastRenderedPageBreak/>
         <w:t>The cost of each configuration is equally clear and must be stated plainly. Under the earlier SMOTE-and-threshold configuration, minority-class precision was only 0.36, meaning that of the graduates the system flagged as at risk, roughly two-thirds were in fact employable, and overall accuracy of 63.84 per cent sat approximately 14 percentage points below the 78.08 per cent majority-class baseline established in Section 5.4 — a trivial classifier predicting Employable for everyone would have scored higher on accuracy alone, though it would identify none of the at-risk graduates. Under the tuned configuration reported in Table 5.5, the cost moves to the other side of the trade-off: minority-class recall of 0.3554 means the model now misses the majority — 1,413 of 2,192 — of the graduates who genuinely will not be placed, which is the more serious error for an early-warning system whose purpose is to route students toward support before they reach the job market. Neither figure is simply "better"; Section 5.14 discusses which configuration is appropriate for deployment given this trade-off.</w:t>
       </w:r>
     </w:p>
@@ -19280,7 +19811,7 @@
           <w:sz w:val="24"/>
           <w:szCs w:val="24"/>
         </w:rPr>
-        <w:t xml:space="preserve">The mechanism behind the earlier configuration's over-correction is identifiable from the implementation itself. SMOTE rebalanced the training distribution to parity, scale_pos_weight then applied a further multiplicative weight of approximately 3.56 to the minority class, and the decision threshold was additionally lowered from 0.50 to 0.35. Each intervention alone is a standard and defensible response to imbalance; applied together they compounded, and the model was pushed considerably further toward predicting the minority class than any one of them would warrant on its own — which is why the tuned configuration in this chapter removes all three rather than adjusting them individually. A systematic ablation that varies each lever independently remains a useful extension and is identified as a priority in Section 6.3.</w:t>
+        <w:t>The mechanism behind the earlier configuration's over-correction is identifiable from the implementation itself. SMOTE rebalanced the training distribution to parity, scale_pos_weight then applied a further multiplicative weight of approximately 3.56 to the minority class, and the decision threshold was additionally lowered from 0.50 to 0.35. Each intervention alone is a standard and defensible response to imbalance; applied together they compounded, and the model was pushed considerably further toward predicting the minority class than any one of them would warrant on its own — which is why the tuned configuration in this chapter removes all three rather than adjusting them individually. A systematic ablation that varies each lever independently remains a useful extension and is identified as a priority in Section 6.3.</w:t>
       </w:r>
     </w:p>
     <w:p>
@@ -19295,13 +19826,15 @@
           <w:sz w:val="24"/>
           <w:szCs w:val="24"/>
         </w:rPr>
-        <w:t>ROC-AUC. The tuned pipeline achieves a ROC-AUC of 0.8068 on the held-out test set, a threshold-independent measure of the model's ranking ability that is separate from the 0.50 cut-off used to produce Table 5.5. An AUC of 0.81 indicates that, for a randomly chosen employable/not-employable pair, the model assigns the higher risk score to the genuinely not-employable graduate roughly 81 per cent of the time — a moderate, not a strong, level of discrimination, and consistent with the modest per-feature mutual information reported in Section 5.10. A precision-recall curve, which is the more informative visualisation of the two under class imbalance, was not plotted and is recommended in Section 6.3 as a low-cost extension that would let a practitioner choose a deployment threshold other than 0.50 or 0.35 with the trade-off made explicit.</w:t>
-      </w:r>
-      <w:r>
-        <w:rPr>
-          <w:sz w:val="24"/>
-          <w:szCs w:val="24"/>
-        </w:rPr>
+        <w:t xml:space="preserve">ROC-AUC. </w:t>
+      </w:r>
+      <w:r>
+        <w:rPr>
+          <w:bCs/>
+          <w:sz w:val="24"/>
+          <w:szCs w:val="24"/>
+        </w:rPr>
+        <w:t>The tuned pipeline achieves a ROC-AUC of 0.8068 on the held-out test set, a threshold-independent measure of the model's ranking ability that is separate from the 0.50 cut-off used to produce Table 5.5. An AUC of 0.81 indicates that, for a randomly chosen employable/not-employable pair, the model assigns the higher risk score to the genuinely not-employable graduate roughly 81 per cent of the time — a moderate, not a strong, level of discrimination, and consistent with the modest per-feature mutual information reported in Section 5.10. A precision-recall curve, which is the more informative visualisation of the two under class imbalance, was not plotted and is recommended in Section 6.3 as a low-cost extension that would let a practitioner choose a deployment threshold other than 0.50 or 0.35 with the trade-off made explicit.</w:t>
       </w:r>
     </w:p>
     <w:p>
@@ -19318,7 +19851,8 @@
           <w:sz w:val="24"/>
           <w:szCs w:val="24"/>
         </w:rPr>
-        <w:t xml:space="preserve">5.8 Justification of XGBoost and Comparison with Alternative Algorithms</w:t>
+        <w:lastRenderedPageBreak/>
+        <w:t>5.8 Justification of XGBoost and Comparison with Alternative Algorithms</w:t>
       </w:r>
     </w:p>
     <w:p>
@@ -19331,7 +19865,7 @@
           <w:sz w:val="24"/>
           <w:szCs w:val="24"/>
         </w:rPr>
-        <w:t xml:space="preserve">XGBoost was selected as the modelling algorithm for this study on the basis of the argument developed in Section 2.5.2 and the characteristics of the data described in Sections 5.1 to 5.4. This section sets out that justification in full, compares XGBoost against the principal alternative families on the properties that matter for this problem, and states precisely what the present study does and does not establish empirically about that choice.</w:t>
+        <w:t>XGBoost was selected as the modelling algorithm for this study on the basis of the argument developed in Section 2.5.2 and the characteristics of the data described in Sections 5.1 to 5.4. This section sets out that justification in full, compares XGBoost against the principal alternative families on the properties that matter for this problem, and states precisely what the present study does and does not establish empirically about that choice.</w:t>
       </w:r>
     </w:p>
     <w:p>
@@ -19353,7 +19887,7 @@
           <w:sz w:val="24"/>
           <w:szCs w:val="24"/>
         </w:rPr>
-        <w:t xml:space="preserve">The pipeline executed for this study trains and evaluates Logistic Regression, Decision Tree, Random Forest and XGBoost under an identical stratified 80:20 split, the same 18-feature predictor matrix, and the same default 0.50 decision threshold; results are reported in Table 5.6. Support Vector Machine was identified as a candidate comparator in the research design of Section 3.3 but was not run, because kernel-based training scales poorly at n = 50,000 and the training cost was judged disproportionate to the likely benefit given the results obtained from the other four algorithms. The comparison shows the four tested algorithms clustered within two percentage points of each other on accuracy (81.09–81.96 per cent) and within 0.05 on minority-class recall (0.312–0.358): none dominates decisively, and tuned Logistic Regression in fact achieves marginally higher accuracy and AUC than XGBoost on this dataset. XGBoost is retained as the selected algorithm on the basis of its native feature-importance output (used in Section 5.10) and its capacity to absorb additional non-linear feature engineering without manual specification, rather than on a demonstrated accuracy advantage, and this qualification is carried into Section 5.13.</w:t>
+        <w:t>The pipeline executed for this study trains and evaluates Logistic Regression, Decision Tree, Random Forest and XGBoost under an identical stratified 80:20 split, the same 18-feature predictor matrix, and the same default 0.50 decision threshold; results are reported in Table 5.6. Support Vector Machine was identified as a candidate comparator in the research design of Section 3.3 but was not run, because kernel-based training scales poorly at n = 50,000 and the training cost was judged disproportionate to the likely benefit given the results obtained from the other four algorithms. The comparison shows the four tested algorithms clustered within two percentage points of each other on accuracy (81.09–81.96 per cent) and within 0.05 on minority-class recall (0.312–0.358): none dominates decisively, and tuned Logistic Regression in fact achieves marginally higher accuracy and AUC than XGBoost on this dataset. XGBoost is retained as the selected algorithm on the basis of its native feature-importance output (used in Section 5.10) and its capacity to absorb additional non-linear feature engineering without manual specification, rather than on a demonstrated accuracy advantage, and this qualification is carried into Section 5.13.</w:t>
       </w:r>
     </w:p>
     <w:p>
@@ -19761,6 +20295,7 @@
                 <w:sz w:val="18"/>
                 <w:szCs w:val="18"/>
               </w:rPr>
+              <w:lastRenderedPageBreak/>
               <w:t>Decision Tree</w:t>
             </w:r>
           </w:p>
@@ -19861,7 +20396,7 @@
                 <w:sz w:val="18"/>
                 <w:szCs w:val="18"/>
               </w:rPr>
-              <w:t xml:space="preserve">High variance; a single tree (max_depth=6) trailed every other algorithm tested on both accuracy and minority-class recall (0.312).</w:t>
+              <w:t>High variance; a single tree (max_depth=6) trailed every other algorithm tested on both accuracy and minority-class recall (0.312).</w:t>
             </w:r>
           </w:p>
         </w:tc>
@@ -19966,7 +20501,7 @@
                 <w:sz w:val="18"/>
                 <w:szCs w:val="18"/>
               </w:rPr>
-              <w:t xml:space="preserve">Bagging reduces variance substantially; robust; provides feature importances.</w:t>
+              <w:t>Bagging reduces variance substantially; robust; provides feature importances.</w:t>
             </w:r>
           </w:p>
         </w:tc>
@@ -20136,7 +20671,7 @@
                 <w:sz w:val="18"/>
                 <w:szCs w:val="18"/>
               </w:rPr>
-              <w:t xml:space="preserve">XGBoost (selected)</w:t>
+              <w:t>XGBoost (selected)</w:t>
             </w:r>
           </w:p>
         </w:tc>
@@ -20242,7 +20777,7 @@
                 <w:sz w:val="18"/>
                 <w:szCs w:val="18"/>
               </w:rPr>
-              <w:t xml:space="preserve">Less directly interpretable than a single tree; sensitive to hyperparameter choice; on this dataset, tuned Logistic Regression matched or marginally exceeded it on accuracy and AUC, so the choice of XGBoost here rests on feature-importance output and headroom for future non-linear feature engineering rather than a clear accuracy advantage.</w:t>
+              <w:t>Less directly interpretable than a single tree; sensitive to hyperparameter choice; on this dataset, tuned Logistic Regression matched or marginally exceeded it on accuracy and AUC, so the choice of XGBoost here rests on feature-importance output and headroom for future non-linear feature engineering rather than a clear accuracy advantage.</w:t>
             </w:r>
           </w:p>
         </w:tc>
@@ -20268,9 +20803,15 @@
           <w:sz w:val="24"/>
           <w:szCs w:val="24"/>
         </w:rPr>
-        <w:t xml:space="preserve">The technical case for XGBoost on this problem rests on six properties. First, predictive performance on structured tabular data: gradient-boosted tree ensembles are the consistent leading family on tabular classification tasks of this size and shape, a pattern reflected across the ensemble studies of Section 2.5.2 (Chen &amp; Guestrin, 2016; Haque et al., 2024; Vo et al., </w:t>
+        <w:t xml:space="preserve">The technical case for XGBoost on this problem rests on six properties. First, predictive performance on structured tabular data: gradient-boosted tree ensembles are the consistent leading family on tabular classification tasks of this size and shape, a pattern reflected across the ensemble studies of Section 2.5.2 (Chen &amp; Guestrin, 2016; Haque et al., 2024; Vo et al., 2023). Second, non-linear relationships: employability is unlikely to respond linearly to its determinants — the marginal value of a first internship plainly exceeds that of a fourth — and tree splits represent such saturating effects without requiring them to be specified in advance. Third, feature interactions: the effect of programming skill is conditional on whether it is evidenced through projects and a public portfolio, and with a maximum depth of 6 each tree </w:t>
+      </w:r>
+      <w:r>
+        <w:rPr>
+          <w:sz w:val="24"/>
+          <w:szCs w:val="24"/>
+        </w:rPr>
         <w:lastRenderedPageBreak/>
-        <w:t>2023). Second, non-linear relationships: employability is unlikely to respond linearly to its determinants — the marginal value of a first internship plainly exceeds that of a fourth — and tree splits represent such saturating effects without requiring them to be specified in advance. Third, feature interactions: the effect of programming skill is conditional on whether it is evidenced through projects and a public portfolio, and with a maximum depth of 6 each tree can encode interactions of up to six attributes automatically, which a linear model could capture only through manually constructed interaction terms.</w:t>
+        <w:t>can encode interactions of up to six attributes automatically, which a linear model could capture only through manually constructed interaction terms.</w:t>
       </w:r>
     </w:p>
     <w:p>
@@ -20313,7 +20854,6 @@
           <w:sz w:val="24"/>
           <w:szCs w:val="24"/>
         </w:rPr>
-        <w:lastRenderedPageBreak/>
         <w:t>5.9 System Implementation and Output: Prediction via API</w:t>
       </w:r>
     </w:p>
@@ -20327,7 +20867,15 @@
           <w:sz w:val="24"/>
           <w:szCs w:val="24"/>
         </w:rPr>
-        <w:t>The selected model was made operational as a documented HTTP API so that its predictions could be consumed directly. In addition to the API itself, a local single-page web view (webview.html) was built so that a graduate can submit a profile and read the resulting evaluation without constructing an HTTP request by hand; it is described later in this section. A student’s data is submitted to the trained model through the API — either directly, or via this web view — and the resulting employability evaluation is obtained in the same request, without any account, registration or login. The trained pipeline and the fitted label encoder are persisted with joblib as best_employability_pipeline.pkl and label_encoder.pkl respectively, so the exact fitted artefacts evaluated in Section 5.7 are those served at prediction time. Per-record predictions and predicted probabilities for the full test partition are exported as improved_placement_predictions.csv, and the headline metrics as improved_final_metrics.json.</w:t>
+        <w:t xml:space="preserve">The selected model was made operational as a documented HTTP API so that its predictions could be consumed directly. In addition to the API itself, a local single-page web view </w:t>
+      </w:r>
+      <w:r>
+        <w:rPr>
+          <w:sz w:val="24"/>
+          <w:szCs w:val="24"/>
+        </w:rPr>
+        <w:lastRenderedPageBreak/>
+        <w:t>(webview.html) was built so that a graduate can submit a profile and read the resulting evaluation without constructing an HTTP request by hand; it is described later in this section. A student’s data is submitted to the trained model through the API — either directly, or via this web view — and the resulting employability evaluation is obtained in the same request, without any account, registration or login. The trained pipeline and the fitted label encoder are persisted with joblib as best_employability_pipeline.pkl and label_encoder.pkl respectively, so the exact fitted artefacts evaluated in Section 5.7 are those served at prediction time. Per-record predictions and predicted probabilities for the full test partition are exported as improved_placement_predictions.csv, and the headline metrics as improved_final_metrics.json.</w:t>
       </w:r>
     </w:p>
     <w:p>
@@ -20340,7 +20888,7 @@
           <w:sz w:val="24"/>
           <w:szCs w:val="24"/>
         </w:rPr>
-        <w:t xml:space="preserve">A student provides their academic, technical, experiential, certification, soft-skill and career-preparation attributes as the JSON body of an HTTP request, satisfying FR1 and FR2 (Section 4.3.2). This request is sent to the prediction endpoint; the trained XGBoost pipeline scores the submitted data following the workflow of Section 5.6, and the resulting employability evaluation is returned in the same response, satisfying FR3. Figure 5.11 shows an illustrative example of the request body and the corresponding response.</w:t>
+        <w:t>A student provides their academic, technical, experiential, certification, soft-skill and career-preparation attributes as the JSON body of an HTTP request, satisfying FR1 and FR2 (Section 4.3.2). This request is sent to the prediction endpoint; the trained XGBoost pipeline scores the submitted data following the workflow of Section 5.6, and the resulting employability evaluation is returned in the same response, satisfying FR3. Figure 5.11 shows an illustrative example of the request body and the corresponding response.</w:t>
       </w:r>
     </w:p>
     <w:p>
@@ -20428,14 +20976,20 @@
       </w:r>
       <w:r>
         <w:rPr>
-          <w:i/>
           <w:iCs/>
           <w:sz w:val="24"/>
           <w:szCs w:val="24"/>
         </w:rPr>
-        <w:t xml:space="preserve">This figure is an illustrative schematic of the request-response contract, not a capture of the deployed endpoint operating on the trained pipeline. Its attribute names and cardinality differ from the 18 features the model actually consumes — it shows eight fields, </w:t>
+        <w:t xml:space="preserve">This figure is an illustrative schematic of the request-response contract, not a capture of the deployed endpoint operating on the trained pipeline. Its attribute names and cardinality differ from the 18 features the model actually consumes — it shows eight fields, including soft_skill_rating, applications_submitted and interviews_attended, which do not </w:t>
+      </w:r>
+      <w:r>
+        <w:rPr>
+          <w:iCs/>
+          <w:sz w:val="24"/>
+          <w:szCs w:val="24"/>
+        </w:rPr>
         <w:lastRenderedPageBreak/>
-        <w:t xml:space="preserve">including soft_skill_rating, applications_submitted and interviews_attended, which do not correspond to attributes of the dataset documented in Table 5.2 — and the base_rate of 0.52 shown in the response does not correspond to the 21.92 per cent minority-class base rate established in Section 5.4. The SHAP contributions shown in the response are likewise part of the intended interface specification: SHAP attribution is not computed by the executed pipeline reported in this chapter. Figure 5.11 should therefore be read as documenting the intended API contract, and aligning it with the actual 18-feature schema and computing genuine SHAP values are recorded as outstanding items in Sections 5.15 and 6.3.</w:t>
+        <w:t>correspond to attributes of the dataset documented in Table 5.2 — and the base_rate of 0.52 shown in the response does not correspond to the 21.92 per cent minority-class base rate established in Section 5.4. The SHAP contributions shown in the response are likewise part of the intended interface specification: SHAP attribution is not computed by the executed pipeline reported in this chapter. Figure 5.11 should therefore be read as documenting the intended API contract, and aligning it with the actual 18-feature schema and computing genuine SHAP values are recorded as outstanding items in Sections 5.15 and 6.3.</w:t>
       </w:r>
     </w:p>
     <w:p>
@@ -20457,21 +21011,37 @@
         <w:keepNext/>
         <w:keepLines/>
         <w:spacing w:before="240" w:after="160"/>
-      </w:pPr>
-      <w:r>
-        <w:rPr>
-          <w:sz w:val="24"/>
-        </w:rPr>
+        <w:rPr>
+          <w:b/>
+        </w:rPr>
+      </w:pPr>
+      <w:bookmarkStart w:id="0" w:name="_GoBack"/>
+      <w:r>
+        <w:rPr>
+          <w:b/>
+          <w:sz w:val="24"/>
+        </w:rPr>
+        <w:lastRenderedPageBreak/>
         <w:t>Local Web View for Interactive Predictions</w:t>
       </w:r>
     </w:p>
+    <w:bookmarkEnd w:id="0"/>
     <w:p>
       <w:pPr>
         <w:keepNext/>
         <w:keepLines/>
         <w:spacing w:before="240" w:after="160"/>
-      </w:pPr>
-      <w:r>
+        <w:jc w:val="both"/>
+        <w:rPr>
+          <w:sz w:val="24"/>
+          <w:szCs w:val="24"/>
+        </w:rPr>
+      </w:pPr>
+      <w:r>
+        <w:rPr>
+          <w:sz w:val="24"/>
+          <w:szCs w:val="24"/>
+        </w:rPr>
         <w:t>To make the API usable without a separate HTTP client, a self-contained local web page (webview.html) was built alongside the FastAPI service. The page is opened directly in a browser from the local file system and calls the same /predict endpoint documented above — the FastAPI application was extended with permissive CORS middleware specifically so that a page opened via the file:// protocol can call it. The form on the left collects the same profile attributes used for prediction, grouped into Academic, Technical &amp; Portfolio, Experience &amp; Readiness, and Soft Skills sections, plus the six demographic and contextual fields that are accepted by the request schema but excluded from the model itself (Section 5.2); a live status indicator confirms whether the API is reachable before a profile is submitted. Figure 5.11a shows the form in its initial state.</w:t>
       </w:r>
     </w:p>
@@ -20482,24 +21052,36 @@
         <w:keepLines/>
         <w:spacing w:before="240" w:after="160"/>
         <w:jc w:val="center"/>
-      </w:pPr>
-      <w:r>
+        <w:rPr>
+          <w:b/>
+          <w:sz w:val="24"/>
+          <w:szCs w:val="24"/>
+        </w:rPr>
+      </w:pPr>
+      <w:r>
+        <w:rPr>
+          <w:b/>
+          <w:noProof/>
+          <w:sz w:val="24"/>
+          <w:szCs w:val="24"/>
+        </w:rPr>
         <w:drawing>
-          <wp:inline xmlns:a="http://schemas.openxmlformats.org/drawingml/2006/main" xmlns:pic="http://schemas.openxmlformats.org/drawingml/2006/picture">
+          <wp:inline distT="0" distB="0" distL="0" distR="0">
             <wp:extent cx="5303520" cy="2651760"/>
+            <wp:effectExtent l="0" t="0" r="0" b="0"/>
             <wp:docPr id="32" name="Picture 32"/>
             <wp:cNvGraphicFramePr>
-              <a:graphicFrameLocks noChangeAspect="1"/>
+              <a:graphicFrameLocks xmlns:a="http://schemas.openxmlformats.org/drawingml/2006/main" noChangeAspect="1"/>
             </wp:cNvGraphicFramePr>
-            <a:graphic>
+            <a:graphic xmlns:a="http://schemas.openxmlformats.org/drawingml/2006/main">
               <a:graphicData uri="http://schemas.openxmlformats.org/drawingml/2006/picture">
-                <pic:pic>
+                <pic:pic xmlns:pic="http://schemas.openxmlformats.org/drawingml/2006/picture">
                   <pic:nvPicPr>
                     <pic:cNvPr id="0" name="webview_screenshot_form.png"/>
                     <pic:cNvPicPr/>
                   </pic:nvPicPr>
                   <pic:blipFill>
-                    <a:blip r:embed="rId33"/>
+                    <a:blip r:embed="rId26"/>
                     <a:stretch>
                       <a:fillRect/>
                     </a:stretch>
@@ -20509,7 +21091,9 @@
                       <a:off x="0" y="0"/>
                       <a:ext cx="5303520" cy="2651760"/>
                     </a:xfrm>
-                    <a:prstGeom prst="rect"/>
+                    <a:prstGeom prst="rect">
+                      <a:avLst/>
+                    </a:prstGeom>
                   </pic:spPr>
                 </pic:pic>
               </a:graphicData>
@@ -20523,8 +21107,20 @@
         <w:keepNext/>
         <w:keepLines/>
         <w:spacing w:before="240" w:after="160"/>
-      </w:pPr>
-      <w:r>
+        <w:rPr>
+          <w:b/>
+          <w:i/>
+          <w:sz w:val="24"/>
+          <w:szCs w:val="24"/>
+        </w:rPr>
+      </w:pPr>
+      <w:r>
+        <w:rPr>
+          <w:b/>
+          <w:i/>
+          <w:sz w:val="24"/>
+          <w:szCs w:val="24"/>
+        </w:rPr>
         <w:t>Figure 5.11a: The local web view's profile-submission form, showing its idle result panel before a check is run</w:t>
       </w:r>
     </w:p>
@@ -20533,8 +21129,17 @@
         <w:keepNext/>
         <w:keepLines/>
         <w:spacing w:before="240" w:after="160"/>
-      </w:pPr>
-      <w:r>
+        <w:jc w:val="both"/>
+        <w:rPr>
+          <w:sz w:val="24"/>
+          <w:szCs w:val="24"/>
+        </w:rPr>
+      </w:pPr>
+      <w:r>
+        <w:rPr>
+          <w:sz w:val="24"/>
+          <w:szCs w:val="24"/>
+        </w:rPr>
         <w:t>On submission, the page sends the profile to /predict and renders the response on the right: a verdict badge (Employable or Not Employable), a probability gauge, and, for a Not Employable verdict, the same rule-based gap-analysis list produced by the API (Section 5.9). Figure 5.11b shows this state for a deliberately weak profile — low CGPA, no internships, a below-median interview score — which the trained pipeline scores at 14 per cent employability probability and for which it lists eight concrete gaps. This satisfies FR5 (Table 4.1) in a minimal form: the prediction and a structured explanation of it are presented through an interactive interface rather than a raw JSON response, and NFR6's browser accessibility is met without requiring any server-side rendering framework. It does not fulfil FR4: the gaps shown are the same fixed, rule-based checks already implemented in the API (fixed thresholds on interview score, internships, project count and so on), not a SHAP-based, per-prediction attribution of the model's own decision, which remains the outstanding item recorded in Sections 5.9, 5.15 and 6.3. The administrator-facing aggregate-comparison and retraining views specified by FR6 and FR7 are likewise not part of this page and remain future work.</w:t>
       </w:r>
     </w:p>
@@ -20547,22 +21152,27 @@
         <w:jc w:val="center"/>
       </w:pPr>
       <w:r>
+        <w:rPr>
+          <w:noProof/>
+        </w:rPr>
+        <w:lastRenderedPageBreak/>
         <w:drawing>
-          <wp:inline xmlns:a="http://schemas.openxmlformats.org/drawingml/2006/main" xmlns:pic="http://schemas.openxmlformats.org/drawingml/2006/picture">
+          <wp:inline distT="0" distB="0" distL="0" distR="0">
             <wp:extent cx="5303520" cy="4356463"/>
+            <wp:effectExtent l="0" t="0" r="0" b="0"/>
             <wp:docPr id="33" name="Picture 33"/>
             <wp:cNvGraphicFramePr>
-              <a:graphicFrameLocks noChangeAspect="1"/>
+              <a:graphicFrameLocks xmlns:a="http://schemas.openxmlformats.org/drawingml/2006/main" noChangeAspect="1"/>
             </wp:cNvGraphicFramePr>
-            <a:graphic>
+            <a:graphic xmlns:a="http://schemas.openxmlformats.org/drawingml/2006/main">
               <a:graphicData uri="http://schemas.openxmlformats.org/drawingml/2006/picture">
-                <pic:pic>
+                <pic:pic xmlns:pic="http://schemas.openxmlformats.org/drawingml/2006/picture">
                   <pic:nvPicPr>
                     <pic:cNvPr id="0" name="webview_screenshot_result.png"/>
                     <pic:cNvPicPr/>
                   </pic:nvPicPr>
                   <pic:blipFill>
-                    <a:blip r:embed="rId34"/>
+                    <a:blip r:embed="rId27"/>
                     <a:stretch>
                       <a:fillRect/>
                     </a:stretch>
@@ -20572,7 +21182,9 @@
                       <a:off x="0" y="0"/>
                       <a:ext cx="5303520" cy="4356463"/>
                     </a:xfrm>
-                    <a:prstGeom prst="rect"/>
+                    <a:prstGeom prst="rect">
+                      <a:avLst/>
+                    </a:prstGeom>
                   </pic:spPr>
                 </pic:pic>
               </a:graphicData>
@@ -20586,8 +21198,20 @@
         <w:keepNext/>
         <w:keepLines/>
         <w:spacing w:before="240" w:after="160"/>
-      </w:pPr>
-      <w:r>
+        <w:rPr>
+          <w:b/>
+          <w:i/>
+          <w:sz w:val="24"/>
+          <w:szCs w:val="24"/>
+        </w:rPr>
+      </w:pPr>
+      <w:r>
+        <w:rPr>
+          <w:b/>
+          <w:i/>
+          <w:sz w:val="24"/>
+          <w:szCs w:val="24"/>
+        </w:rPr>
         <w:t>Figure 5.11b: The local web view after a submission, showing the verdict badge, probability gauge and gap-analysis list for a weak profile</w:t>
       </w:r>
     </w:p>
@@ -20625,7 +21249,7 @@
           <w:sz w:val="24"/>
           <w:szCs w:val="24"/>
         </w:rPr>
-        <w:t xml:space="preserve">Interpreting the selected model is central to this thesis, because a prediction that cannot be decomposed into its contributing factors cannot be translated into advice about what a student should do differently. Feature importance was obtained from the trained XGBoost estimator’s native feature_importances_ attribute, which scores each split variable by its aggregate contribution to the ensemble’s decisions. Because categorical attributes are one-hot encoded before reaching the classifier, the importance of each encoded indicator column was mapped back to its originating raw attribute and summed, so that a categorical feature is credited with the total contribution of all its categories rather than appearing as several fragmentary entries. The resulting scores were then sorted in descending order. Importances are normalised to sum to one across the 18 retained features, so each value is directly readable as that feature’s share of total contribution. Figure 5.12 reproduces the plotted ranking as produced by the pipeline.</w:t>
+        <w:t>Interpreting the selected model is central to this thesis, because a prediction that cannot be decomposed into its contributing factors cannot be translated into advice about what a student should do differently. Feature importance was obtained from the trained XGBoost estimator’s native feature_importances_ attribute, which scores each split variable by its aggregate contribution to the ensemble’s decisions. Because categorical attributes are one-hot encoded before reaching the classifier, the importance of each encoded indicator column was mapped back to its originating raw attribute and summed, so that a categorical feature is credited with the total contribution of all its categories rather than appearing as several fragmentary entries. The resulting scores were then sorted in descending order. Importances are normalised to sum to one across the 18 retained features, so each value is directly readable as that feature’s share of total contribution. Figure 5.12 reproduces the plotted ranking as produced by the pipeline.</w:t>
       </w:r>
     </w:p>
     <w:p>
@@ -20653,7 +21277,7 @@
                     <pic:cNvPicPr preferRelativeResize="0"/>
                   </pic:nvPicPr>
                   <pic:blipFill>
-                    <a:blip r:embed="rId26"/>
+                    <a:blip r:embed="rId28"/>
                     <a:srcRect/>
                     <a:stretch>
                       <a:fillRect/>
@@ -20690,7 +21314,7 @@
           <w:sz w:val="24"/>
           <w:szCs w:val="24"/>
         </w:rPr>
-        <w:t xml:space="preserve">Figure 5.12: XGBoost feature importance across the 18 retained features, tuned configuration (normalised, mapped back to raw attributes)</w:t>
+        <w:t>Figure 5.12: XGBoost feature importance across the 18 retained features, tuned configuration (normalised, mapped back to raw attributes)</w:t>
       </w:r>
     </w:p>
     <w:p>
@@ -22236,6 +22860,7 @@
           </w:tcPr>
           <w:p>
             <w:r>
+              <w:lastRenderedPageBreak/>
               <w:t>17</w:t>
             </w:r>
           </w:p>
@@ -22410,26 +23035,11 @@
       </w:pPr>
       <w:r>
         <w:rPr>
-          <w:b/>
           <w:bCs/>
           <w:sz w:val="24"/>
           <w:szCs w:val="24"/>
         </w:rPr>
         <w:t>Note on Table 5.7. The rank ordering and numeric importance scores of all 18 features shown in Table 5.7 were obtained directly from the trained model's feature_importances_ attribute for the tuned configuration reported in Section 5.7 (no SMOTE, threshold = 0.50, hyperparameters selected by RandomizedSearchCV), and are exact to six decimal places rather than estimated from a plot. This resolves the earlier limitation, recorded in Section 5.15, that only the four lowest-ranked scores could be read from the captured console output. Priority tiers are assigned by inspection of the score distribution rather than by fixed rank cut-offs: High denotes the five features each contributing more than 6 per cent of total importance, Medium the three features contributing between 2 and 4.5 per cent, and Low the remaining ten features, each contributing under 2 per cent.</w:t>
-      </w:r>
-      <w:r>
-        <w:rPr>
-          <w:sz w:val="24"/>
-          <w:szCs w:val="24"/>
-        </w:rPr>
-      </w:r>
-      <w:r>
-        <w:rPr>
-          <w:i/>
-          <w:iCs/>
-          <w:sz w:val="24"/>
-          <w:szCs w:val="24"/>
-        </w:rPr>
       </w:r>
     </w:p>
     <w:p>
@@ -22455,7 +23065,15 @@
           <w:sz w:val="24"/>
           <w:szCs w:val="24"/>
         </w:rPr>
-        <w:t>This ordering is consistent with the theoretical expectations developed in Chapter 2 and with the empirical findings that industrial work experience and internship exposure discriminate more strongly than grades (Baffa et al., 2023; Jackson, 2013; Kahlik &amp; Al-Hababi, 2024). It reinforces the argument, made throughout this thesis, that employability in computing disciplines cannot be reduced to grade point average. The ranking is also reasonable on its face rather than merely convenient: Resume_Score leading is expected because a resume is the aggregating artefact through which every other attribute is communicated to an employer, and its prominence signals that how competence is evidenced matters alongside the competence itself. Programming_Skill and Internships ranking third and fourth accords with the employer-demand evidence for the Bangladeshi ICT sector reported by Jony et al. (2022).</w:t>
+        <w:t xml:space="preserve">This ordering is consistent with the theoretical expectations developed in Chapter 2 and with the empirical findings that industrial work experience and internship exposure discriminate more strongly than grades (Baffa et al., 2023; Jackson, 2013; Kahlik &amp; Al-Hababi, 2024). It reinforces the argument, made throughout this thesis, that employability in computing disciplines cannot be reduced to grade point average. The ranking is also reasonable on its face rather than merely convenient: Resume_Score leading is expected because a resume is the aggregating artefact through which every other attribute is communicated to an employer, and its prominence signals that how competence is evidenced matters alongside the competence </w:t>
+      </w:r>
+      <w:r>
+        <w:rPr>
+          <w:sz w:val="24"/>
+          <w:szCs w:val="24"/>
+        </w:rPr>
+        <w:lastRenderedPageBreak/>
+        <w:t>itself. Programming_Skill and Internships ranking third and fourth accords with the employer-demand evidence for the Bangladeshi ICT sector reported by Jony et al. (2022).</w:t>
       </w:r>
     </w:p>
     <w:p>
@@ -22481,7 +23099,7 @@
           <w:sz w:val="24"/>
           <w:szCs w:val="24"/>
         </w:rPr>
-        <w:t xml:space="preserve">At the level of the individual student, the ranking translates directly into guidance: effort directed at strengthening a resume, securing internship experience and deepening programming ability will move a predicted employability score considerably more than a marginal improvement in CGPA, though the prominence of Overall_Preparedness_Index in this ranking should be read as reinforcing the value of interview performance and internship experience specifically, given the caveat above about how that composite acquires its weight. Converting this global ranking into per-student attribution, so that a specific graduate sees which of their own attributes most raised or lowered their prediction, requires the SHAP layer specified in Section 5.9 and not yet implemented.</w:t>
+        <w:t>At the level of the individual student, the ranking translates directly into guidance: effort directed at strengthening a resume, securing internship experience and deepening programming ability will move a predicted employability score considerably more than a marginal improvement in CGPA, though the prominence of Overall_Preparedness_Index in this ranking should be read as reinforcing the value of interview performance and internship experience specifically, given the caveat above about how that composite acquires its weight. Converting this global ranking into per-student attribution, so that a specific graduate sees which of their own attributes most raised or lowered their prediction, requires the SHAP layer specified in Section 5.9 and not yet implemented.</w:t>
       </w:r>
     </w:p>
     <w:p>
@@ -22526,6 +23144,7 @@
           <w:b/>
           <w:bCs/>
         </w:rPr>
+        <w:lastRenderedPageBreak/>
         <w:t>5.11.1 The Z-Test</w:t>
       </w:r>
     </w:p>
@@ -22539,9 +23158,7 @@
           <w:sz w:val="24"/>
           <w:szCs w:val="24"/>
         </w:rPr>
-        <w:t xml:space="preserve">The Z-test, or standard normal deviate test, assesses whether an observed sample statistic differs significantly from a hypothesised population value, or whether two independent sample statistics differ from one another, under the assumption that the sampling distribution of the statistic is normal. It is appropriate when the sample is large — conventionally n greater than 30 per group, though the approximation improves markedly beyond a few hundred — and when the population variance is known or, at large n, reliably estimated from the sample. Its </w:t>
-        <w:lastRenderedPageBreak/>
-        <w:t>assumptions are that observations are independent, that the sampling distribution of the statistic is approximately normal (guaranteed at large n by the central limit theorem irrespective of the distribution of the underlying variable), and, for the two-sample form, that the groups are independent of one another.</w:t>
+        <w:t>The Z-test, or standard normal deviate test, assesses whether an observed sample statistic differs significantly from a hypothesised population value, or whether two independent sample statistics differ from one another, under the assumption that the sampling distribution of the statistic is normal. It is appropriate when the sample is large — conventionally n greater than 30 per group, though the approximation improves markedly beyond a few hundred — and when the population variance is known or, at large n, reliably estimated from the sample. Its assumptions are that observations are independent, that the sampling distribution of the statistic is approximately normal (guaranteed at large n by the central limit theorem irrespective of the distribution of the underlying variable), and, for the two-sample form, that the groups are independent of one another.</w:t>
       </w:r>
     </w:p>
     <w:p>
@@ -22554,7 +23171,7 @@
           <w:sz w:val="24"/>
           <w:szCs w:val="24"/>
         </w:rPr>
-        <w:t xml:space="preserve">For comparing a continuous attribute between two groups, the null hypothesis is that the population means are equal, H₀: μ₁ = μ₂, against the alternative H₁: μ₁ ≠ μ₂. The test statistic is the difference in sample means divided by the standard error of that difference, z = (x̄₁ − x̄₂) / √(σ₁²/n₁ + σ₂²/n₂). For comparing a proportion between two groups — the form directly relevant to a binary employment outcome — the null hypothesis is H₀: p₁ = p₂ and the statistic is the difference in sample proportions divided by its standard error under the pooled proportion. The resulting statistic is referred to the standard normal distribution to obtain a two-tailed p-value, which is compared against a significance level conventionally set at α = 0.05. A p-value below α leads to rejection of the null hypothesis, supporting the conclusion that the observed difference is unlikely to have arisen by chance alone.</w:t>
+        <w:t>For comparing a continuous attribute between two groups, the null hypothesis is that the population means are equal, H₀: μ₁ = μ₂, against the alternative H₁: μ₁ ≠ μ₂. The test statistic is the difference in sample means divided by the standard error of that difference, z = (x̄₁ − x̄₂) / √(σ₁²/n₁ + σ₂²/n₂). For comparing a proportion between two groups — the form directly relevant to a binary employment outcome — the null hypothesis is H₀: p₁ = p₂ and the statistic is the difference in sample proportions divided by its standard error under the pooled proportion. The resulting statistic is referred to the standard normal distribution to obtain a two-tailed p-value, which is compared against a significance level conventionally set at α = 0.05. A p-value below α leads to rejection of the null hypothesis, supporting the conclusion that the observed difference is unlikely to have arisen by chance alone.</w:t>
       </w:r>
     </w:p>
     <w:p>
@@ -22571,8 +23188,6 @@
         </w:rPr>
         <w:t>5.11.2 The T-Test</w:t>
       </w:r>
-      <w:bookmarkStart w:id="0" w:name="_GoBack"/>
-      <w:bookmarkEnd w:id="0"/>
     </w:p>
     <w:p>
       <w:pPr>
@@ -22597,7 +23212,15 @@
           <w:sz w:val="24"/>
           <w:szCs w:val="24"/>
         </w:rPr>
-        <w:t>The test statistic is the difference in sample means divided by the standard error computed from the sample standard deviations, t = (x̄₁ − x̄₂) / √(s₁²/n₁ + s₂²/n₂), and is referred to the t-distribution with the appropriate degrees of freedom rather than to the normal. The t-distribution has heavier tails than the normal, which widens the rejection region and makes the test appropriately more conservative at small sample sizes. As the degrees of freedom increase the t-distribution converges on the standard normal, and beyond approximately n = 30 per group the two tests yield materially identical p-values. Interpretation proceeds identically: a p-value below α = 0.05 leads to rejection of the null hypothesis of equal means.</w:t>
+        <w:t>The test statistic is the difference in sample means divided by the standard error computed from the sample standard deviations, t = (x̄₁ − x̄₂) / √(s₁²/n₁ + s₂²/n₂), and is referred to the t-distribution with the appropriate degrees of freedom rather than to the normal. The t-</w:t>
+      </w:r>
+      <w:r>
+        <w:rPr>
+          <w:sz w:val="24"/>
+          <w:szCs w:val="24"/>
+        </w:rPr>
+        <w:lastRenderedPageBreak/>
+        <w:t>distribution has heavier tails than the normal, which widens the rejection region and makes the test appropriately more conservative at small sample sizes. As the degrees of freedom increase the t-distribution converges on the standard normal, and beyond approximately n = 30 per group the two tests yield materially identical p-values. Interpretation proceeds identically: a p-value below α = 0.05 leads to rejection of the null hypothesis of equal means.</w:t>
       </w:r>
     </w:p>
     <w:p>
@@ -22622,7 +23245,6 @@
           <w:b/>
           <w:bCs/>
         </w:rPr>
-        <w:lastRenderedPageBreak/>
         <w:t>5.11.3 Comparison and Determination of the Appropriate Test</w:t>
       </w:r>
     </w:p>
@@ -23056,7 +23678,7 @@
           </w:tcPr>
           <w:p>
             <w:r>
-              <w:t xml:space="preserve">t-distribution with n₁ + n₂ − 2 degrees of freedom (or Welch’s adjustment).</w:t>
+              <w:t>t-distribution with n₁ + n₂ − 2 degrees of freedom (or Welch’s adjustment).</w:t>
             </w:r>
           </w:p>
         </w:tc>
@@ -23093,7 +23715,7 @@
           </w:tcPr>
           <w:p>
             <w:r>
-              <w:t xml:space="preserve">z = (x̄₁ − x̄₂) / √(σ₁²/n₁ + σ₂²/n₂); or the two-proportion form for binary outcomes.</w:t>
+              <w:t>z = (x̄₁ − x̄₂) / √(σ₁²/n₁ + σ₂²/n₂); or the two-proportion form for binary outcomes.</w:t>
             </w:r>
           </w:p>
         </w:tc>
@@ -23109,7 +23731,7 @@
           </w:tcPr>
           <w:p>
             <w:r>
-              <w:t xml:space="preserve">t = (x̄₁ − x̄₂) / √(s₁²/n₁ + s₂²/n₂).</w:t>
+              <w:t>t = (x̄₁ − x̄₂) / √(s₁²/n₁ + s₂²/n₂).</w:t>
             </w:r>
           </w:p>
         </w:tc>
@@ -23215,7 +23837,7 @@
           </w:tcPr>
           <w:p>
             <w:r>
-              <w:t xml:space="preserve">Valid but not preferred. At these group sizes the t-distribution is indistinguishable from the normal, so the t-test offers no advantage while implying a small-sample framing that misdescribes the data.</w:t>
+              <w:t>Valid but not preferred. At these group sizes the t-distribution is indistinguishable from the normal, so the t-test offers no advantage while implying a small-sample framing that misdescribes the data.</w:t>
             </w:r>
           </w:p>
         </w:tc>
@@ -23241,7 +23863,15 @@
           <w:sz w:val="24"/>
           <w:szCs w:val="24"/>
         </w:rPr>
-        <w:t xml:space="preserve">The determination for this dataset is therefore clear. Both group sizes — 39,040 employable and 10,960 not employable — exceed by three orders of magnitude the threshold at which the t-distribution converges on the standard normal, so the two tests would return p-values agreeing to many decimal places. The Z-test is the appropriate choice, for two reasons beyond mere convergence. First, its large-sample framing correctly describes the data: the t-test exists to correct for the additional uncertainty introduced when the population variance is estimated from a small sample, and at n = 50,000 that correction is numerically negligible. Second, and more substantively, the two-proportion Z-test directly addresses the question the target variable poses — whether the proportion of employable graduates differs significantly between groups defined by a given attribute — whereas the t-test compares means of continuous variables and is therefore the appropriate instrument only for the secondary question of whether attributes such as Resume_Score, CGPA or Internships differ in mean between the employable and non-employable groups.</w:t>
+        <w:t xml:space="preserve">The determination for this dataset is therefore clear. Both group sizes — 39,040 employable and 10,960 not employable — exceed by three orders of magnitude the threshold at which the t-distribution converges on the standard normal, so the two tests would return p-values agreeing to many decimal places. The Z-test is the appropriate choice, for two reasons beyond mere convergence. First, its large-sample framing correctly describes the data: the t-test exists to correct for the additional uncertainty introduced when the population variance is estimated </w:t>
+      </w:r>
+      <w:r>
+        <w:rPr>
+          <w:sz w:val="24"/>
+          <w:szCs w:val="24"/>
+        </w:rPr>
+        <w:lastRenderedPageBreak/>
+        <w:t>from a small sample, and at n = 50,000 that correction is numerically negligible. Second, and more substantively, the two-proportion Z-test directly addresses the question the target variable poses — whether the proportion of employable graduates differs significantly between groups defined by a given attribute — whereas the t-test compares means of continuous variables and is therefore the appropriate instrument only for the secondary question of whether attributes such as Resume_Score, CGPA or Internships differ in mean between the employable and non-employable groups.</w:t>
       </w:r>
     </w:p>
     <w:p>
@@ -23254,7 +23884,6 @@
           <w:sz w:val="24"/>
           <w:szCs w:val="24"/>
         </w:rPr>
-        <w:lastRenderedPageBreak/>
         <w:t>A caution applies to any significance testing on a sample of this size, and it should be stated before any result is reported. At n = 50,000 the standard error of a difference is very small, so differences of no practical consequence will register as highly significant. Statistical significance and practical importance separate sharply at this scale. Any test performed on this dataset should therefore be reported alongside an effect-size measure — Cohen’s d for mean differences, or the absolute difference in proportions with a confidence interval for the binary outcome — so that the magnitude of a difference is assessed independently of whether it is distinguishable from zero.</w:t>
       </w:r>
     </w:p>
@@ -23277,7 +23906,7 @@
           <w:sz w:val="24"/>
           <w:szCs w:val="24"/>
         </w:rPr>
-        <w:t xml:space="preserve">The Z-test set out in Section 5.11.1 has been executed on the 13 original numeric attributes present in the loaded dataset, comparing the mean of each attribute between the Employable (n = 7,808) and Not Employable (n = 2,192) groups of the held-out test partition, consistent with the stratified support reported in Section 5.15. Both group sizes comfortably satisfy the n &gt; 30 condition for the normal approximation, confirmed programmatically in the executed output (Figure 5.13). The test was run on the dataset’s original numeric columns prior to feature exclusion and engineering; it therefore includes Attendance_Percentage, which was subsequently excluded from the predictive model (Section 5.2), and does not include the two engineered composites, Overall_Preparedness_Index and Skills_per_Project, which did not yet exist at the point the test was run.</w:t>
+        <w:t>The Z-test set out in Section 5.11.1 has been executed on the 13 original numeric attributes present in the loaded dataset, comparing the mean of each attribute between the Employable (n = 7,808) and Not Employable (n = 2,192) groups of the held-out test partition, consistent with the stratified support reported in Section 5.15. Both group sizes comfortably satisfy the n &gt; 30 condition for the normal approximation, confirmed programmatically in the executed output (Figure 5.13). The test was run on the dataset’s original numeric columns prior to feature exclusion and engineering; it therefore includes Attendance_Percentage, which was subsequently excluded from the predictive model (Section 5.2), and does not include the two engineered composites, Overall_Preparedness_Index and Skills_per_Project, which did not yet exist at the point the test was run.</w:t>
       </w:r>
     </w:p>
     <w:p>
@@ -23290,6 +23919,7 @@
         <w:rPr>
           <w:noProof/>
         </w:rPr>
+        <w:lastRenderedPageBreak/>
         <w:drawing>
           <wp:inline distT="0" distB="0" distL="0" distR="0">
             <wp:extent cx="5400000" cy="2401980"/>
@@ -23304,7 +23934,7 @@
                     <pic:cNvPicPr preferRelativeResize="0"/>
                   </pic:nvPicPr>
                   <pic:blipFill>
-                    <a:blip r:embed="rId27"/>
+                    <a:blip r:embed="rId29"/>
                     <a:srcRect/>
                     <a:stretch>
                       <a:fillRect/>
@@ -23354,7 +23984,6 @@
         <w:rPr>
           <w:noProof/>
         </w:rPr>
-        <w:lastRenderedPageBreak/>
         <w:drawing>
           <wp:inline distT="0" distB="0" distL="0" distR="0">
             <wp:extent cx="4400000" cy="2776440"/>
@@ -23369,7 +23998,7 @@
                     <pic:cNvPicPr preferRelativeResize="0"/>
                   </pic:nvPicPr>
                   <pic:blipFill>
-                    <a:blip r:embed="rId28"/>
+                    <a:blip r:embed="rId30"/>
                     <a:srcRect/>
                     <a:stretch>
                       <a:fillRect/>
@@ -23419,7 +24048,15 @@
           <w:sz w:val="24"/>
           <w:szCs w:val="24"/>
         </w:rPr>
-        <w:t>Figure 5.13 reproduces the console output of the executed test, and Figure 5.14 plots the resulting Z-statistics in descending order of magnitude. All 13 attributes show a statistically significant difference in mean between the two groups, with p &lt; 0.0001 in every case and the null hypothesis of equal means rejected throughout. The strongest differentiators are Resume_Score (z = 47.18), Interview_Score (z = 44.69) and Internships (z = 42.42); the weakest, though still significant, are Study_Hours_Per_Week (z = 12.18) and Certifications (z = 7.25). This ordering is broadly consistent with, though not identical to, the gain-based feature-importance ranking of Section 5.10: Resume_Score leads under both measures, while Certifications — ranked eleventh by importance — shows the smallest mean separation of the attributes tested here, a reminder that a large, gain-important split is not the same quantity as a large mean difference between classes. As anticipated in the caution above, no effect-size measure has yet been computed alongside these Z-statistics; at this sample size even small mean differences will register as highly significant, so Cohen’s d for each attribute remains to be calculated before the practical, as opposed to statistical, magnitude of these differences can be assessed. This is recorded as outstanding in Section 5.15 and recommended in Section 6.3.</w:t>
+        <w:t xml:space="preserve">Figure 5.13 reproduces the console output of the executed test, and Figure 5.14 plots the resulting Z-statistics in descending order of magnitude. All 13 attributes show a statistically significant difference in mean between the two groups, with p &lt; 0.0001 in every case and the null hypothesis of equal means rejected throughout. The strongest differentiators are Resume_Score (z = 47.18), Interview_Score (z = 44.69) and Internships (z = 42.42); the weakest, though still significant, are Study_Hours_Per_Week (z = 12.18) and Certifications (z = 7.25). This ordering is broadly consistent with, though not identical to, the gain-based feature-importance ranking of Section 5.10: Resume_Score leads under both measures, while Certifications — ranked eleventh by importance — shows the smallest mean separation of the attributes tested here, a reminder that a large, gain-important split is not the same quantity as a large mean difference between classes. As anticipated in the caution above, no effect-size </w:t>
+      </w:r>
+      <w:r>
+        <w:rPr>
+          <w:sz w:val="24"/>
+          <w:szCs w:val="24"/>
+        </w:rPr>
+        <w:lastRenderedPageBreak/>
+        <w:t>measure has yet been computed alongside these Z-statistics; at this sample size even small mean differences will register as highly significant, so Cohen’s d for each attribute remains to be calculated before the practical, as opposed to statistical, magnitude of these differences can be assessed. This is recorded as outstanding in Section 5.15 and recommended in Section 6.3.</w:t>
       </w:r>
     </w:p>
     <w:p>
@@ -23488,7 +24125,8 @@
           <w:sz w:val="24"/>
           <w:szCs w:val="24"/>
         </w:rPr>
-        <w:t xml:space="preserve">Fourth, the interpretability contribution identified as research gap G4 in Section 2.7 is partially rather than fully addressed. Global feature importance is delivered, and it yields the study’s principal finding; per-prediction attribution, which is what converts a ranking into individualised advice, is specified but not yet implemented.</w:t>
+        <w:lastRenderedPageBreak/>
+        <w:t>Fourth, the interpretability contribution identified as research gap G4 in Section 2.7 is partially rather than fully addressed. Global feature importance is delivered, and it yields the study’s principal finding; per-prediction attribution, which is what converts a ranking into individualised advice, is specified but not yet implemented.</w:t>
       </w:r>
     </w:p>
     <w:p>
@@ -23501,9 +24139,7 @@
           <w:sz w:val="24"/>
           <w:szCs w:val="24"/>
         </w:rPr>
-        <w:t xml:space="preserve">The practical implications follow directly. For students, the ranked determinants indicate that resume quality, programming and problem-solving ability, internship experience and recognised certifications warrant substantially more preparation effort than marginal CGPA improvement. For universities, the same ranking argues for curriculum revision toward greater work-integrated learning and for the use of an early-warning tool of this kind in career services — with the important caveat, following from Section 5.7, that at its current precision the tool would flag roughly three graduates for every one who genuinely needs support, which is tolerable for routing students to optional guidance but would not be tolerable for any allocation </w:t>
-        <w:lastRenderedPageBreak/>
-        <w:t xml:space="preserve">decision with a real cost attached. For employers and policymakers, the model offers an evidence-based rather than perception-based characterisation of entry-level graduate readiness.</w:t>
+        <w:t>The practical implications follow directly. For students, the ranked determinants indicate that resume quality, programming and problem-solving ability, internship experience and recognised certifications warrant substantially more preparation effort than marginal CGPA improvement. For universities, the same ranking argues for curriculum revision toward greater work-integrated learning and for the use of an early-warning tool of this kind in career services — with the important caveat, following from Section 5.7, that at its current precision the tool would flag roughly three graduates for every one who genuinely needs support, which is tolerable for routing students to optional guidance but would not be tolerable for any allocation decision with a real cost attached. For employers and policymakers, the model offers an evidence-based rather than perception-based characterisation of entry-level graduate readiness.</w:t>
       </w:r>
     </w:p>
     <w:p>
@@ -23548,13 +24184,15 @@
           <w:sz w:val="24"/>
           <w:szCs w:val="24"/>
         </w:rPr>
-        <w:t>RQ1 — determinants and their relative importance — addressed. The feature-importance analysis of Section 5.10 identifies and ranks all 18 retained technical, academic, experiential and behavioural attributes, establishing Resume_Score, Overall_Preparedness_Index, Programming_Skill and Internships as the strongest determinants and placing CGPA seventh. This fulfils Objective 1 and answers RQ1, with the supporting evidence being the ranking in Table 5.7 and Figure 5.12, now backed by exact numeric importance scores for all 18 features rather than the four lowest-ranked only. One qualification applies: the determinants are learned from a secondary, non-Bangladesh-specific dataset, so their ordering should be validated on Bangladeshi data before being treated as definitive for the national context.</w:t>
-      </w:r>
-      <w:r>
-        <w:rPr>
-          <w:sz w:val="24"/>
-          <w:szCs w:val="24"/>
-        </w:rPr>
+        <w:t xml:space="preserve">RQ1 — </w:t>
+      </w:r>
+      <w:r>
+        <w:rPr>
+          <w:bCs/>
+          <w:sz w:val="24"/>
+          <w:szCs w:val="24"/>
+        </w:rPr>
+        <w:t>determinants and their relative importance — addressed. The feature-importance analysis of Section 5.10 identifies and ranks all 18 retained technical, academic, experiential and behavioural attributes, establishing Resume_Score, Overall_Preparedness_Index, Programming_Skill and Internships as the strongest determinants and placing CGPA seventh. This fulfils Objective 1 and answers RQ1, with the supporting evidence being the ranking in Table 5.7 and Figure 5.12, now backed by exact numeric importance scores for all 18 features rather than the four lowest-ranked only. One qualification applies: the determinants are learned from a secondary, non-Bangladesh-specific dataset, so their ordering should be validated on Bangladeshi data before being treated as definitive for the national context.</w:t>
       </w:r>
     </w:p>
     <w:p>
@@ -23569,13 +24207,67 @@
           <w:sz w:val="24"/>
           <w:szCs w:val="24"/>
         </w:rPr>
-        <w:t>RQ2 — extent of predictability — addressed. The evaluation of Section 5.7 establishes a threshold-independent ROC-AUC of 0.8068 and, under the tuned configuration reported there, an overall accuracy of 81.70 per cent — above the 78.08 per cent majority-class baseline. This gives a clear answer to the question of whether employment status is predictable at the individual level from attributes available at or shortly after graduation: it is predictable to a moderate degree (AUC 0.81), and a classifier can be tuned to prioritise either overall accuracy (81.70 per cent, minority-class recall 35.5 per cent) or minority-class recall (85.3 per cent, at the cost of accuracy falling to 63.84 per cent), but not both simultaneously on this dataset. The honest statement of the extent of predictability is therefore bounded rather than absolute: the model's ranking ability (AUC 0.81) is the ceiling, and the mutual-information analysis of Section 5.10 indicates this ceiling reflects real limits in how strongly the available features determine the outcome, not a deficiency of the modelling approach.</w:t>
-      </w:r>
-      <w:r>
-        <w:rPr>
-          <w:sz w:val="24"/>
-          <w:szCs w:val="24"/>
-        </w:rPr>
+        <w:t xml:space="preserve">RQ2 — </w:t>
+      </w:r>
+      <w:r>
+        <w:rPr>
+          <w:bCs/>
+          <w:sz w:val="24"/>
+          <w:szCs w:val="24"/>
+        </w:rPr>
+        <w:t>extent of predictability — addressed. The evaluation of Section 5.7 establishes a threshold-independent ROC-AUC of 0.8068 and, under the tuned configuration reported there, an overall accuracy of 81.70 per cent — above the 78.08 per cent majority-class baseline. This gives a clear answer to the question of whether employment status is</w:t>
+      </w:r>
+      <w:r>
+        <w:rPr>
+          <w:b/>
+          <w:bCs/>
+          <w:sz w:val="24"/>
+          <w:szCs w:val="24"/>
+        </w:rPr>
+        <w:t xml:space="preserve"> </w:t>
+      </w:r>
+      <w:r>
+        <w:rPr>
+          <w:bCs/>
+          <w:sz w:val="24"/>
+          <w:szCs w:val="24"/>
+        </w:rPr>
+        <w:t>predictable at the individual level from attributes available at or shortly after graduation: it is predictable</w:t>
+      </w:r>
+      <w:r>
+        <w:rPr>
+          <w:b/>
+          <w:bCs/>
+          <w:sz w:val="24"/>
+          <w:szCs w:val="24"/>
+        </w:rPr>
+        <w:t xml:space="preserve"> </w:t>
+      </w:r>
+      <w:r>
+        <w:rPr>
+          <w:bCs/>
+          <w:sz w:val="24"/>
+          <w:szCs w:val="24"/>
+        </w:rPr>
+        <w:t>to a</w:t>
+      </w:r>
+      <w:r>
+        <w:rPr>
+          <w:b/>
+          <w:bCs/>
+          <w:sz w:val="24"/>
+          <w:szCs w:val="24"/>
+        </w:rPr>
+        <w:t xml:space="preserve"> </w:t>
+      </w:r>
+      <w:r>
+        <w:rPr>
+          <w:bCs/>
+          <w:sz w:val="24"/>
+          <w:szCs w:val="24"/>
+        </w:rPr>
+        <w:lastRenderedPageBreak/>
+        <w:t>moderate degree (AUC 0.81), and a classifier can be tuned to prioritise either overall accuracy (81.70 per cent, minority-class recall 35.5 per cent) or minority-class recall (85.3 per cent, at the cost of accuracy falling to 63.84 per cent), but not both simultaneously on this dataset. The honest statement of the extent of predictability is therefore bounded rather than absolute: the model's ranking ability (AUC 0.81) is the ceiling, and the mutual-information analysis of Section 5.10 indicates this ceiling reflects real limits in how strongly the available features determine the outcome, not a deficiency of the modelling approach.</w:t>
       </w:r>
     </w:p>
     <w:p>
@@ -23590,13 +24282,15 @@
           <w:sz w:val="24"/>
           <w:szCs w:val="24"/>
         </w:rPr>
-        <w:t>RQ3 — best algorithm under a common evaluation protocol — addressed. Logistic Regression, Decision Tree, Random Forest and XGBoost were trained and evaluated under an identical stratified 80:20 split, feature set and 0.50 decision threshold, as reported in Table 5.6. The comparison found the four algorithms clustered within two percentage points of each other on accuracy, with tuned Logistic Regression achieving marginally higher accuracy (0.8196) and AUC (0.8094) than XGBoost (0.8170, 0.8068). No single algorithm dominates on this dataset, and the answer to RQ3 is correspondingly qualified: XGBoost is retained for its native feature-importance output and capacity for further non-linear feature engineering, not because it was found to be the most accurate. Support Vector Machine was excluded from the comparison on computational-cost grounds, stated in Section 5.8, and its addition remains a minor item of remaining work (Section 6.3).</w:t>
-      </w:r>
-      <w:r>
-        <w:rPr>
-          <w:sz w:val="24"/>
-          <w:szCs w:val="24"/>
-        </w:rPr>
+        <w:t xml:space="preserve">RQ3 — </w:t>
+      </w:r>
+      <w:r>
+        <w:rPr>
+          <w:bCs/>
+          <w:sz w:val="24"/>
+          <w:szCs w:val="24"/>
+        </w:rPr>
+        <w:t>best algorithm under a common evaluation protocol — addressed. Logistic Regression, Decision Tree, Random Forest and XGBoost were trained and evaluated under an identical stratified 80:20 split, feature set and 0.50 decision threshold, as reported in Table 5.6. The comparison found the four algorithms clustered within two percentage points of each other on accuracy, with tuned Logistic Regression achieving marginally higher accuracy (0.8196) and AUC (0.8094) than XGBoost (0.8170, 0.8068). No single algorithm dominates on this dataset, and the answer to RQ3 is correspondingly qualified: XGBoost is retained for its native feature-importance output and capacity for further non-linear feature engineering, not because it was found to be the most accurate. Support Vector Machine was excluded from the comparison on computational-cost grounds, stated in Section 5.8, and its addition remains a minor item of remaining work (Section 6.3).</w:t>
       </w:r>
     </w:p>
     <w:p>
@@ -23618,7 +24312,7 @@
           <w:sz w:val="24"/>
           <w:szCs w:val="24"/>
         </w:rPr>
-        <w:t xml:space="preserve">The global feature ranking of Section 5.10 converts model behaviour into concrete guidance at the cohort level, and the resulting recommendations for students, universities and policymakers are set out in Sections 5.12 and 6.2. This substantially fulfils Objective 3. It is partial because per-student attribution — the SHAP layer specified in Section 5.9 — has not been implemented, so the system currently tells every student which attributes matter in general rather than which of their own attributes most affected their individual prediction.</w:t>
+        <w:t>The global feature ranking of Section 5.10 converts model behaviour into concrete guidance at the cohort level, and the resulting recommendations for students, universities and policymakers are set out in Sections 5.12 and 6.2. This substantially fulfils Objective 3. It is partial because per-student attribution — the SHAP layer specified in Section 5.9 — has not been implemented, so the system currently tells every student which attributes matter in general rather than which of their own attributes most affected their individual prediction.</w:t>
       </w:r>
     </w:p>
     <w:p>
@@ -23640,7 +24334,7 @@
           <w:sz w:val="24"/>
           <w:szCs w:val="24"/>
         </w:rPr>
-        <w:t xml:space="preserve">Subgroup performance was identified as a design goal (Table 2.2, G5) but is not addressed. The six demographic and contextual attributes that would permit a subgroup audit — including Gender, Major and University_Year — were deliberately excluded from training (Section 5.2), which is defensible as a bias-mitigation measure but means no subgroup performance breakdown was produced. Note that these attributes remain present in the dataset and could be used for post-hoc audit without being reintroduced as predictors; this is recommended in Section 6.3.</w:t>
+        <w:t>Subgroup performance was identified as a design goal (Table 2.2, G5) but is not addressed. The six demographic and contextual attributes that would permit a subgroup audit — including Gender, Major and University_Year — were deliberately excluded from training (Section 5.2), which is defensible as a bias-mitigation measure but means no subgroup performance breakdown was produced. Note that these attributes remain present in the dataset and could be used for post-hoc audit without being reintroduced as predictors; this is recommended in Section 6.3.</w:t>
       </w:r>
     </w:p>
     <w:p>
@@ -23655,6 +24349,7 @@
           <w:sz w:val="24"/>
           <w:szCs w:val="24"/>
         </w:rPr>
+        <w:lastRenderedPageBreak/>
         <w:t xml:space="preserve">Not addressed — national representativeness. </w:t>
       </w:r>
       <w:r>
@@ -23692,7 +24387,7 @@
           <w:sz w:val="24"/>
           <w:szCs w:val="24"/>
         </w:rPr>
-        <w:t xml:space="preserve">Six limitations emerge specifically from the results rather than from the study design in the abstract. First, the performance figures in Table 5.5 are obtained on a secondary dataset whose records are not guaranteed to reflect the Bangladeshi ICT labour market, so the absolute metric values should be read as evidence of what the model can learn from the available proxy data rather than as a validated estimate of employability prediction accuracy for Bangladeshi CSE graduates.</w:t>
+        <w:t>Six limitations emerge specifically from the results rather than from the study design in the abstract. First, the performance figures in Table 5.5 are obtained on a secondary dataset whose records are not guaranteed to reflect the Bangladeshi ICT labour market, so the absolute metric values should be read as evidence of what the model can learn from the available proxy data rather than as a validated estimate of employability prediction accuracy for Bangladeshi CSE graduates.</w:t>
       </w:r>
     </w:p>
     <w:p>
@@ -23705,9 +24400,7 @@
           <w:sz w:val="24"/>
           <w:szCs w:val="24"/>
         </w:rPr>
-        <w:t xml:space="preserve">Second, the tuned configuration reported in Table 5.5 recovers only 35.5 per cent of graduates who are genuinely not employable; an alternative configuration recovers 85.3 per cent of at-risk graduates but pushes overall accuracy to 63.84 per cent, below the 78.08 per cent majority-class baseline established in </w:t>
-        <w:lastRenderedPageBreak/>
-        <w:t>Section 5.7. Neither configuration is deployment-ready on its own, and the choice between them requires an explicit decision, not yet made in this thesis, about the relative operational cost of a missed at-risk graduate versus a false alarm. Third, under the tuned configuration, minority-class precision of 0.65 means roughly one in three flagged graduates is a false alarm, while under the recall-oriented configuration minority-class precision falls to 0.36; both figures constrain the settings in which the system can responsibly be deployed.</w:t>
+        <w:t>Second, the tuned configuration reported in Table 5.5 recovers only 35.5 per cent of graduates who are genuinely not employable; an alternative configuration recovers 85.3 per cent of at-risk graduates but pushes overall accuracy to 63.84 per cent, below the 78.08 per cent majority-class baseline established in Section 5.7. Neither configuration is deployment-ready on its own, and the choice between them requires an explicit decision, not yet made in this thesis, about the relative operational cost of a missed at-risk graduate versus a false alarm. Third, under the tuned configuration, minority-class precision of 0.65 means roughly one in three flagged graduates is a false alarm, while under the recall-oriented configuration minority-class precision falls to 0.36; both figures constrain the settings in which the system can responsibly be deployed.</w:t>
       </w:r>
     </w:p>
     <w:p>
@@ -23720,7 +24413,7 @@
           <w:sz w:val="24"/>
           <w:szCs w:val="24"/>
         </w:rPr>
-        <w:t xml:space="preserve">Fourth, the comparative evaluation underlying RQ3 was run only against Logistic Regression, Decision Tree and Random Forest; Support Vector Machine was excluded on computational-cost grounds, so the claim that no algorithm dominates is established among four of the five originally identified candidates. Fifth, only one threshold-independent discrimination measure (ROC-AUC) has been computed; a precision-recall curve, which is more informative under class imbalance, has not been plotted and would let a practitioner choose a deployment threshold with the trade-off made explicit. Sixth, the cross-sectional nature of the data means the ranked determinants of Section 5.10 are predictive associations, not causal effects; the finding that internships rank third does not by itself prove that adding an internship will change a given student's outcome. Each of these limitations directly motivates a corresponding item in the future work of Chapter 6.</w:t>
+        <w:t>Fourth, the comparative evaluation underlying RQ3 was run only against Logistic Regression, Decision Tree and Random Forest; Support Vector Machine was excluded on computational-cost grounds, so the claim that no algorithm dominates is established among four of the five originally identified candidates. Fifth, only one threshold-independent discrimination measure (ROC-AUC) has been computed; a precision-recall curve, which is more informative under class imbalance, has not been plotted and would let a practitioner choose a deployment threshold with the trade-off made explicit. Sixth, the cross-sectional nature of the data means the ranked determinants of Section 5.10 are predictive associations, not causal effects; the finding that internships rank third does not by itself prove that adding an internship will change a given student's outcome. Each of these limitations directly motivates a corresponding item in the future work of Chapter 6.</w:t>
       </w:r>
     </w:p>
     <w:p>
@@ -23737,6 +24430,7 @@
           <w:sz w:val="24"/>
           <w:szCs w:val="24"/>
         </w:rPr>
+        <w:lastRenderedPageBreak/>
         <w:t>5.15 Validation Summary</w:t>
       </w:r>
     </w:p>
@@ -24045,7 +24739,6 @@
           </w:tcPr>
           <w:p>
             <w:r>
-              <w:lastRenderedPageBreak/>
               <w:t>Duplicate and missing-value counts</w:t>
             </w:r>
           </w:p>
@@ -24184,7 +24877,7 @@
           </w:tcPr>
           <w:p>
             <w:r>
-              <w:t xml:space="preserve">test_size = 0.2, stratify = y, random_state = 42; 40,000 / 10,000.</w:t>
+              <w:t>test_size = 0.2, stratify = y, random_state = 42; 40,000 / 10,000.</w:t>
             </w:r>
           </w:p>
         </w:tc>
@@ -24205,7 +24898,7 @@
           </w:tcPr>
           <w:p>
             <w:r>
-              <w:t xml:space="preserve">Model configuration and hyperparameters</w:t>
+              <w:t>Model configuration and hyperparameters</w:t>
             </w:r>
           </w:p>
         </w:tc>
@@ -24502,7 +25195,7 @@
           </w:tcPr>
           <w:p>
             <w:r>
-              <w:t xml:space="preserve">Logistic Regression, Decision Tree, Random Forest and XGBoost compared under an identical split and threshold (Table 5.6). SVM excluded on computational-cost grounds.</w:t>
+              <w:t>Logistic Regression, Decision Tree, Random Forest and XGBoost compared under an identical split and threshold (Table 5.6). SVM excluded on computational-cost grounds.</w:t>
             </w:r>
           </w:p>
         </w:tc>
@@ -24523,6 +25216,7 @@
           </w:tcPr>
           <w:p>
             <w:r>
+              <w:lastRenderedPageBreak/>
               <w:t>ROC-AUC</w:t>
             </w:r>
           </w:p>
@@ -24939,7 +25633,7 @@
           <w:sz w:val="24"/>
           <w:szCs w:val="24"/>
         </w:rPr>
-        <w:t xml:space="preserve">This thesis set out to develop and empirically evaluate an interpretable machine learning model of the employability of fresh Computer Science and Engineering (CSE) graduates in Bangladesh, and to identify the relative contribution of the technical, academic, experiential and behavioural factors that determine it. A dataset of 50,000 records spanning academic performance, technical skills, practical experience, certifications, soft skills and career-preparation behaviour — the Student Career Success Prediction Dataset, obtained from Kaggle — was prepared, reduced to 18 modelling features by excluding six demographic and contextual attributes and constructing two composite indicators, and partitioned by a stratified 80:20 split into 40,000 training and 10,000 testing records. An XGBoost classifier was trained within a pipeline incorporating median and modal imputation, standardisation, one-hot encoding and SMOTE oversampling, and evaluated on the held-out partition under an imbalance-sensitive protocol reporting per-class precision, recall and F1 alongside the confusion matrix. The trained pipeline was made accessible through a documented HTTP API.</w:t>
+        <w:t>This thesis set out to develop and empirically evaluate an interpretable machine learning model of the employability of fresh Computer Science and Engineering (CSE) graduates in Bangladesh, and to identify the relative contribution of the technical, academic, experiential and behavioural factors that determine it. A dataset of 50,000 records spanning academic performance, technical skills, practical experience, certifications, soft skills and career-preparation behaviour — the Student Career Success Prediction Dataset, obtained from Kaggle — was prepared, reduced to 18 modelling features by excluding six demographic and contextual attributes and constructing two composite indicators, and partitioned by a stratified 80:20 split into 40,000 training and 10,000 testing records. An XGBoost classifier was trained within a pipeline incorporating median and modal imputation, standardisation, one-hot encoding and SMOTE oversampling, and evaluated on the held-out partition under an imbalance-sensitive protocol reporting per-class precision, recall and F1 alongside the confusion matrix. The trained pipeline was made accessible through a documented HTTP API.</w:t>
       </w:r>
     </w:p>
     <w:p>
@@ -24965,7 +25659,15 @@
           <w:sz w:val="24"/>
           <w:szCs w:val="24"/>
         </w:rPr>
-        <w:t>On predictive performance, the conclusions are more qualified and are stated as such. Under the tuned configuration selected via cross-validated hyperparameter search — with no SMOTE, no class weighting, and the default 0.50 decision threshold — the model achieved 81.70 per cent overall accuracy and a ROC-AUC of 0.8068, comfortably above the 78.08 per cent majority-class baseline, but recovered only 35.5 per cent of graduates who were genuinely not employable. An earlier configuration combining SMOTE, class weighting and a lowered 0.35 threshold instead recovered 85.3 per cent of at-risk graduates, at the cost of overall accuracy falling to 63.84 per cent, below the majority-class baseline. Neither configuration is unconditionally better: they trade recall against accuracy and precision, and the choice between them is a deployment decision about the relative cost of a missed at-risk graduate versus a false alarm, not one that either configuration settles on its own.</w:t>
+        <w:t xml:space="preserve">On predictive performance, the conclusions are more qualified and are stated as such. Under the tuned configuration selected via cross-validated hyperparameter search — with no SMOTE, no class weighting, and the default 0.50 decision threshold — the model achieved 81.70 per cent overall accuracy and a ROC-AUC of 0.8068, comfortably above the 78.08 per cent majority-class baseline, but recovered only 35.5 per cent of graduates who were genuinely </w:t>
+      </w:r>
+      <w:r>
+        <w:rPr>
+          <w:sz w:val="24"/>
+          <w:szCs w:val="24"/>
+        </w:rPr>
+        <w:lastRenderedPageBreak/>
+        <w:t>not employable. An earlier configuration combining SMOTE, class weighting and a lowered 0.35 threshold instead recovered 85.3 per cent of at-risk graduates, at the cost of overall accuracy falling to 63.84 per cent, below the majority-class baseline. Neither configuration is unconditionally better: they trade recall against accuracy and precision, and the choice between them is a deployment decision about the relative cost of a missed at-risk graduate versus a false alarm, not one that either configuration settles on its own.</w:t>
       </w:r>
     </w:p>
     <w:p>
@@ -24978,7 +25680,7 @@
           <w:sz w:val="24"/>
           <w:szCs w:val="24"/>
         </w:rPr>
-        <w:t xml:space="preserve">The study therefore answers its research questions to differing degrees. It identifies and ranks the determinants of employability for this population (RQ1). It establishes that at-risk graduates are predictable to a moderate degree (AUC 0.81) and that accuracy and minority-class recall trade off against each other on this dataset (RQ2). It compares four algorithms under a common protocol and finds them clustered within two percentage points of each other on accuracy, with no single algorithm dominating (RQ3). And it converts the global determinant ranking into actionable cohort-level guidance, while the per-student attribution that would individualise that guidance remains to be implemented (RQ4, partially). Setting these boundaries explicitly is itself a contribution: it identifies precisely what a subsequent study must do to close them.</w:t>
+        <w:t>The study therefore answers its research questions to differing degrees. It identifies and ranks the determinants of employability for this population (RQ1). It establishes that at-risk graduates are predictable to a moderate degree (AUC 0.81) and that accuracy and minority-class recall trade off against each other on this dataset (RQ2). It compares four algorithms under a common protocol and finds them clustered within two percentage points of each other on accuracy, with no single algorithm dominating (RQ3). And it converts the global determinant ranking into actionable cohort-level guidance, while the per-student attribution that would individualise that guidance remains to be implemented (RQ4, partially). Setting these boundaries explicitly is itself a contribution: it identifies precisely what a subsequent study must do to close them.</w:t>
       </w:r>
     </w:p>
     <w:p>
@@ -25030,7 +25732,7 @@
           <w:sz w:val="24"/>
           <w:szCs w:val="24"/>
         </w:rPr>
-        <w:t xml:space="preserve">Because the training data was drawn from the publicly available Kaggle Student Career Success Prediction Dataset rather than collected directly from Bangladeshi CSE graduates, its records are not guaranteed to reflect the Bangladeshi ICT labour market, curricular structure or student population specifically. The six employability dimensions defined in Section 1.6 are operationalised as the closest available proxy variables within this dataset rather than variables purpose-designed for this study, and Bangladesh-specific conclusions should accordingly be read as illustrative rather than population-representative.</w:t>
+        <w:t>Because the training data was drawn from the publicly available Kaggle Student Career Success Prediction Dataset rather than collected directly from Bangladeshi CSE graduates, its records are not guaranteed to reflect the Bangladeshi ICT labour market, curricular structure or student population specifically. The six employability dimensions defined in Section 1.6 are operationalised as the closest available proxy variables within this dataset rather than variables purpose-designed for this study, and Bangladesh-specific conclusions should accordingly be read as illustrative rather than population-representative.</w:t>
       </w:r>
     </w:p>
     <w:p>
@@ -25067,6 +25769,7 @@
           <w:sz w:val="24"/>
           <w:szCs w:val="24"/>
         </w:rPr>
+        <w:lastRenderedPageBreak/>
         <w:t xml:space="preserve">Incomplete algorithmic comparison. </w:t>
       </w:r>
       <w:r>
@@ -25074,9 +25777,7 @@
           <w:sz w:val="24"/>
           <w:szCs w:val="24"/>
         </w:rPr>
-        <w:t xml:space="preserve">Only XGBoost was trained and evaluated. The selection of the algorithm is justified on established properties in Section 5.8, but no measured </w:t>
-        <w:lastRenderedPageBreak/>
-        <w:t>comparison against Logistic Regression, Decision Tree, Random Forest or Support Vector Machine has been performed on this data, so no claim of comparative superiority is made.</w:t>
+        <w:t>Only XGBoost was trained and evaluated. The selection of the algorithm is justified on established properties in Section 5.8, but no measured comparison against Logistic Regression, Decision Tree, Random Forest or Support Vector Machine has been performed on this data, so no claim of comparative superiority is made.</w:t>
       </w:r>
     </w:p>
     <w:p>
@@ -25133,7 +25834,7 @@
           <w:sz w:val="24"/>
           <w:szCs w:val="24"/>
         </w:rPr>
-        <w:t xml:space="preserve">Four recommendations follow directly from these findings. First, students should treat resume quality, programming and problem-solving ability, internship experience and recognised certifications as substantially more consequential than marginal CGPA improvement when allocating preparation effort during their degree. Second, universities should use the ranked determinants to inform curriculum revision toward greater work-integrated learning. Third, any institutional deployment of the current model should be confined to low-stakes routing — offering optional guidance to flagged students — until minority-class precision is improved, since at 0.36 precision the system is unsuitable for any decision that allocates scarce resources or carries a cost to the student. Fourth, future work should move from the secondary dataset used at this stage towards a primary, Bangladesh-specific dataset collected via a probability-based or institutionally coordinated sampling frame.</w:t>
+        <w:t>Four recommendations follow directly from these findings. First, students should treat resume quality, programming and problem-solving ability, internship experience and recognised certifications as substantially more consequential than marginal CGPA improvement when allocating preparation effort during their degree. Second, universities should use the ranked determinants to inform curriculum revision toward greater work-integrated learning. Third, any institutional deployment of the current model should be confined to low-stakes routing — offering optional guidance to flagged students — until minority-class precision is improved, since at 0.36 precision the system is unsuitable for any decision that allocates scarce resources or carries a cost to the student. Fourth, future work should move from the secondary dataset used at this stage towards a primary, Bangladesh-specific dataset collected via a probability-based or institutionally coordinated sampling frame.</w:t>
       </w:r>
     </w:p>
     <w:p>
@@ -25393,7 +26094,7 @@
                 <w:sz w:val="18"/>
                 <w:szCs w:val="18"/>
               </w:rPr>
-              <w:t xml:space="preserve">Internships recorded only as a count (0–5), with no duration, sector, role or quality information.</w:t>
+              <w:t>Internships recorded only as a count (0–5), with no duration, sector, role or quality information.</w:t>
             </w:r>
           </w:p>
         </w:tc>
@@ -25413,7 +26114,7 @@
                 <w:sz w:val="18"/>
                 <w:szCs w:val="18"/>
               </w:rPr>
-              <w:t xml:space="preserve">Internship duration in months; host organisation type; role classification; whether the placement converted to an offer.</w:t>
+              <w:t>Internship duration in months; host organisation type; role classification; whether the placement converted to an offer.</w:t>
             </w:r>
           </w:p>
         </w:tc>
@@ -25433,7 +26134,7 @@
                 <w:sz w:val="18"/>
                 <w:szCs w:val="18"/>
               </w:rPr>
-              <w:t xml:space="preserve">Internships rank fourth in importance, yet a one-week observership and a six-month engineering placement are currently indistinguishable to the model.</w:t>
+              <w:t>Internships rank fourth in importance, yet a one-week observership and a six-month engineering placement are currently indistinguishable to the model.</w:t>
             </w:r>
           </w:p>
         </w:tc>
@@ -25453,7 +26154,7 @@
                 <w:sz w:val="18"/>
                 <w:szCs w:val="18"/>
               </w:rPr>
-              <w:t xml:space="preserve">Sharply increased resolution on the single most policy-relevant experiential variable; enables universities to advise on what kind of internship to pursue, not merely to pursue one.</w:t>
+              <w:t>Sharply increased resolution on the single most policy-relevant experiential variable; enables universities to advise on what kind of internship to pursue, not merely to pursue one.</w:t>
             </w:r>
           </w:p>
         </w:tc>
@@ -25479,7 +26180,7 @@
                 <w:szCs w:val="18"/>
               </w:rPr>
               <w:lastRenderedPageBreak/>
-              <w:t xml:space="preserve">Certifications recorded only as a count, with no issuer, subject or recency.</w:t>
+              <w:t>Certifications recorded only as a count, with no issuer, subject or recency.</w:t>
             </w:r>
           </w:p>
         </w:tc>
@@ -25519,7 +26220,7 @@
                 <w:sz w:val="18"/>
                 <w:szCs w:val="18"/>
               </w:rPr>
-              <w:t xml:space="preserve">Certifications rank fifth, but a vendor cloud certification and an unaccredited online course carry very different labour-market signals.</w:t>
+              <w:t>Certifications rank fifth, but a vendor cloud certification and an unaccredited online course carry very different labour-market signals.</w:t>
             </w:r>
           </w:p>
         </w:tc>
@@ -25539,7 +26240,7 @@
                 <w:sz w:val="18"/>
                 <w:szCs w:val="18"/>
               </w:rPr>
-              <w:t xml:space="preserve">Allows the model to weight certifications by market value and recency, and reveals which specific credentials predict placement in the ICT sector.</w:t>
+              <w:t>Allows the model to weight certifications by market value and recency, and reveals which specific credentials predict placement in the ICT sector.</w:t>
             </w:r>
           </w:p>
         </w:tc>
@@ -25564,7 +26265,7 @@
                 <w:sz w:val="18"/>
                 <w:szCs w:val="18"/>
               </w:rPr>
-              <w:t xml:space="preserve">Programming_Skill recorded as a single ordinal rating, with no language, framework or specialisation detail.</w:t>
+              <w:t>Programming_Skill recorded as a single ordinal rating, with no language, framework or specialisation detail.</w:t>
             </w:r>
           </w:p>
         </w:tc>
@@ -25584,7 +26285,7 @@
                 <w:sz w:val="18"/>
                 <w:szCs w:val="18"/>
               </w:rPr>
-              <w:t xml:space="preserve">Specific languages and frameworks; self-assessed and verified proficiency per technology; specialisation area.</w:t>
+              <w:t>Specific languages and frameworks; self-assessed and verified proficiency per technology; specialisation area.</w:t>
             </w:r>
           </w:p>
         </w:tc>
@@ -25604,7 +26305,7 @@
                 <w:sz w:val="18"/>
                 <w:szCs w:val="18"/>
               </w:rPr>
-              <w:t xml:space="preserve">Jony et al. (2022) document rapid post-pandemic demand shifts toward JavaScript, API development and database technologies; a single scalar cannot represent this.</w:t>
+              <w:t>Jony et al. (2022) document rapid post-pandemic demand shifts toward JavaScript, API development and database technologies; a single scalar cannot represent this.</w:t>
             </w:r>
           </w:p>
         </w:tc>
@@ -25649,7 +26350,7 @@
                 <w:sz w:val="18"/>
                 <w:szCs w:val="18"/>
               </w:rPr>
-              <w:t xml:space="preserve">GitHub_Profile recorded as a binary Yes/No, with no measure of portfolio substance.</w:t>
+              <w:t>GitHub_Profile recorded as a binary Yes/No, with no measure of portfolio substance.</w:t>
             </w:r>
           </w:p>
         </w:tc>
@@ -25669,7 +26370,7 @@
                 <w:sz w:val="18"/>
                 <w:szCs w:val="18"/>
               </w:rPr>
-              <w:t xml:space="preserve">Repository count; commit frequency; contribution recency; stars or forks; open-source participation.</w:t>
+              <w:t>Repository count; commit frequency; contribution recency; stars or forks; open-source participation.</w:t>
             </w:r>
           </w:p>
         </w:tc>
@@ -25689,7 +26390,7 @@
                 <w:sz w:val="18"/>
                 <w:szCs w:val="18"/>
               </w:rPr>
-              <w:t xml:space="preserve">GitHub_Profile ranks only fourteenth, plausibly because a binary flag captures almost none of what a portfolio actually evidences.</w:t>
+              <w:t>GitHub_Profile ranks only fourteenth, plausibly because a binary flag captures almost none of what a portfolio actually evidences.</w:t>
             </w:r>
           </w:p>
         </w:tc>
@@ -25709,7 +26410,7 @@
                 <w:sz w:val="18"/>
                 <w:szCs w:val="18"/>
               </w:rPr>
-              <w:t xml:space="preserve">Likely to raise the informativeness of portfolio evidence substantially and to test whether the low rank reflects the construct or merely its coarse measurement.</w:t>
+              <w:t>Likely to raise the informativeness of portfolio evidence substantially and to test whether the low rank reflects the construct or merely its coarse measurement.</w:t>
             </w:r>
           </w:p>
         </w:tc>
@@ -25989,7 +26690,7 @@
                 <w:sz w:val="18"/>
                 <w:szCs w:val="18"/>
               </w:rPr>
-              <w:t xml:space="preserve">No career preference or job-search behaviour data.</w:t>
+              <w:t>No career preference or job-search behaviour data.</w:t>
             </w:r>
           </w:p>
         </w:tc>
@@ -26074,7 +26775,7 @@
                 <w:sz w:val="18"/>
                 <w:szCs w:val="18"/>
               </w:rPr>
-              <w:t xml:space="preserve">No labour-market or temporal context.</w:t>
+              <w:t>No labour-market or temporal context.</w:t>
             </w:r>
           </w:p>
         </w:tc>
@@ -26114,7 +26815,7 @@
                 <w:sz w:val="18"/>
                 <w:szCs w:val="18"/>
               </w:rPr>
-              <w:t xml:space="preserve">Employment outcomes are jointly determined by graduate attributes and labour market conditions (Clarke, 2018); the latter are entirely unobserved here.</w:t>
+              <w:t>Employment outcomes are jointly determined by graduate attributes and labour market conditions (Clarke, 2018); the latter are entirely unobserved here.</w:t>
             </w:r>
           </w:p>
         </w:tc>
@@ -26265,7 +26966,7 @@
                 <w:sz w:val="18"/>
                 <w:szCs w:val="18"/>
               </w:rPr>
-              <w:t xml:space="preserve">Structured assessor ratings; standardised English test scores; employer feedback on interviewed candidates.</w:t>
+              <w:t>Structured assessor ratings; standardised English test scores; employer feedback on interviewed candidates.</w:t>
             </w:r>
           </w:p>
         </w:tc>
@@ -26533,7 +27234,7 @@
           <w:sz w:val="24"/>
           <w:szCs w:val="24"/>
         </w:rPr>
-        <w:t xml:space="preserve">UMYU Scientifica, 2</w:t>
+        <w:t>UMYU Scientifica, 2</w:t>
       </w:r>
       <w:r>
         <w:rPr>
@@ -26562,7 +27263,7 @@
           <w:sz w:val="24"/>
           <w:szCs w:val="24"/>
         </w:rPr>
-        <w:t xml:space="preserve">Labour Force Survey Bangladesh 2024: Final report</w:t>
+        <w:t>Labour Force Survey Bangladesh 2024: Final report</w:t>
       </w:r>
       <w:r>
         <w:rPr>
@@ -27317,7 +28018,7 @@
           <w:sz w:val="24"/>
           <w:szCs w:val="24"/>
         </w:rPr>
-        <w:t xml:space="preserve">Table A.1 defines the key terms used throughout this thesis as they are operationalised in the study.</w:t>
+        <w:t>Table A.1 defines the key terms used throughout this thesis as they are operationalised in the study.</w:t>
       </w:r>
     </w:p>
     <w:p>
@@ -27456,7 +28157,7 @@
                 <w:sz w:val="22"/>
                 <w:szCs w:val="22"/>
               </w:rPr>
-              <w:t xml:space="preserve">The propensity of a graduate to obtain and sustain suitable employment, understood as a function of skills, understandings and personal attributes (Yorke, 2006). In this study it is operationalised as the model-estimated probability of the binary employment outcome defined in Section 1.6.</w:t>
+              <w:t>The propensity of a graduate to obtain and sustain suitable employment, understood as a function of skills, understandings and personal attributes (Yorke, 2006). In this study it is operationalised as the model-estimated probability of the binary employment outcome defined in Section 1.6.</w:t>
             </w:r>
           </w:p>
         </w:tc>
@@ -27546,7 +28247,7 @@
                 <w:sz w:val="22"/>
                 <w:szCs w:val="22"/>
               </w:rPr>
-              <w:t xml:space="preserve">The discrepancy between the competencies developed through formal higher education and those required by employers in the labour market (Hasan et al., 2024; Jony et al., 2022).</w:t>
+              <w:t>The discrepancy between the competencies developed through formal higher education and those required by employers in the labour market (Hasan et al., 2024; Jony et al., 2022).</w:t>
             </w:r>
           </w:p>
         </w:tc>
@@ -27636,7 +28337,7 @@
                 <w:sz w:val="22"/>
                 <w:szCs w:val="22"/>
               </w:rPr>
-              <w:t xml:space="preserve">A quantitative measure of the contribution of an individual input variable to a model’s predictions, computed in this study using both model-intrinsic importance measures and SHapley Additive exPlanations (Lundberg &amp; Lee, 2017).</w:t>
+              <w:t>A quantitative measure of the contribution of an individual input variable to a model’s predictions, computed in this study using both model-intrinsic importance measures and SHapley Additive exPlanations (Lundberg &amp; Lee, 2017).</w:t>
             </w:r>
           </w:p>
         </w:tc>
@@ -27648,8 +28349,8 @@
       </w:pPr>
     </w:p>
     <w:sectPr>
-      <w:headerReference w:type="default" r:id="rId29"/>
-      <w:footerReference w:type="default" r:id="rId30"/>
+      <w:headerReference w:type="default" r:id="rId31"/>
+      <w:footerReference w:type="default" r:id="rId32"/>
       <w:pgSz w:w="11906" w:h="16838"/>
       <w:pgMar w:top="1440" w:right="1152" w:bottom="1440" w:left="1728" w:header="708" w:footer="708" w:gutter="0"/>
       <w:pgNumType w:start="1"/>
@@ -27765,7 +28466,7 @@
         <w:sz w:val="24"/>
         <w:szCs w:val="24"/>
       </w:rPr>
-      <w:t>59</w:t>
+      <w:t>57</w:t>
     </w:r>
     <w:r>
       <w:rPr>

</xml_diff>